<commit_message>
Draft extraction file for the five own children (from the manuscript, not the records); extraction guide points to it
Co-Authored-By: Claude Sonnet 5.5 <noreply@anthropic.com>
Claude-Session: https://claude.ai/code/session_01FRD7etKqYN8v2bbXeeLMRW
</commit_message>
<xml_diff>
--- a/Extraction guide - how to fill the extraction workbook (draft).docx
+++ b/Extraction guide - how to fill the extraction workbook (draft).docx
@@ -4273,6 +4273,84 @@
                 <w:szCs w:val="19"/>
               </w:rPr>
               <w:t xml:space="preserve">只录不可识别的信息，不写姓名、住院号、出生日期、具体日期</w:t>
+            </w:r>
+            <w:r>
+              <w:rPr>
+                <w:rFonts w:ascii="Calibri" w:cs="Calibri" w:eastAsia="Microsoft YaHei" w:hAnsi="Calibri"/>
+                <w:sz w:val="19"/>
+                <w:szCs w:val="19"/>
+              </w:rPr>
+              <w:t xml:space="preserve">。已有一份由稿件预填的草稿 </w:t>
+            </w:r>
+            <w:r>
+              <w:rPr>
+                <w:rFonts w:ascii="Consolas" w:cs="Consolas" w:eastAsia="Microsoft YaHei" w:hAnsi="Consolas"/>
+                <w:sz w:val="19"/>
+                <w:szCs w:val="19"/>
+                <w:shd w:fill="EEEEEE" w:val="clear"/>
+              </w:rPr>
+              <w:t xml:space="preserve">Extraction draft - own series OWN (from manuscript, not chart-checked).xlsx</w:t>
+            </w:r>
+            <w:r>
+              <w:rPr>
+                <w:rFonts w:ascii="Calibri" w:cs="Calibri" w:eastAsia="Microsoft YaHei" w:hAnsi="Calibri"/>
+                <w:sz w:val="19"/>
+                <w:szCs w:val="19"/>
+              </w:rPr>
+              <w:t xml:space="preserve">（生成脚本 </w:t>
+            </w:r>
+            <w:r>
+              <w:rPr>
+                <w:rFonts w:ascii="Consolas" w:cs="Consolas" w:eastAsia="Microsoft YaHei" w:hAnsi="Consolas"/>
+                <w:sz w:val="19"/>
+                <w:szCs w:val="19"/>
+                <w:shd w:fill="EEEEEE" w:val="clear"/>
+              </w:rPr>
+              <w:t xml:space="preserve">tools/make_own_series_draft.py</w:t>
+            </w:r>
+            <w:r>
+              <w:rPr>
+                <w:rFonts w:ascii="Calibri" w:cs="Calibri" w:eastAsia="Microsoft YaHei" w:hAnsi="Calibri"/>
+                <w:sz w:val="19"/>
+                <w:szCs w:val="19"/>
+              </w:rPr>
+              <w:t xml:space="preserve">）：它</w:t>
+            </w:r>
+            <w:r>
+              <w:rPr>
+                <w:rFonts w:ascii="Calibri" w:cs="Calibri" w:eastAsia="Microsoft YaHei" w:hAnsi="Calibri"/>
+                <w:b/>
+                <w:bCs/>
+                <w:sz w:val="19"/>
+                <w:szCs w:val="19"/>
+              </w:rPr>
+              <w:t xml:space="preserve">不是</w:t>
+            </w:r>
+            <w:r>
+              <w:rPr>
+                <w:rFonts w:ascii="Calibri" w:cs="Calibri" w:eastAsia="Microsoft YaHei" w:hAnsi="Calibri"/>
+                <w:sz w:val="19"/>
+                <w:szCs w:val="19"/>
+              </w:rPr>
+              <w:t xml:space="preserve">独立提取，只用于两人从病历提取并做完共识</w:t>
+            </w:r>
+            <w:r>
+              <w:rPr>
+                <w:rFonts w:ascii="Calibri" w:cs="Calibri" w:eastAsia="Microsoft YaHei" w:hAnsi="Calibri"/>
+                <w:b/>
+                <w:bCs/>
+                <w:sz w:val="19"/>
+                <w:szCs w:val="19"/>
+              </w:rPr>
+              <w:t xml:space="preserve">之后</w:t>
+            </w:r>
+            <w:r>
+              <w:rPr>
+                <w:rFonts w:ascii="Calibri" w:cs="Calibri" w:eastAsia="Microsoft YaHei" w:hAnsi="Calibri"/>
+                <w:sz w:val="19"/>
+                <w:szCs w:val="19"/>
+              </w:rPr>
+              <w:t xml:space="preserve">的比对；开始前不看，除非三位事先决定改为从草稿出发核对（那样这 5 例就不是独立双人提取，要在 Methods 里说明）。核对清单在该文件的 Chart_check 表</w:t>
             </w:r>
           </w:p>
         </w:tc>

</xml_diff>

<commit_message>
Own series: blank starter files for E1/E2 (extract from the records first); draft README, guide and notes record the decision
Co-Authored-By: Claude Sonnet 5.5 <noreply@anthropic.com>
Claude-Session: https://claude.ai/code/session_01FRD7etKqYN8v2bbXeeLMRW
</commit_message>
<xml_diff>
--- a/Extraction guide - how to fill the extraction workbook (draft).docx
+++ b/Extraction guide - how to fill the extraction workbook (draft).docx
@@ -4350,7 +4350,59 @@
                 <w:sz w:val="19"/>
                 <w:szCs w:val="19"/>
               </w:rPr>
-              <w:t xml:space="preserve">的比对；开始前不看，除非三位事先决定改为从草稿出发核对（那样这 5 例就不是独立双人提取，要在 Methods 里说明）。核对清单在该文件的 Chart_check 表</w:t>
+              <w:t xml:space="preserve">的比对。</w:t>
+            </w:r>
+            <w:r>
+              <w:rPr>
+                <w:rFonts w:ascii="Calibri" w:cs="Calibri" w:eastAsia="Microsoft YaHei" w:hAnsi="Calibri"/>
+                <w:b/>
+                <w:bCs/>
+                <w:sz w:val="19"/>
+                <w:szCs w:val="19"/>
+              </w:rPr>
+              <w:t xml:space="preserve">作者 2026 年 10 月 18 日决定：两位提取员先从病历独立提取</w:t>
+            </w:r>
+            <w:r>
+              <w:rPr>
+                <w:rFonts w:ascii="Calibri" w:cs="Calibri" w:eastAsia="Microsoft YaHei" w:hAnsi="Calibri"/>
+                <w:sz w:val="19"/>
+                <w:szCs w:val="19"/>
+              </w:rPr>
+              <w:t xml:space="preserve">，用空白起始文件 </w:t>
+            </w:r>
+            <w:r>
+              <w:rPr>
+                <w:rFonts w:ascii="Consolas" w:cs="Consolas" w:eastAsia="Microsoft YaHei" w:hAnsi="Consolas"/>
+                <w:sz w:val="19"/>
+                <w:szCs w:val="19"/>
+                <w:shd w:fill="EEEEEE" w:val="clear"/>
+              </w:rPr>
+              <w:t xml:space="preserve">search/extraction/own_series/extraction_E1_OWN_starter.xlsx</w:t>
+            </w:r>
+            <w:r>
+              <w:rPr>
+                <w:rFonts w:ascii="Calibri" w:cs="Calibri" w:eastAsia="Microsoft YaHei" w:hAnsi="Calibri"/>
+                <w:sz w:val="19"/>
+                <w:szCs w:val="19"/>
+              </w:rPr>
+              <w:t xml:space="preserve"> 和 </w:t>
+            </w:r>
+            <w:r>
+              <w:rPr>
+                <w:rFonts w:ascii="Consolas" w:cs="Consolas" w:eastAsia="Microsoft YaHei" w:hAnsi="Consolas"/>
+                <w:sz w:val="19"/>
+                <w:szCs w:val="19"/>
+                <w:shd w:fill="EEEEEE" w:val="clear"/>
+              </w:rPr>
+              <w:t xml:space="preserve">…E2_OWN_starter.xlsx</w:t>
+            </w:r>
+            <w:r>
+              <w:rPr>
+                <w:rFonts w:ascii="Calibri" w:cs="Calibri" w:eastAsia="Microsoft YaHei" w:hAnsi="Calibri"/>
+                <w:sz w:val="19"/>
+                <w:szCs w:val="19"/>
+              </w:rPr>
+              <w:t xml:space="preserve">；开始前不看草稿（若改为从草稿出发核对，这 5 例就不是独立双人提取，要在 Methods 里说明）。核对清单在草稿文件的 Chart_check 表</w:t>
             </w:r>
           </w:p>
         </w:tc>

</xml_diff>

<commit_message>
Six pre-submission items decided: layered data-sharing plan in protocol Dissemination field, amendment note, IPD e-mail draft, manuscript data statement; note for Ji Wang; extraction-role status
Co-Authored-By: Claude Sonnet 5.5 <noreply@anthropic.com>
Claude-Session: https://claude.ai/code/session_01FRD7etKqYN8v2bbXeeLMRW
</commit_message>
<xml_diff>
--- a/Extraction guide - how to fill the extraction workbook (draft).docx
+++ b/Extraction guide - how to fill the extraction workbook (draft).docx
@@ -294,7 +294,7 @@
                 <w:sz w:val="19"/>
                 <w:szCs w:val="19"/>
               </w:rPr>
-              <w:t xml:space="preserve">舒俊（提取员 E1）、卞红强（提取员 E2）、杨俊（分歧仲裁）。Ji Wang 核查两份提取表，不提取。分工是作者 2026 年 10 月 18 日决定的，卞红强和杨俊是否已确认没有收到消息</w:t>
+              <w:t xml:space="preserve">舒俊（提取员 E1）、卞红强（提取员 E2）、杨俊（分歧仲裁）。Ji Wang 核查两份提取表，不提取。分工是作者 2026 年 10 月 18 日决定的；作者转告卞红强和杨俊已知道并同意（方式和日期没有说明）</w:t>
             </w:r>
           </w:p>
         </w:tc>
@@ -22724,7 +22724,7 @@
         <w:rPr>
           <w:rFonts w:ascii="Calibri" w:cs="Calibri" w:eastAsia="Microsoft YaHei" w:hAnsi="Calibri"/>
         </w:rPr>
-        <w:t xml:space="preserve">卞红强和杨俊是否已经知道、同意提取阶段的分工，没有收到确认。</w:t>
+        <w:t xml:space="preserve">卞红强和杨俊是否同意提取阶段的分工：作者转告两位已知道并同意，方式和日期没有说明，没有书面确认。</w:t>
       </w:r>
     </w:p>
     <w:p>

</xml_diff>

<commit_message>
Delete the extraction time log (EX_time_log) from workbook, scripts and extraction guide
Facts only, no reason recorded; protocol unchanged (it never described this log).

Co-Authored-By: Claude Sonnet 5.5 <noreply@anthropic.com>
Claude-Session: https://claude.ai/code/session_01FRD7etKqYN8v2bbXeeLMRW
</commit_message>
<xml_diff>
--- a/Extraction guide - how to fill the extraction workbook (draft).docx
+++ b/Extraction guide - how to fill the extraction workbook (draft).docx
@@ -116,7 +116,7 @@
                 <w:sz w:val="19"/>
                 <w:szCs w:val="19"/>
               </w:rPr>
-              <w:t xml:space="preserve">提取操作说明 v2026-10-18a（草稿）。标 </w:t>
+              <w:t xml:space="preserve">提取操作说明 v2026-10-19a（草稿）。标 </w:t>
             </w:r>
             <w:r>
               <w:rPr>
@@ -192,7 +192,7 @@
                 <w:sz w:val="19"/>
                 <w:szCs w:val="19"/>
               </w:rPr>
-              <w:t xml:space="preserve">项目</w:t>
+              <w:t xml:space="preserve">改动（2026-10-19）</w:t>
             </w:r>
           </w:p>
         </w:tc>
@@ -223,7 +223,42 @@
                 <w:sz w:val="19"/>
                 <w:szCs w:val="19"/>
               </w:rPr>
-              <w:t xml:space="preserve">儿童游走脾系统综述（含个体患者数据）和单中心病例系列；PROSPERO CRD420261520329；协议 v1.5</w:t>
+              <w:t xml:space="preserve">提取阶段</w:t>
+            </w:r>
+            <w:r>
+              <w:rPr>
+                <w:rFonts w:ascii="Calibri" w:cs="Calibri" w:eastAsia="Microsoft YaHei" w:hAnsi="Calibri"/>
+                <w:b/>
+                <w:bCs/>
+                <w:sz w:val="19"/>
+                <w:szCs w:val="19"/>
+              </w:rPr>
+              <w:t xml:space="preserve">不保存时间记录</w:t>
+            </w:r>
+            <w:r>
+              <w:rPr>
+                <w:rFonts w:ascii="Calibri" w:cs="Calibri" w:eastAsia="Microsoft YaHei" w:hAnsi="Calibri"/>
+                <w:sz w:val="19"/>
+                <w:szCs w:val="19"/>
+              </w:rPr>
+              <w:t xml:space="preserve">：作者 2026 年 10 月 19 日决定删除提取工作簿里的 EX_time_log 表（提取尚未开始）。理由作者没有说明，文件里不写理由。协议 v1.6 对提取阶段没有时间记录的规定，所以协议不用改；脚本 </w:t>
+            </w:r>
+            <w:r>
+              <w:rPr>
+                <w:rFonts w:ascii="Consolas" w:cs="Consolas" w:eastAsia="Microsoft YaHei" w:hAnsi="Consolas"/>
+                <w:sz w:val="19"/>
+                <w:szCs w:val="19"/>
+                <w:shd w:fill="EEEEEE" w:val="clear"/>
+              </w:rPr>
+              <w:t xml:space="preserve">compare_extraction.py</w:t>
+            </w:r>
+            <w:r>
+              <w:rPr>
+                <w:rFonts w:ascii="Calibri" w:cs="Calibri" w:eastAsia="Microsoft YaHei" w:hAnsi="Calibri"/>
+                <w:sz w:val="19"/>
+                <w:szCs w:val="19"/>
+              </w:rPr>
+              <w:t xml:space="preserve"> 也不再检查用时。本说明里提到时间记录的四处（目录里第 2 章的说明、第 1 节第 4 步及随后的步骤编号、2.2 清单、第 10 节）已删或改，版本号随之更新，其余内容没有变</w:t>
             </w:r>
           </w:p>
         </w:tc>
@@ -263,7 +298,7 @@
                 <w:sz w:val="19"/>
                 <w:szCs w:val="19"/>
               </w:rPr>
-              <w:t xml:space="preserve">适用对象</w:t>
+              <w:t xml:space="preserve">项目</w:t>
             </w:r>
           </w:p>
         </w:tc>
@@ -294,7 +329,7 @@
                 <w:sz w:val="19"/>
                 <w:szCs w:val="19"/>
               </w:rPr>
-              <w:t xml:space="preserve">舒俊（提取员 E1）、卞红强（提取员 E2）、杨俊（分歧仲裁）。Ji Wang 核查两份提取表，不提取。分工是作者 2026 年 10 月 18 日决定的；作者转告卞红强和杨俊已知道并同意（方式和日期没有说明）</w:t>
+              <w:t xml:space="preserve">儿童游走脾系统综述（含个体患者数据）和单中心病例系列；PROSPERO CRD420261520329；协议 v1.5</w:t>
             </w:r>
           </w:p>
         </w:tc>
@@ -334,6 +369,77 @@
                 <w:sz w:val="19"/>
                 <w:szCs w:val="19"/>
               </w:rPr>
+              <w:t xml:space="preserve">适用对象</w:t>
+            </w:r>
+          </w:p>
+        </w:tc>
+        <w:tc>
+          <w:tcPr>
+            <w:tcW w:type="dxa" w:w="7492"/>
+            <w:tcBorders>
+              <w:top w:val="single" w:color="BBBBBB" w:sz="4"/>
+              <w:left w:val="single" w:color="BBBBBB" w:sz="4"/>
+              <w:bottom w:val="single" w:color="BBBBBB" w:sz="4"/>
+              <w:right w:val="single" w:color="BBBBBB" w:sz="4"/>
+            </w:tcBorders>
+            <w:tcMar>
+              <w:top w:type="dxa" w:w="55"/>
+              <w:left w:type="dxa" w:w="95"/>
+              <w:bottom w:type="dxa" w:w="55"/>
+              <w:right w:type="dxa" w:w="95"/>
+            </w:tcMar>
+            <w:vAlign w:val="top"/>
+          </w:tcPr>
+          <w:p>
+            <w:pPr>
+              <w:spacing w:after="0"/>
+            </w:pPr>
+            <w:r>
+              <w:rPr>
+                <w:rFonts w:ascii="Calibri" w:cs="Calibri" w:eastAsia="Microsoft YaHei" w:hAnsi="Calibri"/>
+                <w:sz w:val="19"/>
+                <w:szCs w:val="19"/>
+              </w:rPr>
+              <w:t xml:space="preserve">舒俊（提取员 E1）、卞红强（提取员 E2）、杨俊（分歧仲裁）。Ji Wang 核查两份提取表，不提取。分工是作者 2026 年 10 月 18 日决定的；作者转告卞红强和杨俊已知道并同意（方式和日期没有说明）</w:t>
+            </w:r>
+          </w:p>
+        </w:tc>
+      </w:tr>
+      <w:tr>
+        <w:trPr>
+          <w:cantSplit/>
+          <w:tblHeader w:val="false"/>
+        </w:trPr>
+        <w:tc>
+          <w:tcPr>
+            <w:tcW w:type="dxa" w:w="1534"/>
+            <w:tcBorders>
+              <w:top w:val="single" w:color="BBBBBB" w:sz="4"/>
+              <w:left w:val="single" w:color="BBBBBB" w:sz="4"/>
+              <w:bottom w:val="single" w:color="BBBBBB" w:sz="4"/>
+              <w:right w:val="single" w:color="BBBBBB" w:sz="4"/>
+            </w:tcBorders>
+            <w:shd w:fill="F2F5F9" w:val="clear"/>
+            <w:tcMar>
+              <w:top w:type="dxa" w:w="55"/>
+              <w:left w:type="dxa" w:w="95"/>
+              <w:bottom w:type="dxa" w:w="55"/>
+              <w:right w:type="dxa" w:w="95"/>
+            </w:tcMar>
+            <w:vAlign w:val="top"/>
+          </w:tcPr>
+          <w:p>
+            <w:pPr>
+              <w:spacing w:after="0"/>
+            </w:pPr>
+            <w:r>
+              <w:rPr>
+                <w:rFonts w:ascii="Calibri" w:cs="Calibri" w:eastAsia="Microsoft YaHei" w:hAnsi="Calibri"/>
+                <w:b/>
+                <w:bCs/>
+                <w:sz w:val="19"/>
+                <w:szCs w:val="19"/>
+              </w:rPr>
               <w:t xml:space="preserve">配套文件</w:t>
             </w:r>
           </w:p>
@@ -365,7 +471,7 @@
                 <w:sz w:val="19"/>
                 <w:szCs w:val="19"/>
               </w:rPr>
-              <w:t xml:space="preserve">协议 v1.5 附录 C（提取表和 9 条时间换算规则）；《提取工作簿》v2026-10-18a；比对脚本 </w:t>
+              <w:t xml:space="preserve">协议 v1.5 附录 C（提取表和 9 条时间换算规则）；《提取工作簿》v2026-10-19d；比对脚本 </w:t>
             </w:r>
             <w:r>
               <w:rPr>
@@ -1030,7 +1136,7 @@
                 <w:sz w:val="19"/>
                 <w:szCs w:val="19"/>
               </w:rPr>
-              <w:t xml:space="preserve">开始前：文件、副本、不能看什么、时间记录</w:t>
+              <w:t xml:space="preserve">开始前：文件、副本、不能看什么</w:t>
             </w:r>
           </w:p>
         </w:tc>
@@ -2302,24 +2408,6 @@
           <w:rFonts w:ascii="Calibri" w:cs="Calibri" w:eastAsia="Microsoft YaHei" w:hAnsi="Calibri"/>
         </w:rPr>
         <w:t xml:space="preserve"> 先在 Reports 表填这篇报告的一行，再在 Patients 表给每名符合条件的儿童填一行。</w:t>
-      </w:r>
-    </w:p>
-    <w:p>
-      <w:pPr>
-        <w:pStyle w:val="ListParagraph"/>
-        <w:numPr>
-          <w:ilvl w:val="0"/>
-          <w:numId w:val="3"/>
-        </w:numPr>
-        <w:spacing w:after="60"/>
-      </w:pPr>
-      <w:r>
-        <w:rPr>
-          <w:rFonts w:ascii="Calibri" w:cs="Calibri" w:eastAsia="Microsoft YaHei" w:hAnsi="Calibri"/>
-          <w:b/>
-          <w:bCs/>
-        </w:rPr>
-        <w:t xml:space="preserve">每次开始和结束，在 EX_time_log 里写一行。</w:t>
       </w:r>
     </w:p>
     <w:p>
@@ -3103,32 +3191,6 @@
           <w:rFonts w:ascii="Calibri" w:cs="Calibri" w:eastAsia="Microsoft YaHei" w:hAnsi="Calibri"/>
         </w:rPr>
         <w:t xml:space="preserve">（不是摘要页），并且是名单上的那一篇。</w:t>
-      </w:r>
-    </w:p>
-    <w:p>
-      <w:pPr>
-        <w:tabs>
-          <w:tab w:val="left" w:pos="560"/>
-        </w:tabs>
-        <w:spacing w:after="70"/>
-        <w:ind w:left="560" w:hanging="380"/>
-      </w:pPr>
-      <w:r>
-        <w:rPr>
-          <w:rFonts w:ascii="Segoe UI Symbol" w:cs="Segoe UI Symbol" w:eastAsia="MS Gothic" w:hAnsi="Segoe UI Symbol"/>
-          <w:sz w:val="22"/>
-          <w:szCs w:val="22"/>
-        </w:rPr>
-        <w:t xml:space="preserve">☐</w:t>
-      </w:r>
-      <w:r>
-        <w:tab/>
-      </w:r>
-      <w:r>
-        <w:rPr>
-          <w:rFonts w:ascii="Calibri" w:cs="Calibri" w:eastAsia="Microsoft YaHei" w:hAnsi="Calibri"/>
-        </w:rPr>
-        <w:t xml:space="preserve">开始和结束时间写进 EX_time_log（日期、起止时间、处理的报告数和录入的患者数）。</w:t>
       </w:r>
     </w:p>
     <w:tbl>
@@ -20460,7 +20522,7 @@
         <w:rPr>
           <w:rFonts w:ascii="Calibri" w:cs="Calibri" w:eastAsia="Microsoft YaHei" w:hAnsi="Calibri"/>
         </w:rPr>
-        <w:t xml:space="preserve">，互不查看，记 EX_time_log。</w:t>
+        <w:t xml:space="preserve">，互不查看。</w:t>
       </w:r>
     </w:p>
     <w:p>
@@ -22667,7 +22729,7 @@
         <w:rPr>
           <w:rFonts w:ascii="Calibri" w:cs="Calibri" w:eastAsia="Microsoft YaHei" w:hAnsi="Calibri"/>
         </w:rPr>
-        <w:t xml:space="preserve">这份说明里的所有例子都是虚构的，没有对照过任何真实报告；规则的原文来自协议 v1.5 附录 C，工作簿的列名和下拉值来自模板 v2026-10-18a。</w:t>
+        <w:t xml:space="preserve">这份说明里的所有例子都是虚构的，没有对照过任何真实报告；规则的原文来自协议 v1.5 附录 C，工作簿的列名和下拉值来自模板 v2026-10-19d。</w:t>
       </w:r>
     </w:p>
     <w:p>
@@ -22808,7 +22870,7 @@
         <w:sz w:val="17"/>
         <w:szCs w:val="17"/>
       </w:rPr>
-      <w:t xml:space="preserve">提取操作说明 v2026-10-18a   |   第 </w:t>
+      <w:t xml:space="preserve">提取操作说明 v2026-10-19a   |   第 </w:t>
     </w:r>
     <w:r>
       <w:rPr>

</xml_diff>

<commit_message>
Record full-text calibration discussion outcome; guide v2026-10-19g (appendix data, ws_basis rule); release formal blank workbooks
Per-patient data in an online appendix counts as individual data; the two Chinese series
are Include and no longer IPD candidates. Formal FT_log blanks regenerated (v2026-10-19e).

Co-Authored-By: Claude Sonnet 5.5 <noreply@anthropic.com>
Claude-Session: https://claude.ai/code/session_01FRD7etKqYN8v2bbXeeLMRW
</commit_message>
<xml_diff>
--- a/Extraction guide - how to fill the extraction workbook (draft).docx
+++ b/Extraction guide - how to fill the extraction workbook (draft).docx
@@ -116,7 +116,7 @@
                 <w:sz w:val="19"/>
                 <w:szCs w:val="19"/>
               </w:rPr>
-              <w:t xml:space="preserve">提取操作说明 v2026-10-19a（草稿）。标 </w:t>
+              <w:t xml:space="preserve">提取操作说明 v2026-10-19b（草稿）。标 </w:t>
             </w:r>
             <w:r>
               <w:rPr>
@@ -192,7 +192,7 @@
                 <w:sz w:val="19"/>
                 <w:szCs w:val="19"/>
               </w:rPr>
-              <w:t xml:space="preserve">改动（2026-10-19）</w:t>
+              <w:t xml:space="preserve">改动（2026-10-19，校准之后）</w:t>
             </w:r>
           </w:p>
         </w:tc>
@@ -223,25 +223,7 @@
                 <w:sz w:val="19"/>
                 <w:szCs w:val="19"/>
               </w:rPr>
-              <w:t xml:space="preserve">提取阶段</w:t>
-            </w:r>
-            <w:r>
-              <w:rPr>
-                <w:rFonts w:ascii="Calibri" w:cs="Calibri" w:eastAsia="Microsoft YaHei" w:hAnsi="Calibri"/>
-                <w:b/>
-                <w:bCs/>
-                <w:sz w:val="19"/>
-                <w:szCs w:val="19"/>
-              </w:rPr>
-              <w:t xml:space="preserve">不保存时间记录</w:t>
-            </w:r>
-            <w:r>
-              <w:rPr>
-                <w:rFonts w:ascii="Calibri" w:cs="Calibri" w:eastAsia="Microsoft YaHei" w:hAnsi="Calibri"/>
-                <w:sz w:val="19"/>
-                <w:szCs w:val="19"/>
-              </w:rPr>
-              <w:t xml:space="preserve">：作者 2026 年 10 月 19 日决定删除提取工作簿里的 EX_time_log 表（提取尚未开始）。理由作者没有说明，文件里不写理由。协议 v1.6 对提取阶段没有时间记录的规定，所以协议不用改；脚本 </w:t>
+              <w:t xml:space="preserve">全文阶段 20 篇校准讨论后（作者转告）：</w:t>
             </w:r>
             <w:r>
               <w:rPr>
@@ -250,15 +232,32 @@
                 <w:szCs w:val="19"/>
                 <w:shd w:fill="EEEEEE" w:val="clear"/>
               </w:rPr>
-              <w:t xml:space="preserve">compare_extraction.py</w:t>
-            </w:r>
-            <w:r>
-              <w:rPr>
-                <w:rFonts w:ascii="Calibri" w:cs="Calibri" w:eastAsia="Microsoft YaHei" w:hAnsi="Calibri"/>
-                <w:sz w:val="19"/>
-                <w:szCs w:val="19"/>
-              </w:rPr>
-              <w:t xml:space="preserve"> 也不再检查用时。本说明里提到时间记录的四处（目录里第 2 章的说明、第 1 节第 4 步及随后的步骤编号、2.2 清单、第 10 节）已删或改，版本号随之更新，其余内容没有变</w:t>
+              <w:t xml:space="preserve">ws_basis</w:t>
+            </w:r>
+            <w:r>
+              <w:rPr>
+                <w:rFonts w:ascii="Calibri" w:cs="Calibri" w:eastAsia="Microsoft YaHei" w:hAnsi="Calibri"/>
+                <w:sz w:val="19"/>
+                <w:szCs w:val="19"/>
+              </w:rPr>
+              <w:t xml:space="preserve"> 的 </w:t>
+            </w:r>
+            <w:r>
+              <w:rPr>
+                <w:rFonts w:ascii="Consolas" w:cs="Consolas" w:eastAsia="Microsoft YaHei" w:hAnsi="Consolas"/>
+                <w:sz w:val="19"/>
+                <w:szCs w:val="19"/>
+                <w:shd w:fill="EEEEEE" w:val="clear"/>
+              </w:rPr>
+              <w:t xml:space="preserve">Imaging and operation</w:t>
+            </w:r>
+            <w:r>
+              <w:rPr>
+                <w:rFonts w:ascii="Calibri" w:cs="Calibri" w:eastAsia="Microsoft YaHei" w:hAnsi="Calibri"/>
+                <w:sz w:val="19"/>
+                <w:szCs w:val="19"/>
+              </w:rPr>
+              <w:t xml:space="preserve"> 只在影像和术中所见都写明脾异位或活动时才选（5.2 表）；逐例资料在线上附录里的报告，附录也要取到（2.2 清单）。没有改别的规则</w:t>
             </w:r>
           </w:p>
         </w:tc>
@@ -298,7 +297,7 @@
                 <w:sz w:val="19"/>
                 <w:szCs w:val="19"/>
               </w:rPr>
-              <w:t xml:space="preserve">项目</w:t>
+              <w:t xml:space="preserve">改动（2026-10-19）</w:t>
             </w:r>
           </w:p>
         </w:tc>
@@ -329,7 +328,42 @@
                 <w:sz w:val="19"/>
                 <w:szCs w:val="19"/>
               </w:rPr>
-              <w:t xml:space="preserve">儿童游走脾系统综述（含个体患者数据）和单中心病例系列；PROSPERO CRD420261520329；协议 v1.5</w:t>
+              <w:t xml:space="preserve">提取阶段</w:t>
+            </w:r>
+            <w:r>
+              <w:rPr>
+                <w:rFonts w:ascii="Calibri" w:cs="Calibri" w:eastAsia="Microsoft YaHei" w:hAnsi="Calibri"/>
+                <w:b/>
+                <w:bCs/>
+                <w:sz w:val="19"/>
+                <w:szCs w:val="19"/>
+              </w:rPr>
+              <w:t xml:space="preserve">不保存时间记录</w:t>
+            </w:r>
+            <w:r>
+              <w:rPr>
+                <w:rFonts w:ascii="Calibri" w:cs="Calibri" w:eastAsia="Microsoft YaHei" w:hAnsi="Calibri"/>
+                <w:sz w:val="19"/>
+                <w:szCs w:val="19"/>
+              </w:rPr>
+              <w:t xml:space="preserve">：作者 2026 年 10 月 19 日决定删除提取工作簿里的 EX_time_log 表（提取尚未开始）。理由作者没有说明，文件里不写理由。协议 v1.6 对提取阶段没有时间记录的规定，所以协议不用改；脚本 </w:t>
+            </w:r>
+            <w:r>
+              <w:rPr>
+                <w:rFonts w:ascii="Consolas" w:cs="Consolas" w:eastAsia="Microsoft YaHei" w:hAnsi="Consolas"/>
+                <w:sz w:val="19"/>
+                <w:szCs w:val="19"/>
+                <w:shd w:fill="EEEEEE" w:val="clear"/>
+              </w:rPr>
+              <w:t xml:space="preserve">compare_extraction.py</w:t>
+            </w:r>
+            <w:r>
+              <w:rPr>
+                <w:rFonts w:ascii="Calibri" w:cs="Calibri" w:eastAsia="Microsoft YaHei" w:hAnsi="Calibri"/>
+                <w:sz w:val="19"/>
+                <w:szCs w:val="19"/>
+              </w:rPr>
+              <w:t xml:space="preserve"> 也不再检查用时。本说明里提到时间记录的四处（目录里第 2 章的说明、第 1 节第 4 步及随后的步骤编号、2.2 清单、第 10 节）已删或改，版本号随之更新，其余内容没有变</w:t>
             </w:r>
           </w:p>
         </w:tc>
@@ -369,7 +403,7 @@
                 <w:sz w:val="19"/>
                 <w:szCs w:val="19"/>
               </w:rPr>
-              <w:t xml:space="preserve">适用对象</w:t>
+              <w:t xml:space="preserve">项目</w:t>
             </w:r>
           </w:p>
         </w:tc>
@@ -400,7 +434,7 @@
                 <w:sz w:val="19"/>
                 <w:szCs w:val="19"/>
               </w:rPr>
-              <w:t xml:space="preserve">舒俊（提取员 E1）、卞红强（提取员 E2）、杨俊（分歧仲裁）。Ji Wang 核查两份提取表，不提取。分工是作者 2026 年 10 月 18 日决定的；作者转告卞红强和杨俊已知道并同意（方式和日期没有说明）</w:t>
+              <w:t xml:space="preserve">儿童游走脾系统综述（含个体患者数据）和单中心病例系列；PROSPERO CRD420261520329；协议 v1.5</w:t>
             </w:r>
           </w:p>
         </w:tc>
@@ -440,6 +474,77 @@
                 <w:sz w:val="19"/>
                 <w:szCs w:val="19"/>
               </w:rPr>
+              <w:t xml:space="preserve">适用对象</w:t>
+            </w:r>
+          </w:p>
+        </w:tc>
+        <w:tc>
+          <w:tcPr>
+            <w:tcW w:type="dxa" w:w="7492"/>
+            <w:tcBorders>
+              <w:top w:val="single" w:color="BBBBBB" w:sz="4"/>
+              <w:left w:val="single" w:color="BBBBBB" w:sz="4"/>
+              <w:bottom w:val="single" w:color="BBBBBB" w:sz="4"/>
+              <w:right w:val="single" w:color="BBBBBB" w:sz="4"/>
+            </w:tcBorders>
+            <w:tcMar>
+              <w:top w:type="dxa" w:w="55"/>
+              <w:left w:type="dxa" w:w="95"/>
+              <w:bottom w:type="dxa" w:w="55"/>
+              <w:right w:type="dxa" w:w="95"/>
+            </w:tcMar>
+            <w:vAlign w:val="top"/>
+          </w:tcPr>
+          <w:p>
+            <w:pPr>
+              <w:spacing w:after="0"/>
+            </w:pPr>
+            <w:r>
+              <w:rPr>
+                <w:rFonts w:ascii="Calibri" w:cs="Calibri" w:eastAsia="Microsoft YaHei" w:hAnsi="Calibri"/>
+                <w:sz w:val="19"/>
+                <w:szCs w:val="19"/>
+              </w:rPr>
+              <w:t xml:space="preserve">舒俊（提取员 E1）、卞红强（提取员 E2）、杨俊（分歧仲裁）。Ji Wang 核查两份提取表，不提取。分工是作者 2026 年 10 月 18 日决定的；作者转告卞红强和杨俊已知道并同意（方式和日期没有说明）</w:t>
+            </w:r>
+          </w:p>
+        </w:tc>
+      </w:tr>
+      <w:tr>
+        <w:trPr>
+          <w:cantSplit/>
+          <w:tblHeader w:val="false"/>
+        </w:trPr>
+        <w:tc>
+          <w:tcPr>
+            <w:tcW w:type="dxa" w:w="1534"/>
+            <w:tcBorders>
+              <w:top w:val="single" w:color="BBBBBB" w:sz="4"/>
+              <w:left w:val="single" w:color="BBBBBB" w:sz="4"/>
+              <w:bottom w:val="single" w:color="BBBBBB" w:sz="4"/>
+              <w:right w:val="single" w:color="BBBBBB" w:sz="4"/>
+            </w:tcBorders>
+            <w:shd w:fill="F2F5F9" w:val="clear"/>
+            <w:tcMar>
+              <w:top w:type="dxa" w:w="55"/>
+              <w:left w:type="dxa" w:w="95"/>
+              <w:bottom w:type="dxa" w:w="55"/>
+              <w:right w:type="dxa" w:w="95"/>
+            </w:tcMar>
+            <w:vAlign w:val="top"/>
+          </w:tcPr>
+          <w:p>
+            <w:pPr>
+              <w:spacing w:after="0"/>
+            </w:pPr>
+            <w:r>
+              <w:rPr>
+                <w:rFonts w:ascii="Calibri" w:cs="Calibri" w:eastAsia="Microsoft YaHei" w:hAnsi="Calibri"/>
+                <w:b/>
+                <w:bCs/>
+                <w:sz w:val="19"/>
+                <w:szCs w:val="19"/>
+              </w:rPr>
               <w:t xml:space="preserve">配套文件</w:t>
             </w:r>
           </w:p>
@@ -471,7 +576,7 @@
                 <w:sz w:val="19"/>
                 <w:szCs w:val="19"/>
               </w:rPr>
-              <w:t xml:space="preserve">协议 v1.5 附录 C（提取表和 9 条时间换算规则）；《提取工作簿》v2026-10-19d；比对脚本 </w:t>
+              <w:t xml:space="preserve">协议 v1.5 附录 C（提取表和 9 条时间换算规则）；《提取工作簿》v2026-10-19e；比对脚本 </w:t>
             </w:r>
             <w:r>
               <w:rPr>
@@ -3193,6 +3298,46 @@
         <w:t xml:space="preserve">（不是摘要页），并且是名单上的那一篇。</w:t>
       </w:r>
     </w:p>
+    <w:p>
+      <w:pPr>
+        <w:tabs>
+          <w:tab w:val="left" w:pos="560"/>
+        </w:tabs>
+        <w:spacing w:after="70"/>
+        <w:ind w:left="560" w:hanging="380"/>
+      </w:pPr>
+      <w:r>
+        <w:rPr>
+          <w:rFonts w:ascii="Segoe UI Symbol" w:cs="Segoe UI Symbol" w:eastAsia="MS Gothic" w:hAnsi="Segoe UI Symbol"/>
+          <w:sz w:val="22"/>
+          <w:szCs w:val="22"/>
+        </w:rPr>
+        <w:t xml:space="preserve">☐</w:t>
+      </w:r>
+      <w:r>
+        <w:tab/>
+      </w:r>
+      <w:r>
+        <w:rPr>
+          <w:rFonts w:ascii="Calibri" w:cs="Calibri" w:eastAsia="Microsoft YaHei" w:hAnsi="Calibri"/>
+        </w:rPr>
+        <w:t xml:space="preserve">逐例资料在线上附录或补充材料里的报告（全文阶段 6.5 已判 Include 的），</w:t>
+      </w:r>
+      <w:r>
+        <w:rPr>
+          <w:rFonts w:ascii="Calibri" w:cs="Calibri" w:eastAsia="Microsoft YaHei" w:hAnsi="Calibri"/>
+          <w:b/>
+          <w:bCs/>
+        </w:rPr>
+        <w:t xml:space="preserve">附录也要在手边</w:t>
+      </w:r>
+      <w:r>
+        <w:rPr>
+          <w:rFonts w:ascii="Calibri" w:cs="Calibri" w:eastAsia="Microsoft YaHei" w:hAnsi="Calibri"/>
+        </w:rPr>
+        <w:t xml:space="preserve">，没有附录不要凭正文猜；附录取不到的，记下 WS 编号告诉杨俊。</w:t>
+      </w:r>
+    </w:p>
     <w:tbl>
       <w:tblPr>
         <w:tblW w:type="dxa" w:w="9026"/>
@@ -7100,7 +7245,25 @@
                 <w:sz w:val="19"/>
                 <w:szCs w:val="19"/>
               </w:rPr>
-              <w:t xml:space="preserve">两者都有</w:t>
+              <w:t xml:space="preserve">影像和术中所见</w:t>
+            </w:r>
+            <w:r>
+              <w:rPr>
+                <w:rFonts w:ascii="Calibri" w:cs="Calibri" w:eastAsia="Microsoft YaHei" w:hAnsi="Calibri"/>
+                <w:b/>
+                <w:bCs/>
+                <w:sz w:val="19"/>
+                <w:szCs w:val="19"/>
+              </w:rPr>
+              <w:t xml:space="preserve">都</w:t>
+            </w:r>
+            <w:r>
+              <w:rPr>
+                <w:rFonts w:ascii="Calibri" w:cs="Calibri" w:eastAsia="Microsoft YaHei" w:hAnsi="Calibri"/>
+                <w:sz w:val="19"/>
+                <w:szCs w:val="19"/>
+              </w:rPr>
+              <w:t xml:space="preserve">写明了脾异位或活动（脾不在脾窝、蒂长、韧带缺如或松弛等）。手术只是治疗性切除、没有描述脾位置或活动度的，不算，选 Imaging 那一项（全文指南 6.7，2026 年 10 月 19 日校准讨论）</w:t>
             </w:r>
           </w:p>
         </w:tc>
@@ -22729,7 +22892,7 @@
         <w:rPr>
           <w:rFonts w:ascii="Calibri" w:cs="Calibri" w:eastAsia="Microsoft YaHei" w:hAnsi="Calibri"/>
         </w:rPr>
-        <w:t xml:space="preserve">这份说明里的所有例子都是虚构的，没有对照过任何真实报告；规则的原文来自协议 v1.5 附录 C，工作簿的列名和下拉值来自模板 v2026-10-19d。</w:t>
+        <w:t xml:space="preserve">这份说明里的所有例子都是虚构的，没有对照过任何真实报告；规则的原文来自协议 v1.5 附录 C，工作簿的列名和下拉值来自模板 v2026-10-19e。</w:t>
       </w:r>
     </w:p>
     <w:p>
@@ -22870,7 +23033,7 @@
         <w:sz w:val="17"/>
         <w:szCs w:val="17"/>
       </w:rPr>
-      <w:t xml:space="preserve">提取操作说明 v2026-10-19a   |   第 </w:t>
+      <w:t xml:space="preserve">提取操作说明 v2026-10-19b   |   第 </w:t>
     </w:r>
     <w:r>
       <w:rPr>

</xml_diff>

<commit_message>
Extraction calibration: fix seed and rule, add draw script (real draw waits for the Include list)
Co-Authored-By: Claude Sonnet 5.5 <noreply@anthropic.com>
Claude-Session: https://claude.ai/code/session_01FRD7etKqYN8v2bbXeeLMRW
</commit_message>
<xml_diff>
--- a/Extraction guide - how to fill the extraction workbook (draft).docx
+++ b/Extraction guide - how to fill the extraction workbook (draft).docx
@@ -116,7 +116,7 @@
                 <w:sz w:val="19"/>
                 <w:szCs w:val="19"/>
               </w:rPr>
-              <w:t xml:space="preserve">提取操作说明 v2026-10-19b（草稿）。标 </w:t>
+              <w:t xml:space="preserve">提取操作说明 v2026-10-19c（草稿）。标 </w:t>
             </w:r>
             <w:r>
               <w:rPr>
@@ -153,6 +153,129 @@
                 <w:szCs w:val="19"/>
               </w:rPr>
               <w:t xml:space="preserve"> 的内容要两位提取员和仲裁人确认后才算生效</w:t>
+            </w:r>
+          </w:p>
+        </w:tc>
+      </w:tr>
+      <w:tr>
+        <w:trPr>
+          <w:cantSplit/>
+          <w:tblHeader w:val="false"/>
+        </w:trPr>
+        <w:tc>
+          <w:tcPr>
+            <w:tcW w:type="dxa" w:w="1534"/>
+            <w:tcBorders>
+              <w:top w:val="single" w:color="BBBBBB" w:sz="4"/>
+              <w:left w:val="single" w:color="BBBBBB" w:sz="4"/>
+              <w:bottom w:val="single" w:color="BBBBBB" w:sz="4"/>
+              <w:right w:val="single" w:color="BBBBBB" w:sz="4"/>
+            </w:tcBorders>
+            <w:shd w:fill="F2F5F9" w:val="clear"/>
+            <w:tcMar>
+              <w:top w:type="dxa" w:w="55"/>
+              <w:left w:type="dxa" w:w="95"/>
+              <w:bottom w:type="dxa" w:w="55"/>
+              <w:right w:type="dxa" w:w="95"/>
+            </w:tcMar>
+            <w:vAlign w:val="top"/>
+          </w:tcPr>
+          <w:p>
+            <w:pPr>
+              <w:spacing w:after="0"/>
+            </w:pPr>
+            <w:r>
+              <w:rPr>
+                <w:rFonts w:ascii="Calibri" w:cs="Calibri" w:eastAsia="Microsoft YaHei" w:hAnsi="Calibri"/>
+                <w:b/>
+                <w:bCs/>
+                <w:sz w:val="19"/>
+                <w:szCs w:val="19"/>
+              </w:rPr>
+              <w:t xml:space="preserve">改动（2026-10-19，抽样规则）</w:t>
+            </w:r>
+          </w:p>
+        </w:tc>
+        <w:tc>
+          <w:tcPr>
+            <w:tcW w:type="dxa" w:w="7492"/>
+            <w:tcBorders>
+              <w:top w:val="single" w:color="BBBBBB" w:sz="4"/>
+              <w:left w:val="single" w:color="BBBBBB" w:sz="4"/>
+              <w:bottom w:val="single" w:color="BBBBBB" w:sz="4"/>
+              <w:right w:val="single" w:color="BBBBBB" w:sz="4"/>
+            </w:tcBorders>
+            <w:tcMar>
+              <w:top w:type="dxa" w:w="55"/>
+              <w:left w:type="dxa" w:w="95"/>
+              <w:bottom w:type="dxa" w:w="55"/>
+              <w:right w:type="dxa" w:w="95"/>
+            </w:tcMar>
+            <w:vAlign w:val="top"/>
+          </w:tcPr>
+          <w:p>
+            <w:pPr>
+              <w:spacing w:after="0"/>
+            </w:pPr>
+            <w:r>
+              <w:rPr>
+                <w:rFonts w:ascii="Calibri" w:cs="Calibri" w:eastAsia="Microsoft YaHei" w:hAnsi="Calibri"/>
+                <w:sz w:val="19"/>
+                <w:szCs w:val="19"/>
+              </w:rPr>
+              <w:t xml:space="preserve">第 10 节第 1 步：10 篇校准的抽样规则和种子（20261019）先定下来，写成脚本 </w:t>
+            </w:r>
+            <w:r>
+              <w:rPr>
+                <w:rFonts w:ascii="Consolas" w:cs="Consolas" w:eastAsia="Microsoft YaHei" w:hAnsi="Consolas"/>
+                <w:sz w:val="19"/>
+                <w:szCs w:val="19"/>
+                <w:shd w:fill="EEEEEE" w:val="clear"/>
+              </w:rPr>
+              <w:t xml:space="preserve">tools/draw_extraction_calibration.py</w:t>
+            </w:r>
+            <w:r>
+              <w:rPr>
+                <w:rFonts w:ascii="Calibri" w:cs="Calibri" w:eastAsia="Microsoft YaHei" w:hAnsi="Calibri"/>
+                <w:sz w:val="19"/>
+                <w:szCs w:val="19"/>
+              </w:rPr>
+              <w:t xml:space="preserve">；名单（</w:t>
+            </w:r>
+            <w:r>
+              <w:rPr>
+                <w:rFonts w:ascii="Consolas" w:cs="Consolas" w:eastAsia="Microsoft YaHei" w:hAnsi="Consolas"/>
+                <w:sz w:val="19"/>
+                <w:szCs w:val="19"/>
+                <w:shd w:fill="EEEEEE" w:val="clear"/>
+              </w:rPr>
+              <w:t xml:space="preserve">fulltext_included.csv</w:t>
+            </w:r>
+            <w:r>
+              <w:rPr>
+                <w:rFonts w:ascii="Calibri" w:cs="Calibri" w:eastAsia="Microsoft YaHei" w:hAnsi="Calibri"/>
+                <w:sz w:val="19"/>
+                <w:szCs w:val="19"/>
+              </w:rPr>
+              <w:t xml:space="preserve">）要等全文阶段结束，所以</w:t>
+            </w:r>
+            <w:r>
+              <w:rPr>
+                <w:rFonts w:ascii="Calibri" w:cs="Calibri" w:eastAsia="Microsoft YaHei" w:hAnsi="Calibri"/>
+                <w:b/>
+                <w:bCs/>
+                <w:sz w:val="19"/>
+                <w:szCs w:val="19"/>
+              </w:rPr>
+              <w:t xml:space="preserve">现在还不能抽</w:t>
+            </w:r>
+            <w:r>
+              <w:rPr>
+                <w:rFonts w:ascii="Calibri" w:cs="Calibri" w:eastAsia="Microsoft YaHei" w:hAnsi="Calibri"/>
+                <w:sz w:val="19"/>
+                <w:szCs w:val="19"/>
+              </w:rPr>
+              <w:t xml:space="preserve">。其他规则没有变</w:t>
             </w:r>
           </w:p>
         </w:tc>
@@ -20661,7 +20784,110 @@
         <w:rPr>
           <w:rFonts w:ascii="Calibri" w:cs="Calibri" w:eastAsia="Microsoft YaHei" w:hAnsi="Calibri"/>
         </w:rPr>
-        <w:t xml:space="preserve"> 全文阶段结束、纳入名单确定以后，由 Claude 用固定种子从名单里抽，要求至少包括：中文 3 篇、系列报告 3 篇、写法各异的时间（小时、周、范围、含糊说法各至少 1 篇）、只写"脾扭转"的 D1 类 1–2 篇、有未手术或未切除的 1 篇。这是 Claude 的建议；名单还没有，所以还没抽。</w:t>
+        <w:t xml:space="preserve"> 全文阶段结束、纳入名单确定以后，用 </w:t>
+      </w:r>
+      <w:r>
+        <w:rPr>
+          <w:rFonts w:ascii="Consolas" w:cs="Consolas" w:eastAsia="Microsoft YaHei" w:hAnsi="Consolas"/>
+          <w:sz w:val="19"/>
+          <w:szCs w:val="19"/>
+          <w:shd w:fill="EEEEEE" w:val="clear"/>
+        </w:rPr>
+        <w:t xml:space="preserve">tools/draw_extraction_calibration.py</w:t>
+      </w:r>
+      <w:r>
+        <w:rPr>
+          <w:rFonts w:ascii="Calibri" w:cs="Calibri" w:eastAsia="Microsoft YaHei" w:hAnsi="Calibri"/>
+        </w:rPr>
+        <w:t xml:space="preserve"> 从 </w:t>
+      </w:r>
+      <w:r>
+        <w:rPr>
+          <w:rFonts w:ascii="Consolas" w:cs="Consolas" w:eastAsia="Microsoft YaHei" w:hAnsi="Consolas"/>
+          <w:sz w:val="19"/>
+          <w:szCs w:val="19"/>
+          <w:shd w:fill="EEEEEE" w:val="clear"/>
+        </w:rPr>
+        <w:t xml:space="preserve">fulltext_included.csv</w:t>
+      </w:r>
+      <w:r>
+        <w:rPr>
+          <w:rFonts w:ascii="Calibri" w:cs="Calibri" w:eastAsia="Microsoft YaHei" w:hAnsi="Calibri"/>
+        </w:rPr>
+        <w:t xml:space="preserve"> 里抽。</w:t>
+      </w:r>
+      <w:r>
+        <w:rPr>
+          <w:rFonts w:ascii="Calibri" w:cs="Calibri" w:eastAsia="Microsoft YaHei" w:hAnsi="Calibri"/>
+          <w:b/>
+          <w:bCs/>
+        </w:rPr>
+        <w:t xml:space="preserve">种子 20261019 是 2026 年 10 月 19 日定的，早于任何全文决定，抽样结果因此不会受筛选结果的影响；名单还没有，所以现在不能抽。</w:t>
+      </w:r>
+      <w:r>
+        <w:rPr>
+          <w:rFonts w:ascii="Calibri" w:cs="Calibri" w:eastAsia="Microsoft YaHei" w:hAnsi="Calibri"/>
+        </w:rPr>
+        <w:t xml:space="preserve"> 只从已发表个体数据的 Include 里抽（靠邮件拿到个体数据的以后再做）；预试验的 53 篇默认不进（舒俊预试验时提取过，不算没看过的报告；这是 Claude 的选择，待两位提取员确认，要放进去就加 </w:t>
+      </w:r>
+      <w:r>
+        <w:rPr>
+          <w:rFonts w:ascii="Consolas" w:cs="Consolas" w:eastAsia="Microsoft YaHei" w:hAnsi="Consolas"/>
+          <w:sz w:val="19"/>
+          <w:szCs w:val="19"/>
+          <w:shd w:fill="EEEEEE" w:val="clear"/>
+        </w:rPr>
+        <w:t xml:space="preserve">--keep-pilot</w:t>
+      </w:r>
+      <w:r>
+        <w:rPr>
+          <w:rFonts w:ascii="Calibri" w:cs="Calibri" w:eastAsia="Microsoft YaHei" w:hAnsi="Calibri"/>
+        </w:rPr>
+        <w:t xml:space="preserve">）。要求至少包括：中文 3 篇、系列报告 3 篇、写法各异的时间（小时、周、范围、含糊说法各至少 1 篇）、只写"脾扭转"的 D1 类 1 篇、有未手术或未切除的 1 篇（这是 Claude 的建议）。中文、系列和 D1 用全文筛选记录里的值；</w:t>
+      </w:r>
+      <w:r>
+        <w:rPr>
+          <w:rFonts w:ascii="Calibri" w:cs="Calibri" w:eastAsia="Microsoft YaHei" w:hAnsi="Calibri"/>
+          <w:b/>
+          <w:bCs/>
+        </w:rPr>
+        <w:t xml:space="preserve">时间写法和未手术这几层只读数据库摘要里的关键词，很粗，没有摘要的报告配不上</w:t>
+      </w:r>
+      <w:r>
+        <w:rPr>
+          <w:rFonts w:ascii="Calibri" w:cs="Calibri" w:eastAsia="Microsoft YaHei" w:hAnsi="Calibri"/>
+        </w:rPr>
+        <w:t xml:space="preserve">；哪一层凑不够，脚本在设计文件里写明，不硬凑。本院 5 例（OWN）另外提取，不在这 10 篇里。给提取员的只有 </w:t>
+      </w:r>
+      <w:r>
+        <w:rPr>
+          <w:rFonts w:ascii="Consolas" w:cs="Consolas" w:eastAsia="Microsoft YaHei" w:hAnsi="Consolas"/>
+          <w:sz w:val="19"/>
+          <w:szCs w:val="19"/>
+          <w:shd w:fill="EEEEEE" w:val="clear"/>
+        </w:rPr>
+        <w:t xml:space="preserve">calibration_10_list.csv</w:t>
+      </w:r>
+      <w:r>
+        <w:rPr>
+          <w:rFonts w:ascii="Calibri" w:cs="Calibri" w:eastAsia="Microsoft YaHei" w:hAnsi="Calibri"/>
+        </w:rPr>
+        <w:t xml:space="preserve">，分层标记的 </w:t>
+      </w:r>
+      <w:r>
+        <w:rPr>
+          <w:rFonts w:ascii="Consolas" w:cs="Consolas" w:eastAsia="Microsoft YaHei" w:hAnsi="Consolas"/>
+          <w:sz w:val="19"/>
+          <w:szCs w:val="19"/>
+          <w:shd w:fill="EEEEEE" w:val="clear"/>
+        </w:rPr>
+        <w:t xml:space="preserve">calibration_10_key.csv</w:t>
+      </w:r>
+      <w:r>
+        <w:rPr>
+          <w:rFonts w:ascii="Calibri" w:cs="Calibri" w:eastAsia="Microsoft YaHei" w:hAnsi="Calibri"/>
+        </w:rPr>
+        <w:t xml:space="preserve"> 两人都做完之前不打开。</w:t>
       </w:r>
     </w:p>
     <w:p>
@@ -23033,7 +23259,7 @@
         <w:sz w:val="17"/>
         <w:szCs w:val="17"/>
       </w:rPr>
-      <w:t xml:space="preserve">提取操作说明 v2026-10-19b   |   第 </w:t>
+      <w:t xml:space="preserve">提取操作说明 v2026-10-19c   |   第 </w:t>
     </w:r>
     <w:r>
       <w:rPr>

</xml_diff>

<commit_message>
Extraction calibration: record agreement to leave pilot papers out; guide v2026-10-19d
Co-Authored-By: Claude Sonnet 5.5 <noreply@anthropic.com>
Claude-Session: https://claude.ai/code/session_01FRD7etKqYN8v2bbXeeLMRW
</commit_message>
<xml_diff>
--- a/Extraction guide - how to fill the extraction workbook (draft).docx
+++ b/Extraction guide - how to fill the extraction workbook (draft).docx
@@ -116,7 +116,7 @@
                 <w:sz w:val="19"/>
                 <w:szCs w:val="19"/>
               </w:rPr>
-              <w:t xml:space="preserve">提取操作说明 v2026-10-19c（草稿）。标 </w:t>
+              <w:t xml:space="preserve">提取操作说明 v2026-10-19d（草稿）。标 </w:t>
             </w:r>
             <w:r>
               <w:rPr>
@@ -153,6 +153,77 @@
                 <w:szCs w:val="19"/>
               </w:rPr>
               <w:t xml:space="preserve"> 的内容要两位提取员和仲裁人确认后才算生效</w:t>
+            </w:r>
+          </w:p>
+        </w:tc>
+      </w:tr>
+      <w:tr>
+        <w:trPr>
+          <w:cantSplit/>
+          <w:tblHeader w:val="false"/>
+        </w:trPr>
+        <w:tc>
+          <w:tcPr>
+            <w:tcW w:type="dxa" w:w="1534"/>
+            <w:tcBorders>
+              <w:top w:val="single" w:color="BBBBBB" w:sz="4"/>
+              <w:left w:val="single" w:color="BBBBBB" w:sz="4"/>
+              <w:bottom w:val="single" w:color="BBBBBB" w:sz="4"/>
+              <w:right w:val="single" w:color="BBBBBB" w:sz="4"/>
+            </w:tcBorders>
+            <w:shd w:fill="F2F5F9" w:val="clear"/>
+            <w:tcMar>
+              <w:top w:type="dxa" w:w="55"/>
+              <w:left w:type="dxa" w:w="95"/>
+              <w:bottom w:type="dxa" w:w="55"/>
+              <w:right w:type="dxa" w:w="95"/>
+            </w:tcMar>
+            <w:vAlign w:val="top"/>
+          </w:tcPr>
+          <w:p>
+            <w:pPr>
+              <w:spacing w:after="0"/>
+            </w:pPr>
+            <w:r>
+              <w:rPr>
+                <w:rFonts w:ascii="Calibri" w:cs="Calibri" w:eastAsia="Microsoft YaHei" w:hAnsi="Calibri"/>
+                <w:b/>
+                <w:bCs/>
+                <w:sz w:val="19"/>
+                <w:szCs w:val="19"/>
+              </w:rPr>
+              <w:t xml:space="preserve">改动（2026-10-19，状态）</w:t>
+            </w:r>
+          </w:p>
+        </w:tc>
+        <w:tc>
+          <w:tcPr>
+            <w:tcW w:type="dxa" w:w="7492"/>
+            <w:tcBorders>
+              <w:top w:val="single" w:color="BBBBBB" w:sz="4"/>
+              <w:left w:val="single" w:color="BBBBBB" w:sz="4"/>
+              <w:bottom w:val="single" w:color="BBBBBB" w:sz="4"/>
+              <w:right w:val="single" w:color="BBBBBB" w:sz="4"/>
+            </w:tcBorders>
+            <w:tcMar>
+              <w:top w:type="dxa" w:w="55"/>
+              <w:left w:type="dxa" w:w="95"/>
+              <w:bottom w:type="dxa" w:w="55"/>
+              <w:right w:type="dxa" w:w="95"/>
+            </w:tcMar>
+            <w:vAlign w:val="top"/>
+          </w:tcPr>
+          <w:p>
+            <w:pPr>
+              <w:spacing w:after="0"/>
+            </w:pPr>
+            <w:r>
+              <w:rPr>
+                <w:rFonts w:ascii="Calibri" w:cs="Calibri" w:eastAsia="Microsoft YaHei" w:hAnsi="Calibri"/>
+                <w:sz w:val="19"/>
+                <w:szCs w:val="19"/>
+              </w:rPr>
+              <w:t xml:space="preserve">10 篇校准里“预试验的 53 篇不进”一条，舒俊（E1）2026 年 10 月 19 日同意；卞红强（E2）是否同意作者没有说明。规则没有变</w:t>
             </w:r>
           </w:p>
         </w:tc>
@@ -20828,7 +20899,21 @@
         <w:rPr>
           <w:rFonts w:ascii="Calibri" w:cs="Calibri" w:eastAsia="Microsoft YaHei" w:hAnsi="Calibri"/>
         </w:rPr>
-        <w:t xml:space="preserve"> 只从已发表个体数据的 Include 里抽（靠邮件拿到个体数据的以后再做）；预试验的 53 篇默认不进（舒俊预试验时提取过，不算没看过的报告；这是 Claude 的选择，待两位提取员确认，要放进去就加 </w:t>
+        <w:t xml:space="preserve"> 只从已发表个体数据的 Include 里抽（靠邮件拿到个体数据的以后再做）；预试验的 53 篇不进（舒俊预试验时提取过，不算没看过的报告；</w:t>
+      </w:r>
+      <w:r>
+        <w:rPr>
+          <w:rFonts w:ascii="Calibri" w:cs="Calibri" w:eastAsia="Microsoft YaHei" w:hAnsi="Calibri"/>
+          <w:b/>
+          <w:bCs/>
+        </w:rPr>
+        <w:t xml:space="preserve">舒俊 2026 年 10 月 19 日同意，卞红强是否同意没有说明</w:t>
+      </w:r>
+      <w:r>
+        <w:rPr>
+          <w:rFonts w:ascii="Calibri" w:cs="Calibri" w:eastAsia="Microsoft YaHei" w:hAnsi="Calibri"/>
+        </w:rPr>
+        <w:t xml:space="preserve">；要放进去就加 </w:t>
       </w:r>
       <w:r>
         <w:rPr>
@@ -23259,7 +23344,7 @@
         <w:sz w:val="17"/>
         <w:szCs w:val="17"/>
       </w:rPr>
-      <w:t xml:space="preserve">提取操作说明 v2026-10-19c   |   第 </w:t>
+      <w:t xml:space="preserve">提取操作说明 v2026-10-19d   |   第 </w:t>
     </w:r>
     <w:r>
       <w:rPr>

</xml_diff>

<commit_message>
Extraction calibration: both extractors agree to the two draw rules; guide v2026-10-19e (status only)
Co-Authored-By: Claude Sonnet 5.5 <noreply@anthropic.com>
Claude-Session: https://claude.ai/code/session_01FRD7etKqYN8v2bbXeeLMRW
</commit_message>
<xml_diff>
--- a/Extraction guide - how to fill the extraction workbook (draft).docx
+++ b/Extraction guide - how to fill the extraction workbook (draft).docx
@@ -116,7 +116,7 @@
                 <w:sz w:val="19"/>
                 <w:szCs w:val="19"/>
               </w:rPr>
-              <w:t xml:space="preserve">提取操作说明 v2026-10-19d（草稿）。标 </w:t>
+              <w:t xml:space="preserve">提取操作说明 v2026-10-19e（草稿）。标 </w:t>
             </w:r>
             <w:r>
               <w:rPr>
@@ -223,7 +223,7 @@
                 <w:sz w:val="19"/>
                 <w:szCs w:val="19"/>
               </w:rPr>
-              <w:t xml:space="preserve">10 篇校准里“预试验的 53 篇不进”一条，舒俊（E1）2026 年 10 月 19 日同意；卞红强（E2）是否同意作者没有说明。规则没有变</w:t>
+              <w:t xml:space="preserve">10 篇校准里两条选择，舒俊（E1）和卞红强（E2）都同意（作者 2026 年 10 月 19 日转告）：预试验的 53 篇不进；靠邮件拿到个体数据的报告不进，只从已发表个体数据的 Include 里抽。规则没有变</w:t>
             </w:r>
           </w:p>
         </w:tc>
@@ -20899,7 +20899,7 @@
         <w:rPr>
           <w:rFonts w:ascii="Calibri" w:cs="Calibri" w:eastAsia="Microsoft YaHei" w:hAnsi="Calibri"/>
         </w:rPr>
-        <w:t xml:space="preserve"> 只从已发表个体数据的 Include 里抽（靠邮件拿到个体数据的以后再做）；预试验的 53 篇不进（舒俊预试验时提取过，不算没看过的报告；</w:t>
+        <w:t xml:space="preserve"> 只从已发表个体数据的 Include 里抽（靠邮件拿到个体数据的不进校准，以后正式提取时再做；两位提取员都同意）；预试验的 53 篇不进（舒俊预试验时提取过，不算没看过的报告；</w:t>
       </w:r>
       <w:r>
         <w:rPr>
@@ -20907,7 +20907,7 @@
           <w:b/>
           <w:bCs/>
         </w:rPr>
-        <w:t xml:space="preserve">舒俊 2026 年 10 月 19 日同意，卞红强是否同意没有说明</w:t>
+        <w:t xml:space="preserve">舒俊和卞红强都同意</w:t>
       </w:r>
       <w:r>
         <w:rPr>
@@ -23344,7 +23344,7 @@
         <w:sz w:val="17"/>
         <w:szCs w:val="17"/>
       </w:rPr>
-      <w:t xml:space="preserve">提取操作说明 v2026-10-19d   |   第 </w:t>
+      <w:t xml:space="preserve">提取操作说明 v2026-10-19e   |   第 </w:t>
     </w:r>
     <w:r>
       <w:rPr>

</xml_diff>

<commit_message>
Extraction calibration strata confirmed; guide v2026-10-19f (status only)
Co-Authored-By: Claude Sonnet 5.5 <noreply@anthropic.com>
Claude-Session: https://claude.ai/code/session_01FRD7etKqYN8v2bbXeeLMRW
</commit_message>
<xml_diff>
--- a/Extraction guide - how to fill the extraction workbook (draft).docx
+++ b/Extraction guide - how to fill the extraction workbook (draft).docx
@@ -116,7 +116,7 @@
                 <w:sz w:val="19"/>
                 <w:szCs w:val="19"/>
               </w:rPr>
-              <w:t xml:space="preserve">提取操作说明 v2026-10-19e（草稿）。标 </w:t>
+              <w:t xml:space="preserve">提取操作说明 v2026-10-19f（草稿）。标 </w:t>
             </w:r>
             <w:r>
               <w:rPr>
@@ -153,6 +153,77 @@
                 <w:szCs w:val="19"/>
               </w:rPr>
               <w:t xml:space="preserve"> 的内容要两位提取员和仲裁人确认后才算生效</w:t>
+            </w:r>
+          </w:p>
+        </w:tc>
+      </w:tr>
+      <w:tr>
+        <w:trPr>
+          <w:cantSplit/>
+          <w:tblHeader w:val="false"/>
+        </w:trPr>
+        <w:tc>
+          <w:tcPr>
+            <w:tcW w:type="dxa" w:w="1534"/>
+            <w:tcBorders>
+              <w:top w:val="single" w:color="BBBBBB" w:sz="4"/>
+              <w:left w:val="single" w:color="BBBBBB" w:sz="4"/>
+              <w:bottom w:val="single" w:color="BBBBBB" w:sz="4"/>
+              <w:right w:val="single" w:color="BBBBBB" w:sz="4"/>
+            </w:tcBorders>
+            <w:shd w:fill="F2F5F9" w:val="clear"/>
+            <w:tcMar>
+              <w:top w:type="dxa" w:w="55"/>
+              <w:left w:type="dxa" w:w="95"/>
+              <w:bottom w:type="dxa" w:w="55"/>
+              <w:right w:type="dxa" w:w="95"/>
+            </w:tcMar>
+            <w:vAlign w:val="top"/>
+          </w:tcPr>
+          <w:p>
+            <w:pPr>
+              <w:spacing w:after="0"/>
+            </w:pPr>
+            <w:r>
+              <w:rPr>
+                <w:rFonts w:ascii="Calibri" w:cs="Calibri" w:eastAsia="Microsoft YaHei" w:hAnsi="Calibri"/>
+                <w:b/>
+                <w:bCs/>
+                <w:sz w:val="19"/>
+                <w:szCs w:val="19"/>
+              </w:rPr>
+              <w:t xml:space="preserve">改动（2026-10-19，分层）</w:t>
+            </w:r>
+          </w:p>
+        </w:tc>
+        <w:tc>
+          <w:tcPr>
+            <w:tcW w:type="dxa" w:w="7492"/>
+            <w:tcBorders>
+              <w:top w:val="single" w:color="BBBBBB" w:sz="4"/>
+              <w:left w:val="single" w:color="BBBBBB" w:sz="4"/>
+              <w:bottom w:val="single" w:color="BBBBBB" w:sz="4"/>
+              <w:right w:val="single" w:color="BBBBBB" w:sz="4"/>
+            </w:tcBorders>
+            <w:tcMar>
+              <w:top w:type="dxa" w:w="55"/>
+              <w:left w:type="dxa" w:w="95"/>
+              <w:bottom w:type="dxa" w:w="55"/>
+              <w:right w:type="dxa" w:w="95"/>
+            </w:tcMar>
+            <w:vAlign w:val="top"/>
+          </w:tcPr>
+          <w:p>
+            <w:pPr>
+              <w:spacing w:after="0"/>
+            </w:pPr>
+            <w:r>
+              <w:rPr>
+                <w:rFonts w:ascii="Calibri" w:cs="Calibri" w:eastAsia="Microsoft YaHei" w:hAnsi="Calibri"/>
+                <w:sz w:val="19"/>
+                <w:szCs w:val="19"/>
+              </w:rPr>
+              <w:t xml:space="preserve">10 篇校准的分层要求（中文 3、系列 3、时间写法四种各 1、只写“脾扭转”1、未手术 1）作者 2026 年 10 月 19 日确认，抽样等全文名单出来后再做。规则没有变</w:t>
             </w:r>
           </w:p>
         </w:tc>
@@ -20928,7 +20999,7 @@
         <w:rPr>
           <w:rFonts w:ascii="Calibri" w:cs="Calibri" w:eastAsia="Microsoft YaHei" w:hAnsi="Calibri"/>
         </w:rPr>
-        <w:t xml:space="preserve">）。要求至少包括：中文 3 篇、系列报告 3 篇、写法各异的时间（小时、周、范围、含糊说法各至少 1 篇）、只写"脾扭转"的 D1 类 1 篇、有未手术或未切除的 1 篇（这是 Claude 的建议）。中文、系列和 D1 用全文筛选记录里的值；</w:t>
+        <w:t xml:space="preserve">）。要求至少包括：中文 3 篇、系列报告 3 篇、写法各异的时间（小时、周、范围、含糊说法各至少 1 篇）、只写"脾扭转"的 D1 类 1 篇、有未手术或未切除的 1 篇（作者 2026 年 10 月 19 日确认这些分层要求）。中文、系列和 D1 用全文筛选记录里的值；</w:t>
       </w:r>
       <w:r>
         <w:rPr>
@@ -23344,7 +23415,7 @@
         <w:sz w:val="17"/>
         <w:szCs w:val="17"/>
       </w:rPr>
-      <w:t xml:space="preserve">提取操作说明 v2026-10-19e   |   第 </w:t>
+      <w:t xml:space="preserve">提取操作说明 v2026-10-19f   |   第 </w:t>
     </w:r>
     <w:r>
       <w:rPr>

</xml_diff>

<commit_message>
Extraction calibration: draw 10 reports (seed 20261019) from the final included list
Co-Authored-By: Claude Sonnet 5.5 <noreply@anthropic.com>
Claude-Session: https://claude.ai/code/session_01FRD7etKqYN8v2bbXeeLMRW
</commit_message>
<xml_diff>
--- a/Extraction guide - how to fill the extraction workbook (draft).docx
+++ b/Extraction guide - how to fill the extraction workbook (draft).docx
@@ -116,7 +116,7 @@
                 <w:sz w:val="19"/>
                 <w:szCs w:val="19"/>
               </w:rPr>
-              <w:t xml:space="preserve">提取操作说明 v2026-10-19f（草稿）。标 </w:t>
+              <w:t xml:space="preserve">提取操作说明 v2026-10-25a（草稿）。标 </w:t>
             </w:r>
             <w:r>
               <w:rPr>
@@ -457,7 +457,7 @@
                 <w:sz w:val="19"/>
                 <w:szCs w:val="19"/>
               </w:rPr>
-              <w:t xml:space="preserve">改动（2026-10-19，校准之后）</w:t>
+              <w:t xml:space="preserve">改动（2026-10-25，已抽样）</w:t>
             </w:r>
           </w:p>
         </w:tc>
@@ -488,7 +488,7 @@
                 <w:sz w:val="19"/>
                 <w:szCs w:val="19"/>
               </w:rPr>
-              <w:t xml:space="preserve">全文阶段 20 篇校准讨论后（作者转告）：</w:t>
+              <w:t xml:space="preserve">全文名单已确定（269 篇纳入，</w:t>
             </w:r>
             <w:r>
               <w:rPr>
@@ -497,15 +497,15 @@
                 <w:szCs w:val="19"/>
                 <w:shd w:fill="EEEEEE" w:val="clear"/>
               </w:rPr>
-              <w:t xml:space="preserve">ws_basis</w:t>
-            </w:r>
-            <w:r>
-              <w:rPr>
-                <w:rFonts w:ascii="Calibri" w:cs="Calibri" w:eastAsia="Microsoft YaHei" w:hAnsi="Calibri"/>
-                <w:sz w:val="19"/>
-                <w:szCs w:val="19"/>
-              </w:rPr>
-              <w:t xml:space="preserve"> 的 </w:t>
+              <w:t xml:space="preserve">fulltext_finalize</w:t>
+            </w:r>
+            <w:r>
+              <w:rPr>
+                <w:rFonts w:ascii="Calibri" w:cs="Calibri" w:eastAsia="Microsoft YaHei" w:hAnsi="Calibri"/>
+                <w:sz w:val="19"/>
+                <w:szCs w:val="19"/>
+              </w:rPr>
+              <w:t xml:space="preserve"> 2026 年 10 月 25 日的结果），10 篇校准按第 10 节第 1 步抽出，种子 20261019，结果在 </w:t>
             </w:r>
             <w:r>
               <w:rPr>
@@ -514,15 +514,15 @@
                 <w:szCs w:val="19"/>
                 <w:shd w:fill="EEEEEE" w:val="clear"/>
               </w:rPr>
-              <w:t xml:space="preserve">Imaging and operation</w:t>
-            </w:r>
-            <w:r>
-              <w:rPr>
-                <w:rFonts w:ascii="Calibri" w:cs="Calibri" w:eastAsia="Microsoft YaHei" w:hAnsi="Calibri"/>
-                <w:sz w:val="19"/>
-                <w:szCs w:val="19"/>
-              </w:rPr>
-              <w:t xml:space="preserve"> 只在影像和术中所见都写明脾异位或活动时才选（5.2 表）；逐例资料在线上附录里的报告，附录也要取到（2.2 清单）。没有改别的规则</w:t>
+              <w:t xml:space="preserve">search/extraction/calibration/</w:t>
+            </w:r>
+            <w:r>
+              <w:rPr>
+                <w:rFonts w:ascii="Calibri" w:cs="Calibri" w:eastAsia="Microsoft YaHei" w:hAnsi="Calibri"/>
+                <w:sz w:val="19"/>
+                <w:szCs w:val="19"/>
+              </w:rPr>
+              <w:t xml:space="preserve">。名单里中文 3、系列 3 达到要求；“范围”类时间写法按摘要关键词一篇也没有找到，没有硬凑（见第 10 节）。规则没有变</w:t>
             </w:r>
           </w:p>
         </w:tc>
@@ -562,7 +562,7 @@
                 <w:sz w:val="19"/>
                 <w:szCs w:val="19"/>
               </w:rPr>
-              <w:t xml:space="preserve">改动（2026-10-19）</w:t>
+              <w:t xml:space="preserve">改动（2026-10-19，校准之后）</w:t>
             </w:r>
           </w:p>
         </w:tc>
@@ -593,25 +593,7 @@
                 <w:sz w:val="19"/>
                 <w:szCs w:val="19"/>
               </w:rPr>
-              <w:t xml:space="preserve">提取阶段</w:t>
-            </w:r>
-            <w:r>
-              <w:rPr>
-                <w:rFonts w:ascii="Calibri" w:cs="Calibri" w:eastAsia="Microsoft YaHei" w:hAnsi="Calibri"/>
-                <w:b/>
-                <w:bCs/>
-                <w:sz w:val="19"/>
-                <w:szCs w:val="19"/>
-              </w:rPr>
-              <w:t xml:space="preserve">不保存时间记录</w:t>
-            </w:r>
-            <w:r>
-              <w:rPr>
-                <w:rFonts w:ascii="Calibri" w:cs="Calibri" w:eastAsia="Microsoft YaHei" w:hAnsi="Calibri"/>
-                <w:sz w:val="19"/>
-                <w:szCs w:val="19"/>
-              </w:rPr>
-              <w:t xml:space="preserve">：作者 2026 年 10 月 19 日决定删除提取工作簿里的 EX_time_log 表（提取尚未开始）。理由作者没有说明，文件里不写理由。协议 v1.6 对提取阶段没有时间记录的规定，所以协议不用改；脚本 </w:t>
+              <w:t xml:space="preserve">全文阶段 20 篇校准讨论后（作者转告）：</w:t>
             </w:r>
             <w:r>
               <w:rPr>
@@ -620,15 +602,32 @@
                 <w:szCs w:val="19"/>
                 <w:shd w:fill="EEEEEE" w:val="clear"/>
               </w:rPr>
-              <w:t xml:space="preserve">compare_extraction.py</w:t>
-            </w:r>
-            <w:r>
-              <w:rPr>
-                <w:rFonts w:ascii="Calibri" w:cs="Calibri" w:eastAsia="Microsoft YaHei" w:hAnsi="Calibri"/>
-                <w:sz w:val="19"/>
-                <w:szCs w:val="19"/>
-              </w:rPr>
-              <w:t xml:space="preserve"> 也不再检查用时。本说明里提到时间记录的四处（目录里第 2 章的说明、第 1 节第 4 步及随后的步骤编号、2.2 清单、第 10 节）已删或改，版本号随之更新，其余内容没有变</w:t>
+              <w:t xml:space="preserve">ws_basis</w:t>
+            </w:r>
+            <w:r>
+              <w:rPr>
+                <w:rFonts w:ascii="Calibri" w:cs="Calibri" w:eastAsia="Microsoft YaHei" w:hAnsi="Calibri"/>
+                <w:sz w:val="19"/>
+                <w:szCs w:val="19"/>
+              </w:rPr>
+              <w:t xml:space="preserve"> 的 </w:t>
+            </w:r>
+            <w:r>
+              <w:rPr>
+                <w:rFonts w:ascii="Consolas" w:cs="Consolas" w:eastAsia="Microsoft YaHei" w:hAnsi="Consolas"/>
+                <w:sz w:val="19"/>
+                <w:szCs w:val="19"/>
+                <w:shd w:fill="EEEEEE" w:val="clear"/>
+              </w:rPr>
+              <w:t xml:space="preserve">Imaging and operation</w:t>
+            </w:r>
+            <w:r>
+              <w:rPr>
+                <w:rFonts w:ascii="Calibri" w:cs="Calibri" w:eastAsia="Microsoft YaHei" w:hAnsi="Calibri"/>
+                <w:sz w:val="19"/>
+                <w:szCs w:val="19"/>
+              </w:rPr>
+              <w:t xml:space="preserve"> 只在影像和术中所见都写明脾异位或活动时才选（5.2 表）；逐例资料在线上附录里的报告，附录也要取到（2.2 清单）。没有改别的规则</w:t>
             </w:r>
           </w:p>
         </w:tc>
@@ -668,7 +667,7 @@
                 <w:sz w:val="19"/>
                 <w:szCs w:val="19"/>
               </w:rPr>
-              <w:t xml:space="preserve">项目</w:t>
+              <w:t xml:space="preserve">改动（2026-10-19）</w:t>
             </w:r>
           </w:p>
         </w:tc>
@@ -699,7 +698,42 @@
                 <w:sz w:val="19"/>
                 <w:szCs w:val="19"/>
               </w:rPr>
-              <w:t xml:space="preserve">儿童游走脾系统综述（含个体患者数据）和单中心病例系列；PROSPERO CRD420261520329；协议 v1.5</w:t>
+              <w:t xml:space="preserve">提取阶段</w:t>
+            </w:r>
+            <w:r>
+              <w:rPr>
+                <w:rFonts w:ascii="Calibri" w:cs="Calibri" w:eastAsia="Microsoft YaHei" w:hAnsi="Calibri"/>
+                <w:b/>
+                <w:bCs/>
+                <w:sz w:val="19"/>
+                <w:szCs w:val="19"/>
+              </w:rPr>
+              <w:t xml:space="preserve">不保存时间记录</w:t>
+            </w:r>
+            <w:r>
+              <w:rPr>
+                <w:rFonts w:ascii="Calibri" w:cs="Calibri" w:eastAsia="Microsoft YaHei" w:hAnsi="Calibri"/>
+                <w:sz w:val="19"/>
+                <w:szCs w:val="19"/>
+              </w:rPr>
+              <w:t xml:space="preserve">：作者 2026 年 10 月 19 日决定删除提取工作簿里的 EX_time_log 表（提取尚未开始）。理由作者没有说明，文件里不写理由。协议 v1.6 对提取阶段没有时间记录的规定，所以协议不用改；脚本 </w:t>
+            </w:r>
+            <w:r>
+              <w:rPr>
+                <w:rFonts w:ascii="Consolas" w:cs="Consolas" w:eastAsia="Microsoft YaHei" w:hAnsi="Consolas"/>
+                <w:sz w:val="19"/>
+                <w:szCs w:val="19"/>
+                <w:shd w:fill="EEEEEE" w:val="clear"/>
+              </w:rPr>
+              <w:t xml:space="preserve">compare_extraction.py</w:t>
+            </w:r>
+            <w:r>
+              <w:rPr>
+                <w:rFonts w:ascii="Calibri" w:cs="Calibri" w:eastAsia="Microsoft YaHei" w:hAnsi="Calibri"/>
+                <w:sz w:val="19"/>
+                <w:szCs w:val="19"/>
+              </w:rPr>
+              <w:t xml:space="preserve"> 也不再检查用时。本说明里提到时间记录的四处（目录里第 2 章的说明、第 1 节第 4 步及随后的步骤编号、2.2 清单、第 10 节）已删或改，版本号随之更新，其余内容没有变</w:t>
             </w:r>
           </w:p>
         </w:tc>
@@ -739,7 +773,7 @@
                 <w:sz w:val="19"/>
                 <w:szCs w:val="19"/>
               </w:rPr>
-              <w:t xml:space="preserve">适用对象</w:t>
+              <w:t xml:space="preserve">项目</w:t>
             </w:r>
           </w:p>
         </w:tc>
@@ -770,7 +804,7 @@
                 <w:sz w:val="19"/>
                 <w:szCs w:val="19"/>
               </w:rPr>
-              <w:t xml:space="preserve">舒俊（提取员 E1）、卞红强（提取员 E2）、杨俊（分歧仲裁）。Ji Wang 核查两份提取表，不提取。分工是作者 2026 年 10 月 18 日决定的；作者转告卞红强和杨俊已知道并同意（方式和日期没有说明）</w:t>
+              <w:t xml:space="preserve">儿童游走脾系统综述（含个体患者数据）和单中心病例系列；PROSPERO CRD420261520329；协议 v1.5</w:t>
             </w:r>
           </w:p>
         </w:tc>
@@ -810,7 +844,7 @@
                 <w:sz w:val="19"/>
                 <w:szCs w:val="19"/>
               </w:rPr>
-              <w:t xml:space="preserve">配套文件</w:t>
+              <w:t xml:space="preserve">适用对象</w:t>
             </w:r>
           </w:p>
         </w:tc>
@@ -841,16 +875,7 @@
                 <w:sz w:val="19"/>
                 <w:szCs w:val="19"/>
               </w:rPr>
-              <w:t xml:space="preserve">协议 v1.5 附录 C（提取表和 9 条时间换算规则）；《提取工作簿》v2026-10-19e；比对脚本 </w:t>
-            </w:r>
-            <w:r>
-              <w:rPr>
-                <w:rFonts w:ascii="Consolas" w:cs="Consolas" w:eastAsia="Microsoft YaHei" w:hAnsi="Consolas"/>
-                <w:sz w:val="19"/>
-                <w:szCs w:val="19"/>
-                <w:shd w:fill="EEEEEE" w:val="clear"/>
-              </w:rPr>
-              <w:t xml:space="preserve">tools/compare_extraction.py</w:t>
+              <w:t xml:space="preserve">舒俊（提取员 E1）、卞红强（提取员 E2）、杨俊（分歧仲裁）。Ji Wang 核查两份提取表，不提取。分工是作者 2026 年 10 月 18 日决定的；作者转告卞红强和杨俊已知道并同意（方式和日期没有说明）</w:t>
             </w:r>
           </w:p>
         </w:tc>
@@ -890,6 +915,86 @@
                 <w:sz w:val="19"/>
                 <w:szCs w:val="19"/>
               </w:rPr>
+              <w:t xml:space="preserve">配套文件</w:t>
+            </w:r>
+          </w:p>
+        </w:tc>
+        <w:tc>
+          <w:tcPr>
+            <w:tcW w:type="dxa" w:w="7492"/>
+            <w:tcBorders>
+              <w:top w:val="single" w:color="BBBBBB" w:sz="4"/>
+              <w:left w:val="single" w:color="BBBBBB" w:sz="4"/>
+              <w:bottom w:val="single" w:color="BBBBBB" w:sz="4"/>
+              <w:right w:val="single" w:color="BBBBBB" w:sz="4"/>
+            </w:tcBorders>
+            <w:tcMar>
+              <w:top w:type="dxa" w:w="55"/>
+              <w:left w:type="dxa" w:w="95"/>
+              <w:bottom w:type="dxa" w:w="55"/>
+              <w:right w:type="dxa" w:w="95"/>
+            </w:tcMar>
+            <w:vAlign w:val="top"/>
+          </w:tcPr>
+          <w:p>
+            <w:pPr>
+              <w:spacing w:after="0"/>
+            </w:pPr>
+            <w:r>
+              <w:rPr>
+                <w:rFonts w:ascii="Calibri" w:cs="Calibri" w:eastAsia="Microsoft YaHei" w:hAnsi="Calibri"/>
+                <w:sz w:val="19"/>
+                <w:szCs w:val="19"/>
+              </w:rPr>
+              <w:t xml:space="preserve">协议 v1.5 附录 C（提取表和 9 条时间换算规则）；《提取工作簿》v2026-10-19e；比对脚本 </w:t>
+            </w:r>
+            <w:r>
+              <w:rPr>
+                <w:rFonts w:ascii="Consolas" w:cs="Consolas" w:eastAsia="Microsoft YaHei" w:hAnsi="Consolas"/>
+                <w:sz w:val="19"/>
+                <w:szCs w:val="19"/>
+                <w:shd w:fill="EEEEEE" w:val="clear"/>
+              </w:rPr>
+              <w:t xml:space="preserve">tools/compare_extraction.py</w:t>
+            </w:r>
+          </w:p>
+        </w:tc>
+      </w:tr>
+      <w:tr>
+        <w:trPr>
+          <w:cantSplit/>
+          <w:tblHeader w:val="false"/>
+        </w:trPr>
+        <w:tc>
+          <w:tcPr>
+            <w:tcW w:type="dxa" w:w="1534"/>
+            <w:tcBorders>
+              <w:top w:val="single" w:color="BBBBBB" w:sz="4"/>
+              <w:left w:val="single" w:color="BBBBBB" w:sz="4"/>
+              <w:bottom w:val="single" w:color="BBBBBB" w:sz="4"/>
+              <w:right w:val="single" w:color="BBBBBB" w:sz="4"/>
+            </w:tcBorders>
+            <w:shd w:fill="F2F5F9" w:val="clear"/>
+            <w:tcMar>
+              <w:top w:type="dxa" w:w="55"/>
+              <w:left w:type="dxa" w:w="95"/>
+              <w:bottom w:type="dxa" w:w="55"/>
+              <w:right w:type="dxa" w:w="95"/>
+            </w:tcMar>
+            <w:vAlign w:val="top"/>
+          </w:tcPr>
+          <w:p>
+            <w:pPr>
+              <w:spacing w:after="0"/>
+            </w:pPr>
+            <w:r>
+              <w:rPr>
+                <w:rFonts w:ascii="Calibri" w:cs="Calibri" w:eastAsia="Microsoft YaHei" w:hAnsi="Calibri"/>
+                <w:b/>
+                <w:bCs/>
+                <w:sz w:val="19"/>
+                <w:szCs w:val="19"/>
+              </w:rPr>
               <w:t xml:space="preserve">要提取的报告</w:t>
             </w:r>
           </w:p>
@@ -955,7 +1060,7 @@
                 <w:sz w:val="19"/>
                 <w:szCs w:val="19"/>
               </w:rPr>
-              <w:t xml:space="preserve">）。数量要等全文阶段结束才知道</w:t>
+              <w:t xml:space="preserve">）。2026 年 10 月 25 日 finalize 的结果是 269 篇（待 IPD 的 5 篇不在内）</w:t>
             </w:r>
           </w:p>
         </w:tc>
@@ -20964,7 +21069,7 @@
           <w:b/>
           <w:bCs/>
         </w:rPr>
-        <w:t xml:space="preserve">种子 20261019 是 2026 年 10 月 19 日定的，早于任何全文决定，抽样结果因此不会受筛选结果的影响；名单还没有，所以现在不能抽。</w:t>
+        <w:t xml:space="preserve">种子 20261019 是 2026 年 10 月 19 日定的，早于任何全文决定，抽样结果因此不会受筛选结果的影响；名单已于 2026 年 10 月 25 日确定（269 篇），当天抽出了 10 篇。</w:t>
       </w:r>
       <w:r>
         <w:rPr>
@@ -21013,7 +21118,7 @@
         <w:rPr>
           <w:rFonts w:ascii="Calibri" w:cs="Calibri" w:eastAsia="Microsoft YaHei" w:hAnsi="Calibri"/>
         </w:rPr>
-        <w:t xml:space="preserve">；哪一层凑不够，脚本在设计文件里写明，不硬凑。本院 5 例（OWN）另外提取，不在这 10 篇里。给提取员的只有 </w:t>
+        <w:t xml:space="preserve">；哪一层凑不够，脚本在设计文件里写明，不硬凑；这次“范围”一层在候选里按摘要关键词一篇也没有，所以没有凑够。本院 5 例（OWN）另外提取，不在这 10 篇里。给提取员的只有 </w:t>
       </w:r>
       <w:r>
         <w:rPr>
@@ -23415,7 +23520,7 @@
         <w:sz w:val="17"/>
         <w:szCs w:val="17"/>
       </w:rPr>
-      <w:t xml:space="preserve">提取操作说明 v2026-10-19f   |   第 </w:t>
+      <w:t xml:space="preserve">提取操作说明 v2026-10-25a   |   第 </w:t>
     </w:r>
     <w:r>
       <w:rPr>

</xml_diff>

<commit_message>
Extraction calibration: prefilled E1/E2 starter workbooks and generator; guide v2026-10-25b
Co-Authored-By: Claude Sonnet 5.5 <noreply@anthropic.com>
Claude-Session: https://claude.ai/code/session_01FRD7etKqYN8v2bbXeeLMRW
</commit_message>
<xml_diff>
--- a/Extraction guide - how to fill the extraction workbook (draft).docx
+++ b/Extraction guide - how to fill the extraction workbook (draft).docx
@@ -116,7 +116,7 @@
                 <w:sz w:val="19"/>
                 <w:szCs w:val="19"/>
               </w:rPr>
-              <w:t xml:space="preserve">提取操作说明 v2026-10-25a（草稿）。标 </w:t>
+              <w:t xml:space="preserve">提取操作说明 v2026-10-25b（草稿）。标 </w:t>
             </w:r>
             <w:r>
               <w:rPr>
@@ -418,6 +418,145 @@
                 <w:szCs w:val="19"/>
               </w:rPr>
               <w:t xml:space="preserve">。其他规则没有变</w:t>
+            </w:r>
+          </w:p>
+        </w:tc>
+      </w:tr>
+      <w:tr>
+        <w:trPr>
+          <w:cantSplit/>
+          <w:tblHeader w:val="false"/>
+        </w:trPr>
+        <w:tc>
+          <w:tcPr>
+            <w:tcW w:type="dxa" w:w="1534"/>
+            <w:tcBorders>
+              <w:top w:val="single" w:color="BBBBBB" w:sz="4"/>
+              <w:left w:val="single" w:color="BBBBBB" w:sz="4"/>
+              <w:bottom w:val="single" w:color="BBBBBB" w:sz="4"/>
+              <w:right w:val="single" w:color="BBBBBB" w:sz="4"/>
+            </w:tcBorders>
+            <w:shd w:fill="F2F5F9" w:val="clear"/>
+            <w:tcMar>
+              <w:top w:type="dxa" w:w="55"/>
+              <w:left w:type="dxa" w:w="95"/>
+              <w:bottom w:type="dxa" w:w="55"/>
+              <w:right w:type="dxa" w:w="95"/>
+            </w:tcMar>
+            <w:vAlign w:val="top"/>
+          </w:tcPr>
+          <w:p>
+            <w:pPr>
+              <w:spacing w:after="0"/>
+            </w:pPr>
+            <w:r>
+              <w:rPr>
+                <w:rFonts w:ascii="Calibri" w:cs="Calibri" w:eastAsia="Microsoft YaHei" w:hAnsi="Calibri"/>
+                <w:b/>
+                <w:bCs/>
+                <w:sz w:val="19"/>
+                <w:szCs w:val="19"/>
+              </w:rPr>
+              <w:t xml:space="preserve">改动（2026-10-25，起始表）</w:t>
+            </w:r>
+          </w:p>
+        </w:tc>
+        <w:tc>
+          <w:tcPr>
+            <w:tcW w:type="dxa" w:w="7492"/>
+            <w:tcBorders>
+              <w:top w:val="single" w:color="BBBBBB" w:sz="4"/>
+              <w:left w:val="single" w:color="BBBBBB" w:sz="4"/>
+              <w:bottom w:val="single" w:color="BBBBBB" w:sz="4"/>
+              <w:right w:val="single" w:color="BBBBBB" w:sz="4"/>
+            </w:tcBorders>
+            <w:tcMar>
+              <w:top w:type="dxa" w:w="55"/>
+              <w:left w:type="dxa" w:w="95"/>
+              <w:bottom w:type="dxa" w:w="55"/>
+              <w:right w:type="dxa" w:w="95"/>
+            </w:tcMar>
+            <w:vAlign w:val="top"/>
+          </w:tcPr>
+          <w:p>
+            <w:pPr>
+              <w:spacing w:after="0"/>
+            </w:pPr>
+            <w:r>
+              <w:rPr>
+                <w:rFonts w:ascii="Calibri" w:cs="Calibri" w:eastAsia="Microsoft YaHei" w:hAnsi="Calibri"/>
+                <w:sz w:val="19"/>
+                <w:szCs w:val="19"/>
+              </w:rPr>
+              <w:t xml:space="preserve">10 篇校准有现成的起始表：</w:t>
+            </w:r>
+            <w:r>
+              <w:rPr>
+                <w:rFonts w:ascii="Consolas" w:cs="Consolas" w:eastAsia="Microsoft YaHei" w:hAnsi="Consolas"/>
+                <w:sz w:val="19"/>
+                <w:szCs w:val="19"/>
+                <w:shd w:fill="EEEEEE" w:val="clear"/>
+              </w:rPr>
+              <w:t xml:space="preserve">extraction_E1_calibration_starter.xlsx</w:t>
+            </w:r>
+            <w:r>
+              <w:rPr>
+                <w:rFonts w:ascii="Calibri" w:cs="Calibri" w:eastAsia="Microsoft YaHei" w:hAnsi="Calibri"/>
+                <w:sz w:val="19"/>
+                <w:szCs w:val="19"/>
+              </w:rPr>
+              <w:t xml:space="preserve">、</w:t>
+            </w:r>
+            <w:r>
+              <w:rPr>
+                <w:rFonts w:ascii="Consolas" w:cs="Consolas" w:eastAsia="Microsoft YaHei" w:hAnsi="Consolas"/>
+                <w:sz w:val="19"/>
+                <w:szCs w:val="19"/>
+                <w:shd w:fill="EEEEEE" w:val="clear"/>
+              </w:rPr>
+              <w:t xml:space="preserve">extraction_E2_calibration_starter.xlsx</w:t>
+            </w:r>
+            <w:r>
+              <w:rPr>
+                <w:rFonts w:ascii="Calibri" w:cs="Calibri" w:eastAsia="Microsoft YaHei" w:hAnsi="Calibri"/>
+                <w:sz w:val="19"/>
+                <w:szCs w:val="19"/>
+              </w:rPr>
+              <w:t xml:space="preserve">（</w:t>
+            </w:r>
+            <w:r>
+              <w:rPr>
+                <w:rFonts w:ascii="Consolas" w:cs="Consolas" w:eastAsia="Microsoft YaHei" w:hAnsi="Consolas"/>
+                <w:sz w:val="19"/>
+                <w:szCs w:val="19"/>
+                <w:shd w:fill="EEEEEE" w:val="clear"/>
+              </w:rPr>
+              <w:t xml:space="preserve">search/extraction/calibration/</w:t>
+            </w:r>
+            <w:r>
+              <w:rPr>
+                <w:rFonts w:ascii="Calibri" w:cs="Calibri" w:eastAsia="Microsoft YaHei" w:hAnsi="Calibri"/>
+                <w:sz w:val="19"/>
+                <w:szCs w:val="19"/>
+              </w:rPr>
+              <w:t xml:space="preserve">，生成脚本 </w:t>
+            </w:r>
+            <w:r>
+              <w:rPr>
+                <w:rFonts w:ascii="Consolas" w:cs="Consolas" w:eastAsia="Microsoft YaHei" w:hAnsi="Consolas"/>
+                <w:sz w:val="19"/>
+                <w:szCs w:val="19"/>
+                <w:shd w:fill="EEEEEE" w:val="clear"/>
+              </w:rPr>
+              <w:t xml:space="preserve">tools/make_calibration_starters.py</w:t>
+            </w:r>
+            <w:r>
+              <w:rPr>
+                <w:rFonts w:ascii="Calibri" w:cs="Calibri" w:eastAsia="Microsoft YaHei" w:hAnsi="Calibri"/>
+                <w:sz w:val="19"/>
+                <w:szCs w:val="19"/>
+              </w:rPr>
+              <w:t xml:space="preserve">）。表里只预填了 10 个 WS 编号和提取员代码，另有一张 Calibration_list（编号、标题、DOI、链接）；Patients 表是空的。只是省去手工填编号，规则没有变</w:t>
             </w:r>
           </w:p>
         </w:tc>
@@ -3240,7 +3379,24 @@
                 <w:sz w:val="19"/>
                 <w:szCs w:val="19"/>
               </w:rPr>
-              <w:t xml:space="preserve"> 另存。</w:t>
+              <w:t xml:space="preserve"> 另存（做 10 篇校准时，从起始表 </w:t>
+            </w:r>
+            <w:r>
+              <w:rPr>
+                <w:rFonts w:ascii="Consolas" w:cs="Consolas" w:eastAsia="Microsoft YaHei" w:hAnsi="Consolas"/>
+                <w:sz w:val="19"/>
+                <w:szCs w:val="19"/>
+                <w:shd w:fill="EEEEEE" w:val="clear"/>
+              </w:rPr>
+              <w:t xml:space="preserve">extraction_E?_calibration_starter.xlsx</w:t>
+            </w:r>
+            <w:r>
+              <w:rPr>
+                <w:rFonts w:ascii="Calibri" w:cs="Calibri" w:eastAsia="Microsoft YaHei" w:hAnsi="Calibri"/>
+                <w:sz w:val="19"/>
+                <w:szCs w:val="19"/>
+              </w:rPr>
+              <w:t xml:space="preserve"> 另存也可以，结构相同）。</w:t>
             </w:r>
             <w:r>
               <w:rPr>
@@ -23520,7 +23676,7 @@
         <w:sz w:val="17"/>
         <w:szCs w:val="17"/>
       </w:rPr>
-      <w:t xml:space="preserve">提取操作说明 v2026-10-25a   |   第 </w:t>
+      <w:t xml:space="preserve">提取操作说明 v2026-10-25b   |   第 </w:t>
     </w:r>
     <w:r>
       <w:rPr>

</xml_diff>

<commit_message>
Extraction workbook: add NR to presentation (template v2026-10-25a, guide v2026-10-25c); log author's answers
Co-Authored-By: Claude Sonnet 5.5 <noreply@anthropic.com>
Claude-Session: https://claude.ai/code/session_01FRD7etKqYN8v2bbXeeLMRW
</commit_message>
<xml_diff>
--- a/Extraction guide - how to fill the extraction workbook (draft).docx
+++ b/Extraction guide - how to fill the extraction workbook (draft).docx
@@ -116,7 +116,7 @@
                 <w:sz w:val="19"/>
                 <w:szCs w:val="19"/>
               </w:rPr>
-              <w:t xml:space="preserve">提取操作说明 v2026-10-25b（草稿）。标 </w:t>
+              <w:t xml:space="preserve">提取操作说明 v2026-10-25c（草稿）。标 </w:t>
             </w:r>
             <w:r>
               <w:rPr>
@@ -457,7 +457,7 @@
                 <w:sz w:val="19"/>
                 <w:szCs w:val="19"/>
               </w:rPr>
-              <w:t xml:space="preserve">改动（2026-10-25，起始表）</w:t>
+              <w:t xml:space="preserve">改动（2026-10-25，presentation 加 NR）</w:t>
             </w:r>
           </w:p>
         </w:tc>
@@ -488,7 +488,7 @@
                 <w:sz w:val="19"/>
                 <w:szCs w:val="19"/>
               </w:rPr>
-              <w:t xml:space="preserve">10 篇校准有现成的起始表：</w:t>
+              <w:t xml:space="preserve">10 篇校准的两份返回文件做格式检查时，</w:t>
             </w:r>
             <w:r>
               <w:rPr>
@@ -497,15 +497,15 @@
                 <w:szCs w:val="19"/>
                 <w:shd w:fill="EEEEEE" w:val="clear"/>
               </w:rPr>
-              <w:t xml:space="preserve">extraction_E1_calibration_starter.xlsx</w:t>
-            </w:r>
-            <w:r>
-              <w:rPr>
-                <w:rFonts w:ascii="Calibri" w:cs="Calibri" w:eastAsia="Microsoft YaHei" w:hAnsi="Calibri"/>
-                <w:sz w:val="19"/>
-                <w:szCs w:val="19"/>
-              </w:rPr>
-              <w:t xml:space="preserve">、</w:t>
+              <w:t xml:space="preserve">presentation</w:t>
+            </w:r>
+            <w:r>
+              <w:rPr>
+                <w:rFonts w:ascii="Calibri" w:cs="Calibri" w:eastAsia="Microsoft YaHei" w:hAnsi="Calibri"/>
+                <w:sz w:val="19"/>
+                <w:szCs w:val="19"/>
+              </w:rPr>
+              <w:t xml:space="preserve"> 列没有 </w:t>
             </w:r>
             <w:r>
               <w:rPr>
@@ -514,15 +514,15 @@
                 <w:szCs w:val="19"/>
                 <w:shd w:fill="EEEEEE" w:val="clear"/>
               </w:rPr>
-              <w:t xml:space="preserve">extraction_E2_calibration_starter.xlsx</w:t>
-            </w:r>
-            <w:r>
-              <w:rPr>
-                <w:rFonts w:ascii="Calibri" w:cs="Calibri" w:eastAsia="Microsoft YaHei" w:hAnsi="Calibri"/>
-                <w:sz w:val="19"/>
-                <w:szCs w:val="19"/>
-              </w:rPr>
-              <w:t xml:space="preserve">（</w:t>
+              <w:t xml:space="preserve">NR</w:t>
+            </w:r>
+            <w:r>
+              <w:rPr>
+                <w:rFonts w:ascii="Calibri" w:cs="Calibri" w:eastAsia="Microsoft YaHei" w:hAnsi="Calibri"/>
+                <w:sz w:val="19"/>
+                <w:szCs w:val="19"/>
+              </w:rPr>
+              <w:t xml:space="preserve"> 选项，E2 在一篇报告里填了 </w:t>
             </w:r>
             <w:r>
               <w:rPr>
@@ -531,15 +531,15 @@
                 <w:szCs w:val="19"/>
                 <w:shd w:fill="EEEEEE" w:val="clear"/>
               </w:rPr>
-              <w:t xml:space="preserve">search/extraction/calibration/</w:t>
-            </w:r>
-            <w:r>
-              <w:rPr>
-                <w:rFonts w:ascii="Calibri" w:cs="Calibri" w:eastAsia="Microsoft YaHei" w:hAnsi="Calibri"/>
-                <w:sz w:val="19"/>
-                <w:szCs w:val="19"/>
-              </w:rPr>
-              <w:t xml:space="preserve">，生成脚本 </w:t>
+              <w:t xml:space="preserve">NR</w:t>
+            </w:r>
+            <w:r>
+              <w:rPr>
+                <w:rFonts w:ascii="Calibri" w:cs="Calibri" w:eastAsia="Microsoft YaHei" w:hAnsi="Calibri"/>
+                <w:sz w:val="19"/>
+                <w:szCs w:val="19"/>
+              </w:rPr>
+              <w:t xml:space="preserve">（7 行报错）。作者 2026 年 10 月 25 日同意给 </w:t>
             </w:r>
             <w:r>
               <w:rPr>
@@ -548,15 +548,83 @@
                 <w:szCs w:val="19"/>
                 <w:shd w:fill="EEEEEE" w:val="clear"/>
               </w:rPr>
-              <w:t xml:space="preserve">tools/make_calibration_starters.py</w:t>
-            </w:r>
-            <w:r>
-              <w:rPr>
-                <w:rFonts w:ascii="Calibri" w:cs="Calibri" w:eastAsia="Microsoft YaHei" w:hAnsi="Calibri"/>
-                <w:sz w:val="19"/>
-                <w:szCs w:val="19"/>
-              </w:rPr>
-              <w:t xml:space="preserve">）。表里只预填了 10 个 WS 编号和提取员代码，另有一张 Calibration_list（编号、标题、DOI、链接）；Patients 表是空的。只是省去手工填编号，规则没有变</w:t>
+              <w:t xml:space="preserve">presentation</w:t>
+            </w:r>
+            <w:r>
+              <w:rPr>
+                <w:rFonts w:ascii="Calibri" w:cs="Calibri" w:eastAsia="Microsoft YaHei" w:hAnsi="Calibri"/>
+                <w:sz w:val="19"/>
+                <w:szCs w:val="19"/>
+              </w:rPr>
+              <w:t xml:space="preserve"> 加一个值 </w:t>
+            </w:r>
+            <w:r>
+              <w:rPr>
+                <w:rFonts w:ascii="Consolas" w:cs="Consolas" w:eastAsia="Microsoft YaHei" w:hAnsi="Consolas"/>
+                <w:sz w:val="19"/>
+                <w:szCs w:val="19"/>
+                <w:shd w:fill="EEEEEE" w:val="clear"/>
+              </w:rPr>
+              <w:t xml:space="preserve">NR</w:t>
+            </w:r>
+            <w:r>
+              <w:rPr>
+                <w:rFonts w:ascii="Calibri" w:cs="Calibri" w:eastAsia="Microsoft YaHei" w:hAnsi="Calibri"/>
+                <w:sz w:val="19"/>
+                <w:szCs w:val="19"/>
+              </w:rPr>
+              <w:t xml:space="preserve">：报告没有写发作形式时填 </w:t>
+            </w:r>
+            <w:r>
+              <w:rPr>
+                <w:rFonts w:ascii="Consolas" w:cs="Consolas" w:eastAsia="Microsoft YaHei" w:hAnsi="Consolas"/>
+                <w:sz w:val="19"/>
+                <w:szCs w:val="19"/>
+                <w:shd w:fill="EEEEEE" w:val="clear"/>
+              </w:rPr>
+              <w:t xml:space="preserve">NR</w:t>
+            </w:r>
+            <w:r>
+              <w:rPr>
+                <w:rFonts w:ascii="Calibri" w:cs="Calibri" w:eastAsia="Microsoft YaHei" w:hAnsi="Calibri"/>
+                <w:sz w:val="19"/>
+                <w:szCs w:val="19"/>
+              </w:rPr>
+              <w:t xml:space="preserve">，不要在五个值里硬选（5.3 表、X11）。模板升到 v2026-10-25a。这是工作簿的填写约定，不改任何纳入标准或变量定义；协议附录 C 列的是五个值，</w:t>
+            </w:r>
+            <w:r>
+              <w:rPr>
+                <w:rFonts w:ascii="Consolas" w:cs="Consolas" w:eastAsia="Microsoft YaHei" w:hAnsi="Consolas"/>
+                <w:sz w:val="19"/>
+                <w:szCs w:val="19"/>
+                <w:shd w:fill="EEEEEE" w:val="clear"/>
+              </w:rPr>
+              <w:t xml:space="preserve">NR</w:t>
+            </w:r>
+            <w:r>
+              <w:rPr>
+                <w:rFonts w:ascii="Calibri" w:cs="Calibri" w:eastAsia="Microsoft YaHei" w:hAnsi="Calibri"/>
+                <w:sz w:val="19"/>
+                <w:szCs w:val="19"/>
+              </w:rPr>
+              <w:t xml:space="preserve"> 与其他列的 </w:t>
+            </w:r>
+            <w:r>
+              <w:rPr>
+                <w:rFonts w:ascii="Consolas" w:cs="Consolas" w:eastAsia="Microsoft YaHei" w:hAnsi="Consolas"/>
+                <w:sz w:val="19"/>
+                <w:szCs w:val="19"/>
+                <w:shd w:fill="EEEEEE" w:val="clear"/>
+              </w:rPr>
+              <w:t xml:space="preserve">NR</w:t>
+            </w:r>
+            <w:r>
+              <w:rPr>
+                <w:rFonts w:ascii="Calibri" w:cs="Calibri" w:eastAsia="Microsoft YaHei" w:hAnsi="Calibri"/>
+                <w:sz w:val="19"/>
+                <w:szCs w:val="19"/>
+              </w:rPr>
+              <w:t xml:space="preserve"> 一样是补充值。杨俊和卞红强是否知道这一条没有说明。</w:t>
             </w:r>
           </w:p>
         </w:tc>
@@ -596,7 +664,7 @@
                 <w:sz w:val="19"/>
                 <w:szCs w:val="19"/>
               </w:rPr>
-              <w:t xml:space="preserve">改动（2026-10-25，已抽样）</w:t>
+              <w:t xml:space="preserve">改动（2026-10-25，起始表）</w:t>
             </w:r>
           </w:p>
         </w:tc>
@@ -627,7 +695,7 @@
                 <w:sz w:val="19"/>
                 <w:szCs w:val="19"/>
               </w:rPr>
-              <w:t xml:space="preserve">全文名单已确定（269 篇纳入，</w:t>
+              <w:t xml:space="preserve">10 篇校准有现成的起始表：</w:t>
             </w:r>
             <w:r>
               <w:rPr>
@@ -636,15 +704,15 @@
                 <w:szCs w:val="19"/>
                 <w:shd w:fill="EEEEEE" w:val="clear"/>
               </w:rPr>
-              <w:t xml:space="preserve">fulltext_finalize</w:t>
-            </w:r>
-            <w:r>
-              <w:rPr>
-                <w:rFonts w:ascii="Calibri" w:cs="Calibri" w:eastAsia="Microsoft YaHei" w:hAnsi="Calibri"/>
-                <w:sz w:val="19"/>
-                <w:szCs w:val="19"/>
-              </w:rPr>
-              <w:t xml:space="preserve"> 2026 年 10 月 25 日的结果），10 篇校准按第 10 节第 1 步抽出，种子 20261019，结果在 </w:t>
+              <w:t xml:space="preserve">extraction_E1_calibration_starter.xlsx</w:t>
+            </w:r>
+            <w:r>
+              <w:rPr>
+                <w:rFonts w:ascii="Calibri" w:cs="Calibri" w:eastAsia="Microsoft YaHei" w:hAnsi="Calibri"/>
+                <w:sz w:val="19"/>
+                <w:szCs w:val="19"/>
+              </w:rPr>
+              <w:t xml:space="preserve">、</w:t>
             </w:r>
             <w:r>
               <w:rPr>
@@ -653,6 +721,23 @@
                 <w:szCs w:val="19"/>
                 <w:shd w:fill="EEEEEE" w:val="clear"/>
               </w:rPr>
+              <w:t xml:space="preserve">extraction_E2_calibration_starter.xlsx</w:t>
+            </w:r>
+            <w:r>
+              <w:rPr>
+                <w:rFonts w:ascii="Calibri" w:cs="Calibri" w:eastAsia="Microsoft YaHei" w:hAnsi="Calibri"/>
+                <w:sz w:val="19"/>
+                <w:szCs w:val="19"/>
+              </w:rPr>
+              <w:t xml:space="preserve">（</w:t>
+            </w:r>
+            <w:r>
+              <w:rPr>
+                <w:rFonts w:ascii="Consolas" w:cs="Consolas" w:eastAsia="Microsoft YaHei" w:hAnsi="Consolas"/>
+                <w:sz w:val="19"/>
+                <w:szCs w:val="19"/>
+                <w:shd w:fill="EEEEEE" w:val="clear"/>
+              </w:rPr>
               <w:t xml:space="preserve">search/extraction/calibration/</w:t>
             </w:r>
             <w:r>
@@ -661,7 +746,24 @@
                 <w:sz w:val="19"/>
                 <w:szCs w:val="19"/>
               </w:rPr>
-              <w:t xml:space="preserve">。名单里中文 3、系列 3 达到要求；“范围”类时间写法按摘要关键词一篇也没有找到，没有硬凑（见第 10 节）。规则没有变</w:t>
+              <w:t xml:space="preserve">，生成脚本 </w:t>
+            </w:r>
+            <w:r>
+              <w:rPr>
+                <w:rFonts w:ascii="Consolas" w:cs="Consolas" w:eastAsia="Microsoft YaHei" w:hAnsi="Consolas"/>
+                <w:sz w:val="19"/>
+                <w:szCs w:val="19"/>
+                <w:shd w:fill="EEEEEE" w:val="clear"/>
+              </w:rPr>
+              <w:t xml:space="preserve">tools/make_calibration_starters.py</w:t>
+            </w:r>
+            <w:r>
+              <w:rPr>
+                <w:rFonts w:ascii="Calibri" w:cs="Calibri" w:eastAsia="Microsoft YaHei" w:hAnsi="Calibri"/>
+                <w:sz w:val="19"/>
+                <w:szCs w:val="19"/>
+              </w:rPr>
+              <w:t xml:space="preserve">）。表里只预填了 10 个 WS 编号和提取员代码，另有一张 Calibration_list（编号、标题、DOI、链接）；Patients 表是空的。只是省去手工填编号，规则没有变</w:t>
             </w:r>
           </w:p>
         </w:tc>
@@ -701,7 +803,7 @@
                 <w:sz w:val="19"/>
                 <w:szCs w:val="19"/>
               </w:rPr>
-              <w:t xml:space="preserve">改动（2026-10-19，校准之后）</w:t>
+              <w:t xml:space="preserve">改动（2026-10-25，已抽样）</w:t>
             </w:r>
           </w:p>
         </w:tc>
@@ -732,7 +834,7 @@
                 <w:sz w:val="19"/>
                 <w:szCs w:val="19"/>
               </w:rPr>
-              <w:t xml:space="preserve">全文阶段 20 篇校准讨论后（作者转告）：</w:t>
+              <w:t xml:space="preserve">全文名单已确定（269 篇纳入，</w:t>
             </w:r>
             <w:r>
               <w:rPr>
@@ -741,15 +843,15 @@
                 <w:szCs w:val="19"/>
                 <w:shd w:fill="EEEEEE" w:val="clear"/>
               </w:rPr>
-              <w:t xml:space="preserve">ws_basis</w:t>
-            </w:r>
-            <w:r>
-              <w:rPr>
-                <w:rFonts w:ascii="Calibri" w:cs="Calibri" w:eastAsia="Microsoft YaHei" w:hAnsi="Calibri"/>
-                <w:sz w:val="19"/>
-                <w:szCs w:val="19"/>
-              </w:rPr>
-              <w:t xml:space="preserve"> 的 </w:t>
+              <w:t xml:space="preserve">fulltext_finalize</w:t>
+            </w:r>
+            <w:r>
+              <w:rPr>
+                <w:rFonts w:ascii="Calibri" w:cs="Calibri" w:eastAsia="Microsoft YaHei" w:hAnsi="Calibri"/>
+                <w:sz w:val="19"/>
+                <w:szCs w:val="19"/>
+              </w:rPr>
+              <w:t xml:space="preserve"> 2026 年 10 月 25 日的结果），10 篇校准按第 10 节第 1 步抽出，种子 20261019，结果在 </w:t>
             </w:r>
             <w:r>
               <w:rPr>
@@ -758,15 +860,15 @@
                 <w:szCs w:val="19"/>
                 <w:shd w:fill="EEEEEE" w:val="clear"/>
               </w:rPr>
-              <w:t xml:space="preserve">Imaging and operation</w:t>
-            </w:r>
-            <w:r>
-              <w:rPr>
-                <w:rFonts w:ascii="Calibri" w:cs="Calibri" w:eastAsia="Microsoft YaHei" w:hAnsi="Calibri"/>
-                <w:sz w:val="19"/>
-                <w:szCs w:val="19"/>
-              </w:rPr>
-              <w:t xml:space="preserve"> 只在影像和术中所见都写明脾异位或活动时才选（5.2 表）；逐例资料在线上附录里的报告，附录也要取到（2.2 清单）。没有改别的规则</w:t>
+              <w:t xml:space="preserve">search/extraction/calibration/</w:t>
+            </w:r>
+            <w:r>
+              <w:rPr>
+                <w:rFonts w:ascii="Calibri" w:cs="Calibri" w:eastAsia="Microsoft YaHei" w:hAnsi="Calibri"/>
+                <w:sz w:val="19"/>
+                <w:szCs w:val="19"/>
+              </w:rPr>
+              <w:t xml:space="preserve">。名单里中文 3、系列 3 达到要求；“范围”类时间写法按摘要关键词一篇也没有找到，没有硬凑（见第 10 节）。规则没有变</w:t>
             </w:r>
           </w:p>
         </w:tc>
@@ -806,7 +908,7 @@
                 <w:sz w:val="19"/>
                 <w:szCs w:val="19"/>
               </w:rPr>
-              <w:t xml:space="preserve">改动（2026-10-19）</w:t>
+              <w:t xml:space="preserve">改动（2026-10-19，校准之后）</w:t>
             </w:r>
           </w:p>
         </w:tc>
@@ -837,25 +939,7 @@
                 <w:sz w:val="19"/>
                 <w:szCs w:val="19"/>
               </w:rPr>
-              <w:t xml:space="preserve">提取阶段</w:t>
-            </w:r>
-            <w:r>
-              <w:rPr>
-                <w:rFonts w:ascii="Calibri" w:cs="Calibri" w:eastAsia="Microsoft YaHei" w:hAnsi="Calibri"/>
-                <w:b/>
-                <w:bCs/>
-                <w:sz w:val="19"/>
-                <w:szCs w:val="19"/>
-              </w:rPr>
-              <w:t xml:space="preserve">不保存时间记录</w:t>
-            </w:r>
-            <w:r>
-              <w:rPr>
-                <w:rFonts w:ascii="Calibri" w:cs="Calibri" w:eastAsia="Microsoft YaHei" w:hAnsi="Calibri"/>
-                <w:sz w:val="19"/>
-                <w:szCs w:val="19"/>
-              </w:rPr>
-              <w:t xml:space="preserve">：作者 2026 年 10 月 19 日决定删除提取工作簿里的 EX_time_log 表（提取尚未开始）。理由作者没有说明，文件里不写理由。协议 v1.6 对提取阶段没有时间记录的规定，所以协议不用改；脚本 </w:t>
+              <w:t xml:space="preserve">全文阶段 20 篇校准讨论后（作者转告）：</w:t>
             </w:r>
             <w:r>
               <w:rPr>
@@ -864,15 +948,32 @@
                 <w:szCs w:val="19"/>
                 <w:shd w:fill="EEEEEE" w:val="clear"/>
               </w:rPr>
-              <w:t xml:space="preserve">compare_extraction.py</w:t>
-            </w:r>
-            <w:r>
-              <w:rPr>
-                <w:rFonts w:ascii="Calibri" w:cs="Calibri" w:eastAsia="Microsoft YaHei" w:hAnsi="Calibri"/>
-                <w:sz w:val="19"/>
-                <w:szCs w:val="19"/>
-              </w:rPr>
-              <w:t xml:space="preserve"> 也不再检查用时。本说明里提到时间记录的四处（目录里第 2 章的说明、第 1 节第 4 步及随后的步骤编号、2.2 清单、第 10 节）已删或改，版本号随之更新，其余内容没有变</w:t>
+              <w:t xml:space="preserve">ws_basis</w:t>
+            </w:r>
+            <w:r>
+              <w:rPr>
+                <w:rFonts w:ascii="Calibri" w:cs="Calibri" w:eastAsia="Microsoft YaHei" w:hAnsi="Calibri"/>
+                <w:sz w:val="19"/>
+                <w:szCs w:val="19"/>
+              </w:rPr>
+              <w:t xml:space="preserve"> 的 </w:t>
+            </w:r>
+            <w:r>
+              <w:rPr>
+                <w:rFonts w:ascii="Consolas" w:cs="Consolas" w:eastAsia="Microsoft YaHei" w:hAnsi="Consolas"/>
+                <w:sz w:val="19"/>
+                <w:szCs w:val="19"/>
+                <w:shd w:fill="EEEEEE" w:val="clear"/>
+              </w:rPr>
+              <w:t xml:space="preserve">Imaging and operation</w:t>
+            </w:r>
+            <w:r>
+              <w:rPr>
+                <w:rFonts w:ascii="Calibri" w:cs="Calibri" w:eastAsia="Microsoft YaHei" w:hAnsi="Calibri"/>
+                <w:sz w:val="19"/>
+                <w:szCs w:val="19"/>
+              </w:rPr>
+              <w:t xml:space="preserve"> 只在影像和术中所见都写明脾异位或活动时才选（5.2 表）；逐例资料在线上附录里的报告，附录也要取到（2.2 清单）。没有改别的规则</w:t>
             </w:r>
           </w:p>
         </w:tc>
@@ -912,7 +1013,7 @@
                 <w:sz w:val="19"/>
                 <w:szCs w:val="19"/>
               </w:rPr>
-              <w:t xml:space="preserve">项目</w:t>
+              <w:t xml:space="preserve">改动（2026-10-19）</w:t>
             </w:r>
           </w:p>
         </w:tc>
@@ -943,7 +1044,42 @@
                 <w:sz w:val="19"/>
                 <w:szCs w:val="19"/>
               </w:rPr>
-              <w:t xml:space="preserve">儿童游走脾系统综述（含个体患者数据）和单中心病例系列；PROSPERO CRD420261520329；协议 v1.5</w:t>
+              <w:t xml:space="preserve">提取阶段</w:t>
+            </w:r>
+            <w:r>
+              <w:rPr>
+                <w:rFonts w:ascii="Calibri" w:cs="Calibri" w:eastAsia="Microsoft YaHei" w:hAnsi="Calibri"/>
+                <w:b/>
+                <w:bCs/>
+                <w:sz w:val="19"/>
+                <w:szCs w:val="19"/>
+              </w:rPr>
+              <w:t xml:space="preserve">不保存时间记录</w:t>
+            </w:r>
+            <w:r>
+              <w:rPr>
+                <w:rFonts w:ascii="Calibri" w:cs="Calibri" w:eastAsia="Microsoft YaHei" w:hAnsi="Calibri"/>
+                <w:sz w:val="19"/>
+                <w:szCs w:val="19"/>
+              </w:rPr>
+              <w:t xml:space="preserve">：作者 2026 年 10 月 19 日决定删除提取工作簿里的 EX_time_log 表（提取尚未开始）。理由作者没有说明，文件里不写理由。协议 v1.6 对提取阶段没有时间记录的规定，所以协议不用改；脚本 </w:t>
+            </w:r>
+            <w:r>
+              <w:rPr>
+                <w:rFonts w:ascii="Consolas" w:cs="Consolas" w:eastAsia="Microsoft YaHei" w:hAnsi="Consolas"/>
+                <w:sz w:val="19"/>
+                <w:szCs w:val="19"/>
+                <w:shd w:fill="EEEEEE" w:val="clear"/>
+              </w:rPr>
+              <w:t xml:space="preserve">compare_extraction.py</w:t>
+            </w:r>
+            <w:r>
+              <w:rPr>
+                <w:rFonts w:ascii="Calibri" w:cs="Calibri" w:eastAsia="Microsoft YaHei" w:hAnsi="Calibri"/>
+                <w:sz w:val="19"/>
+                <w:szCs w:val="19"/>
+              </w:rPr>
+              <w:t xml:space="preserve"> 也不再检查用时。本说明里提到时间记录的四处（目录里第 2 章的说明、第 1 节第 4 步及随后的步骤编号、2.2 清单、第 10 节）已删或改，版本号随之更新，其余内容没有变</w:t>
             </w:r>
           </w:p>
         </w:tc>
@@ -983,7 +1119,7 @@
                 <w:sz w:val="19"/>
                 <w:szCs w:val="19"/>
               </w:rPr>
-              <w:t xml:space="preserve">适用对象</w:t>
+              <w:t xml:space="preserve">项目</w:t>
             </w:r>
           </w:p>
         </w:tc>
@@ -1014,7 +1150,7 @@
                 <w:sz w:val="19"/>
                 <w:szCs w:val="19"/>
               </w:rPr>
-              <w:t xml:space="preserve">舒俊（提取员 E1）、卞红强（提取员 E2）、杨俊（分歧仲裁）。Ji Wang 核查两份提取表，不提取。分工是作者 2026 年 10 月 18 日决定的；作者转告卞红强和杨俊已知道并同意（方式和日期没有说明）</w:t>
+              <w:t xml:space="preserve">儿童游走脾系统综述（含个体患者数据）和单中心病例系列；PROSPERO CRD420261520329；协议 v1.5</w:t>
             </w:r>
           </w:p>
         </w:tc>
@@ -1054,6 +1190,77 @@
                 <w:sz w:val="19"/>
                 <w:szCs w:val="19"/>
               </w:rPr>
+              <w:t xml:space="preserve">适用对象</w:t>
+            </w:r>
+          </w:p>
+        </w:tc>
+        <w:tc>
+          <w:tcPr>
+            <w:tcW w:type="dxa" w:w="7492"/>
+            <w:tcBorders>
+              <w:top w:val="single" w:color="BBBBBB" w:sz="4"/>
+              <w:left w:val="single" w:color="BBBBBB" w:sz="4"/>
+              <w:bottom w:val="single" w:color="BBBBBB" w:sz="4"/>
+              <w:right w:val="single" w:color="BBBBBB" w:sz="4"/>
+            </w:tcBorders>
+            <w:tcMar>
+              <w:top w:type="dxa" w:w="55"/>
+              <w:left w:type="dxa" w:w="95"/>
+              <w:bottom w:type="dxa" w:w="55"/>
+              <w:right w:type="dxa" w:w="95"/>
+            </w:tcMar>
+            <w:vAlign w:val="top"/>
+          </w:tcPr>
+          <w:p>
+            <w:pPr>
+              <w:spacing w:after="0"/>
+            </w:pPr>
+            <w:r>
+              <w:rPr>
+                <w:rFonts w:ascii="Calibri" w:cs="Calibri" w:eastAsia="Microsoft YaHei" w:hAnsi="Calibri"/>
+                <w:sz w:val="19"/>
+                <w:szCs w:val="19"/>
+              </w:rPr>
+              <w:t xml:space="preserve">舒俊（提取员 E1）、卞红强（提取员 E2）、杨俊（分歧仲裁）。Ji Wang 核查两份提取表，不提取。分工是作者 2026 年 10 月 18 日决定的；作者转告卞红强和杨俊已知道并同意（方式和日期没有说明）</w:t>
+            </w:r>
+          </w:p>
+        </w:tc>
+      </w:tr>
+      <w:tr>
+        <w:trPr>
+          <w:cantSplit/>
+          <w:tblHeader w:val="false"/>
+        </w:trPr>
+        <w:tc>
+          <w:tcPr>
+            <w:tcW w:type="dxa" w:w="1534"/>
+            <w:tcBorders>
+              <w:top w:val="single" w:color="BBBBBB" w:sz="4"/>
+              <w:left w:val="single" w:color="BBBBBB" w:sz="4"/>
+              <w:bottom w:val="single" w:color="BBBBBB" w:sz="4"/>
+              <w:right w:val="single" w:color="BBBBBB" w:sz="4"/>
+            </w:tcBorders>
+            <w:shd w:fill="F2F5F9" w:val="clear"/>
+            <w:tcMar>
+              <w:top w:type="dxa" w:w="55"/>
+              <w:left w:type="dxa" w:w="95"/>
+              <w:bottom w:type="dxa" w:w="55"/>
+              <w:right w:type="dxa" w:w="95"/>
+            </w:tcMar>
+            <w:vAlign w:val="top"/>
+          </w:tcPr>
+          <w:p>
+            <w:pPr>
+              <w:spacing w:after="0"/>
+            </w:pPr>
+            <w:r>
+              <w:rPr>
+                <w:rFonts w:ascii="Calibri" w:cs="Calibri" w:eastAsia="Microsoft YaHei" w:hAnsi="Calibri"/>
+                <w:b/>
+                <w:bCs/>
+                <w:sz w:val="19"/>
+                <w:szCs w:val="19"/>
+              </w:rPr>
               <w:t xml:space="preserve">配套文件</w:t>
             </w:r>
           </w:p>
@@ -1085,7 +1292,7 @@
                 <w:sz w:val="19"/>
                 <w:szCs w:val="19"/>
               </w:rPr>
-              <w:t xml:space="preserve">协议 v1.5 附录 C（提取表和 9 条时间换算规则）；《提取工作簿》v2026-10-19e；比对脚本 </w:t>
+              <w:t xml:space="preserve">协议 v1.5 附录 C（提取表和 9 条时间换算规则）；《提取工作簿》v2026-10-25a；比对脚本 </w:t>
             </w:r>
             <w:r>
               <w:rPr>
@@ -7959,13 +8166,28 @@
           <w:b/>
           <w:bCs/>
         </w:rPr>
-        <w:t xml:space="preserve">presentation 的五个值</w:t>
+        <w:t xml:space="preserve">presentation 的五个值加 NR</w:t>
       </w:r>
       <w:r>
         <w:rPr>
           <w:rFonts w:ascii="Calibri" w:cs="Calibri" w:eastAsia="Microsoft YaHei" w:hAnsi="Calibri"/>
         </w:rPr>
-        <w:t xml:space="preserve">（协议附录 C）。</w:t>
+        <w:t xml:space="preserve">（五个值来自协议附录 C；</w:t>
+      </w:r>
+      <w:r>
+        <w:rPr>
+          <w:rFonts w:ascii="Consolas" w:cs="Consolas" w:eastAsia="Microsoft YaHei" w:hAnsi="Consolas"/>
+          <w:sz w:val="19"/>
+          <w:szCs w:val="19"/>
+          <w:shd w:fill="EEEEEE" w:val="clear"/>
+        </w:rPr>
+        <w:t xml:space="preserve">NR</w:t>
+      </w:r>
+      <w:r>
+        <w:rPr>
+          <w:rFonts w:ascii="Calibri" w:cs="Calibri" w:eastAsia="Microsoft YaHei" w:hAnsi="Calibri"/>
+        </w:rPr>
+        <w:t xml:space="preserve"> 是 2026 年 10 月 25 日作者同意加的补充值）。</w:t>
       </w:r>
       <w:r>
         <w:rPr>
@@ -8592,6 +8814,105 @@
                 <w:szCs w:val="19"/>
               </w:rPr>
               <w:t xml:space="preserve">发现左腹包块 1 个月，无腹痛</w:t>
+            </w:r>
+          </w:p>
+        </w:tc>
+      </w:tr>
+      <w:tr>
+        <w:trPr>
+          <w:cantSplit/>
+          <w:tblHeader w:val="false"/>
+        </w:trPr>
+        <w:tc>
+          <w:tcPr>
+            <w:tcW w:type="dxa" w:w="1986"/>
+            <w:tcBorders>
+              <w:top w:val="single" w:color="BBBBBB" w:sz="4"/>
+              <w:left w:val="single" w:color="BBBBBB" w:sz="4"/>
+              <w:bottom w:val="single" w:color="BBBBBB" w:sz="4"/>
+              <w:right w:val="single" w:color="BBBBBB" w:sz="4"/>
+            </w:tcBorders>
+            <w:tcMar>
+              <w:top w:type="dxa" w:w="55"/>
+              <w:left w:type="dxa" w:w="95"/>
+              <w:bottom w:type="dxa" w:w="55"/>
+              <w:right w:type="dxa" w:w="95"/>
+            </w:tcMar>
+            <w:vAlign w:val="top"/>
+          </w:tcPr>
+          <w:p>
+            <w:pPr>
+              <w:spacing w:after="0"/>
+            </w:pPr>
+            <w:r>
+              <w:rPr>
+                <w:rFonts w:ascii="Calibri" w:cs="Calibri" w:eastAsia="Microsoft YaHei" w:hAnsi="Calibri"/>
+                <w:sz w:val="19"/>
+                <w:szCs w:val="19"/>
+              </w:rPr>
+              <w:t xml:space="preserve">NR</w:t>
+            </w:r>
+          </w:p>
+        </w:tc>
+        <w:tc>
+          <w:tcPr>
+            <w:tcW w:type="dxa" w:w="4332"/>
+            <w:tcBorders>
+              <w:top w:val="single" w:color="BBBBBB" w:sz="4"/>
+              <w:left w:val="single" w:color="BBBBBB" w:sz="4"/>
+              <w:bottom w:val="single" w:color="BBBBBB" w:sz="4"/>
+              <w:right w:val="single" w:color="BBBBBB" w:sz="4"/>
+            </w:tcBorders>
+            <w:tcMar>
+              <w:top w:type="dxa" w:w="55"/>
+              <w:left w:type="dxa" w:w="95"/>
+              <w:bottom w:type="dxa" w:w="55"/>
+              <w:right w:type="dxa" w:w="95"/>
+            </w:tcMar>
+            <w:vAlign w:val="top"/>
+          </w:tcPr>
+          <w:p>
+            <w:pPr>
+              <w:spacing w:after="0"/>
+            </w:pPr>
+            <w:r>
+              <w:rPr>
+                <w:rFonts w:ascii="Calibri" w:cs="Calibri" w:eastAsia="Microsoft YaHei" w:hAnsi="Calibri"/>
+                <w:sz w:val="19"/>
+                <w:szCs w:val="19"/>
+              </w:rPr>
+              <w:t xml:space="preserve">报告没有写这次的发作形式，也无法从病史推断；在 notes 里写明</w:t>
+            </w:r>
+          </w:p>
+        </w:tc>
+        <w:tc>
+          <w:tcPr>
+            <w:tcW w:type="dxa" w:w="2708"/>
+            <w:tcBorders>
+              <w:top w:val="single" w:color="BBBBBB" w:sz="4"/>
+              <w:left w:val="single" w:color="BBBBBB" w:sz="4"/>
+              <w:bottom w:val="single" w:color="BBBBBB" w:sz="4"/>
+              <w:right w:val="single" w:color="BBBBBB" w:sz="4"/>
+            </w:tcBorders>
+            <w:tcMar>
+              <w:top w:type="dxa" w:w="55"/>
+              <w:left w:type="dxa" w:w="95"/>
+              <w:bottom w:type="dxa" w:w="55"/>
+              <w:right w:type="dxa" w:w="95"/>
+            </w:tcMar>
+            <w:vAlign w:val="top"/>
+          </w:tcPr>
+          <w:p>
+            <w:pPr>
+              <w:spacing w:after="0"/>
+            </w:pPr>
+            <w:r>
+              <w:rPr>
+                <w:rFonts w:ascii="Calibri" w:cs="Calibri" w:eastAsia="Microsoft YaHei" w:hAnsi="Calibri"/>
+                <w:sz w:val="19"/>
+                <w:szCs w:val="19"/>
+              </w:rPr>
+              <w:t xml:space="preserve">只写“因游走脾行脾固定术”，没有症状和病程</w:t>
             </w:r>
           </w:p>
         </w:tc>
@@ -23368,7 +23689,16 @@
                 <w:sz w:val="19"/>
                 <w:szCs w:val="19"/>
               </w:rPr>
-              <w:t xml:space="preserve"> 五个值的边界</w:t>
+              <w:t xml:space="preserve"> 五个值的边界，以及没写时填 </w:t>
+            </w:r>
+            <w:r>
+              <w:rPr>
+                <w:rFonts w:ascii="Consolas" w:cs="Consolas" w:eastAsia="Microsoft YaHei" w:hAnsi="Consolas"/>
+                <w:sz w:val="19"/>
+                <w:szCs w:val="19"/>
+                <w:shd w:fill="EEEEEE" w:val="clear"/>
+              </w:rPr>
+              <w:t xml:space="preserve">NR</w:t>
             </w:r>
           </w:p>
         </w:tc>
@@ -23399,7 +23729,24 @@
                 <w:sz w:val="19"/>
                 <w:szCs w:val="19"/>
               </w:rPr>
-              <w:t xml:space="preserve">见 5.3 的表。【Claude 的读法】</w:t>
+              <w:t xml:space="preserve">见 5.3 的表；</w:t>
+            </w:r>
+            <w:r>
+              <w:rPr>
+                <w:rFonts w:ascii="Consolas" w:cs="Consolas" w:eastAsia="Microsoft YaHei" w:hAnsi="Consolas"/>
+                <w:sz w:val="19"/>
+                <w:szCs w:val="19"/>
+                <w:shd w:fill="EEEEEE" w:val="clear"/>
+              </w:rPr>
+              <w:t xml:space="preserve">NR</w:t>
+            </w:r>
+            <w:r>
+              <w:rPr>
+                <w:rFonts w:ascii="Calibri" w:cs="Calibri" w:eastAsia="Microsoft YaHei" w:hAnsi="Calibri"/>
+                <w:sz w:val="19"/>
+                <w:szCs w:val="19"/>
+              </w:rPr>
+              <w:t xml:space="preserve"> 已由作者同意加入（2026-10-25）。五个值的边界仍是【Claude 的读法】</w:t>
             </w:r>
           </w:p>
         </w:tc>
@@ -23535,7 +23882,7 @@
         <w:rPr>
           <w:rFonts w:ascii="Calibri" w:cs="Calibri" w:eastAsia="Microsoft YaHei" w:hAnsi="Calibri"/>
         </w:rPr>
-        <w:t xml:space="preserve">这份说明里的所有例子都是虚构的，没有对照过任何真实报告；规则的原文来自协议 v1.5 附录 C，工作簿的列名和下拉值来自模板 v2026-10-19e。</w:t>
+        <w:t xml:space="preserve">这份说明里的所有例子都是虚构的，没有对照过任何真实报告；规则的原文来自协议 v1.5 附录 C，工作簿的列名和下拉值来自模板 v2026-10-25a。</w:t>
       </w:r>
     </w:p>
     <w:p>
@@ -23676,7 +24023,7 @@
         <w:sz w:val="17"/>
         <w:szCs w:val="17"/>
       </w:rPr>
-      <w:t xml:space="preserve">提取操作说明 v2026-10-25b   |   第 </w:t>
+      <w:t xml:space="preserve">提取操作说明 v2026-10-25c   |   第 </w:t>
     </w:r>
     <w:r>
       <w:rPr>

</xml_diff>

<commit_message>
Extraction guide v2026-10-25d: readings X13-X20 from the adjudicated calibration discussion; outcome record and adjudicated detail CSV
Co-Authored-By: Claude Sonnet 5.5 <noreply@anthropic.com>
Claude-Session: https://claude.ai/code/session_01FRD7etKqYN8v2bbXeeLMRW
</commit_message>
<xml_diff>
--- a/Extraction guide - how to fill the extraction workbook (draft).docx
+++ b/Extraction guide - how to fill the extraction workbook (draft).docx
@@ -116,7 +116,7 @@
                 <w:sz w:val="19"/>
                 <w:szCs w:val="19"/>
               </w:rPr>
-              <w:t xml:space="preserve">提取操作说明 v2026-10-25c（草稿）。标 </w:t>
+              <w:t xml:space="preserve">提取操作说明 v2026-10-25d（草稿）。标 </w:t>
             </w:r>
             <w:r>
               <w:rPr>
@@ -152,7 +152,148 @@
                 <w:sz w:val="19"/>
                 <w:szCs w:val="19"/>
               </w:rPr>
-              <w:t xml:space="preserve"> 的内容要两位提取员和仲裁人确认后才算生效</w:t>
+              <w:t xml:space="preserve"> 的内容要两位提取员和仲裁人确认后才算生效；标 </w:t>
+            </w:r>
+            <w:r>
+              <w:rPr>
+                <w:rFonts w:ascii="Calibri" w:cs="Calibri" w:eastAsia="Microsoft YaHei" w:hAnsi="Calibri"/>
+                <w:b/>
+                <w:bCs/>
+                <w:sz w:val="19"/>
+                <w:szCs w:val="19"/>
+              </w:rPr>
+              <w:t xml:space="preserve">【已裁定】</w:t>
+            </w:r>
+            <w:r>
+              <w:rPr>
+                <w:rFonts w:ascii="Calibri" w:cs="Calibri" w:eastAsia="Microsoft YaHei" w:hAnsi="Calibri"/>
+                <w:sz w:val="19"/>
+                <w:szCs w:val="19"/>
+              </w:rPr>
+              <w:t xml:space="preserve"> 的是 10 篇校准讨论后由杨俊按原文裁定的读法（见 X13–X20）</w:t>
+            </w:r>
+          </w:p>
+        </w:tc>
+      </w:tr>
+      <w:tr>
+        <w:trPr>
+          <w:cantSplit/>
+          <w:tblHeader w:val="false"/>
+        </w:trPr>
+        <w:tc>
+          <w:tcPr>
+            <w:tcW w:type="dxa" w:w="1534"/>
+            <w:tcBorders>
+              <w:top w:val="single" w:color="BBBBBB" w:sz="4"/>
+              <w:left w:val="single" w:color="BBBBBB" w:sz="4"/>
+              <w:bottom w:val="single" w:color="BBBBBB" w:sz="4"/>
+              <w:right w:val="single" w:color="BBBBBB" w:sz="4"/>
+            </w:tcBorders>
+            <w:shd w:fill="F2F5F9" w:val="clear"/>
+            <w:tcMar>
+              <w:top w:type="dxa" w:w="55"/>
+              <w:left w:type="dxa" w:w="95"/>
+              <w:bottom w:type="dxa" w:w="55"/>
+              <w:right w:type="dxa" w:w="95"/>
+            </w:tcMar>
+            <w:vAlign w:val="top"/>
+          </w:tcPr>
+          <w:p>
+            <w:pPr>
+              <w:spacing w:after="0"/>
+            </w:pPr>
+            <w:r>
+              <w:rPr>
+                <w:rFonts w:ascii="Calibri" w:cs="Calibri" w:eastAsia="Microsoft YaHei" w:hAnsi="Calibri"/>
+                <w:b/>
+                <w:bCs/>
+                <w:sz w:val="19"/>
+                <w:szCs w:val="19"/>
+              </w:rPr>
+              <w:t xml:space="preserve">改动（2026-10-25，校准讨论之后）</w:t>
+            </w:r>
+          </w:p>
+        </w:tc>
+        <w:tc>
+          <w:tcPr>
+            <w:tcW w:type="dxa" w:w="7492"/>
+            <w:tcBorders>
+              <w:top w:val="single" w:color="BBBBBB" w:sz="4"/>
+              <w:left w:val="single" w:color="BBBBBB" w:sz="4"/>
+              <w:bottom w:val="single" w:color="BBBBBB" w:sz="4"/>
+              <w:right w:val="single" w:color="BBBBBB" w:sz="4"/>
+            </w:tcBorders>
+            <w:tcMar>
+              <w:top w:type="dxa" w:w="55"/>
+              <w:left w:type="dxa" w:w="95"/>
+              <w:bottom w:type="dxa" w:w="55"/>
+              <w:right w:type="dxa" w:w="95"/>
+            </w:tcMar>
+            <w:vAlign w:val="top"/>
+          </w:tcPr>
+          <w:p>
+            <w:pPr>
+              <w:spacing w:after="0"/>
+            </w:pPr>
+            <w:r>
+              <w:rPr>
+                <w:rFonts w:ascii="Calibri" w:cs="Calibri" w:eastAsia="Microsoft YaHei" w:hAnsi="Calibri"/>
+                <w:sz w:val="19"/>
+                <w:szCs w:val="19"/>
+              </w:rPr>
+              <w:t xml:space="preserve">10 篇校准的分歧清单经两位提取员讨论、杨俊裁定后，作者 2026 年 10 月 25 日转来裁定后的明细表（讨论清单第 1–8 点；第 9、10 点不在这份明细表里，见第 13 节）。写进本说明的读法共八条，登记为 </w:t>
+            </w:r>
+            <w:r>
+              <w:rPr>
+                <w:rFonts w:ascii="Calibri" w:cs="Calibri" w:eastAsia="Microsoft YaHei" w:hAnsi="Calibri"/>
+                <w:b/>
+                <w:bCs/>
+                <w:sz w:val="19"/>
+                <w:szCs w:val="19"/>
+              </w:rPr>
+              <w:t xml:space="preserve">X13–X20</w:t>
+            </w:r>
+            <w:r>
+              <w:rPr>
+                <w:rFonts w:ascii="Calibri" w:cs="Calibri" w:eastAsia="Microsoft YaHei" w:hAnsi="Calibri"/>
+                <w:sz w:val="19"/>
+                <w:szCs w:val="19"/>
+              </w:rPr>
+              <w:t xml:space="preserve">，并改了 2.3、3、5.1、5.3、5.4、5.5、5.6、5.7、7 和 7.1 中对应的句子：（1）脾脏活力只采纳作者对术中脾状态的直接描述，不由术式或影像反推；（2）没提填 NR，只有原文明确否定才填 No（含复发、再手术、已知诊断推迟）；（3）总病程和既往发作次数不由指数发作时长或未说明的发作自动推出；（4）只有至就诊或入院前的时长、没给手术时间，标下限；（5）按原文能确定的起点和手术日期提取，不精确时只记类别；（6）影像和术中证据逐例对应，汇总只在范围完全对应时适用，</w:t>
+            </w:r>
+            <w:r>
+              <w:rPr>
+                <w:rFonts w:ascii="Consolas" w:cs="Consolas" w:eastAsia="Microsoft YaHei" w:hAnsi="Consolas"/>
+                <w:sz w:val="19"/>
+                <w:szCs w:val="19"/>
+                <w:shd w:fill="EEEEEE" w:val="clear"/>
+              </w:rPr>
+              <w:t xml:space="preserve">Imaging and operation</w:t>
+            </w:r>
+            <w:r>
+              <w:rPr>
+                <w:rFonts w:ascii="Calibri" w:cs="Calibri" w:eastAsia="Microsoft YaHei" w:hAnsi="Calibri"/>
+                <w:sz w:val="19"/>
+                <w:szCs w:val="19"/>
+              </w:rPr>
+              <w:t xml:space="preserve"> 需要两者都有；（7）既无游走脾诊断、也无脾蒂活动或扭转描述的儿童不进 Patients 表；（8）无法一一对应的可能重复只在报告层说明，不填 </w:t>
+            </w:r>
+            <w:r>
+              <w:rPr>
+                <w:rFonts w:ascii="Consolas" w:cs="Consolas" w:eastAsia="Microsoft YaHei" w:hAnsi="Consolas"/>
+                <w:sz w:val="19"/>
+                <w:szCs w:val="19"/>
+                <w:shd w:fill="EEEEEE" w:val="clear"/>
+              </w:rPr>
+              <w:t xml:space="preserve">same_patient_as</w:t>
+            </w:r>
+            <w:r>
+              <w:rPr>
+                <w:rFonts w:ascii="Calibri" w:cs="Calibri" w:eastAsia="Microsoft YaHei" w:hAnsi="Calibri"/>
+                <w:sz w:val="19"/>
+                <w:szCs w:val="19"/>
+              </w:rPr>
+              <w:t xml:space="preserve">。这些是研究团队自己对具体报告的裁定，Claude 没有打开原文，也没有核对。规则只在原来的写法上加了限定，没有改任何纳入标准或变量定义；工作簿的列和下拉值没有变，模板版本不变（v2026-10-25a）。各条结论是两位提取员和杨俊自己在明细表里写的；这份说明里的措辞（把结论变成通用规则的部分）他们还没有看过</w:t>
             </w:r>
           </w:p>
         </w:tc>
@@ -4222,6 +4363,104 @@
       <w:r>
         <w:rPr>
           <w:rFonts w:ascii="Calibri" w:cs="Calibri" w:eastAsia="Microsoft YaHei" w:hAnsi="Calibri"/>
+          <w:b/>
+          <w:bCs/>
+        </w:rPr>
+        <w:t xml:space="preserve">【已裁定 X14】</w:t>
+      </w:r>
+      <w:r>
+        <w:rPr>
+          <w:rFonts w:ascii="Calibri" w:cs="Calibri" w:eastAsia="Microsoft YaHei" w:hAnsi="Calibri"/>
+        </w:rPr>
+        <w:t xml:space="preserve"> Yes / No / NR 类的项目：</w:t>
+      </w:r>
+      <w:r>
+        <w:rPr>
+          <w:rFonts w:ascii="Calibri" w:cs="Calibri" w:eastAsia="Microsoft YaHei" w:hAnsi="Calibri"/>
+          <w:b/>
+          <w:bCs/>
+        </w:rPr>
+        <w:t xml:space="preserve">原文没提，填 NR；只有原文明确否定（"无复发""未再手术""无胃扭转"）才填 No。</w:t>
+      </w:r>
+      <w:r>
+        <w:rPr>
+          <w:rFonts w:ascii="Calibri" w:cs="Calibri" w:eastAsia="Microsoft YaHei" w:hAnsi="Calibri"/>
+        </w:rPr>
+        <w:t xml:space="preserve"> 不要因为"没写所以大概没有"就填 No。这条适用于伴随疾病（</w:t>
+      </w:r>
+      <w:r>
+        <w:rPr>
+          <w:rFonts w:ascii="Consolas" w:cs="Consolas" w:eastAsia="Microsoft YaHei" w:hAnsi="Consolas"/>
+          <w:sz w:val="19"/>
+          <w:szCs w:val="19"/>
+          <w:shd w:fill="EEEEEE" w:val="clear"/>
+        </w:rPr>
+        <w:t xml:space="preserve">cond_*</w:t>
+      </w:r>
+      <w:r>
+        <w:rPr>
+          <w:rFonts w:ascii="Calibri" w:cs="Calibri" w:eastAsia="Microsoft YaHei" w:hAnsi="Calibri"/>
+        </w:rPr>
+        <w:t xml:space="preserve">）、</w:t>
+      </w:r>
+      <w:r>
+        <w:rPr>
+          <w:rFonts w:ascii="Consolas" w:cs="Consolas" w:eastAsia="Microsoft YaHei" w:hAnsi="Consolas"/>
+          <w:sz w:val="19"/>
+          <w:szCs w:val="19"/>
+          <w:shd w:fill="EEEEEE" w:val="clear"/>
+        </w:rPr>
+        <w:t xml:space="preserve">known_dx_deferred</w:t>
+      </w:r>
+      <w:r>
+        <w:rPr>
+          <w:rFonts w:ascii="Calibri" w:cs="Calibri" w:eastAsia="Microsoft YaHei" w:hAnsi="Calibri"/>
+        </w:rPr>
+        <w:t xml:space="preserve">、</w:t>
+      </w:r>
+      <w:r>
+        <w:rPr>
+          <w:rFonts w:ascii="Consolas" w:cs="Consolas" w:eastAsia="Microsoft YaHei" w:hAnsi="Consolas"/>
+          <w:sz w:val="19"/>
+          <w:szCs w:val="19"/>
+          <w:shd w:fill="EEEEEE" w:val="clear"/>
+        </w:rPr>
+        <w:t xml:space="preserve">recurrence</w:t>
+      </w:r>
+      <w:r>
+        <w:rPr>
+          <w:rFonts w:ascii="Calibri" w:cs="Calibri" w:eastAsia="Microsoft YaHei" w:hAnsi="Calibri"/>
+        </w:rPr>
+        <w:t xml:space="preserve">、</w:t>
+      </w:r>
+      <w:r>
+        <w:rPr>
+          <w:rFonts w:ascii="Consolas" w:cs="Consolas" w:eastAsia="Microsoft YaHei" w:hAnsi="Consolas"/>
+          <w:sz w:val="19"/>
+          <w:szCs w:val="19"/>
+          <w:shd w:fill="EEEEEE" w:val="clear"/>
+        </w:rPr>
+        <w:t xml:space="preserve">further_surgery</w:t>
+      </w:r>
+      <w:r>
+        <w:rPr>
+          <w:rFonts w:ascii="Calibri" w:cs="Calibri" w:eastAsia="Microsoft YaHei" w:hAnsi="Calibri"/>
+        </w:rPr>
+        <w:t xml:space="preserve"> 等所有这类项目。</w:t>
+      </w:r>
+    </w:p>
+    <w:p>
+      <w:pPr>
+        <w:pStyle w:val="ListParagraph"/>
+        <w:numPr>
+          <w:ilvl w:val="0"/>
+          <w:numId w:val="2"/>
+        </w:numPr>
+        <w:spacing w:after="60"/>
+      </w:pPr>
+      <w:r>
+        <w:rPr>
+          <w:rFonts w:ascii="Calibri" w:cs="Calibri" w:eastAsia="Microsoft YaHei" w:hAnsi="Calibri"/>
         </w:rPr>
         <w:t xml:space="preserve">灰色列是公式，不要改。</w:t>
       </w:r>
@@ -4855,6 +5094,101 @@
                 <w:sz w:val="19"/>
                 <w:szCs w:val="19"/>
               </w:rPr>
+              <w:t xml:space="preserve">系列里某名儿童既没有游走脾的诊断，也没有脾蒂活动或扭转的描述（如脾疝入胸腔、胃扭转合并膈疝，作者把它算进"脾扭转"病例，但手术时没有描述脾的位置或扭转）</w:t>
+            </w:r>
+          </w:p>
+        </w:tc>
+        <w:tc>
+          <w:tcPr>
+            <w:tcW w:type="dxa" w:w="5416"/>
+            <w:tcBorders>
+              <w:top w:val="single" w:color="BBBBBB" w:sz="4"/>
+              <w:left w:val="single" w:color="BBBBBB" w:sz="4"/>
+              <w:bottom w:val="single" w:color="BBBBBB" w:sz="4"/>
+              <w:right w:val="single" w:color="BBBBBB" w:sz="4"/>
+            </w:tcBorders>
+            <w:tcMar>
+              <w:top w:type="dxa" w:w="55"/>
+              <w:left w:type="dxa" w:w="95"/>
+              <w:bottom w:type="dxa" w:w="55"/>
+              <w:right w:type="dxa" w:w="95"/>
+            </w:tcMar>
+            <w:vAlign w:val="top"/>
+          </w:tcPr>
+          <w:p>
+            <w:pPr>
+              <w:spacing w:after="0"/>
+            </w:pPr>
+            <w:r>
+              <w:rPr>
+                <w:rFonts w:ascii="Calibri" w:cs="Calibri" w:eastAsia="Microsoft YaHei" w:hAnsi="Calibri"/>
+                <w:b/>
+                <w:bCs/>
+                <w:sz w:val="19"/>
+                <w:szCs w:val="19"/>
+              </w:rPr>
+              <w:t xml:space="preserve">【已裁定 X19】</w:t>
+            </w:r>
+            <w:r>
+              <w:rPr>
+                <w:rFonts w:ascii="Calibri" w:cs="Calibri" w:eastAsia="Microsoft YaHei" w:hAnsi="Calibri"/>
+                <w:sz w:val="19"/>
+                <w:szCs w:val="19"/>
+              </w:rPr>
+              <w:t xml:space="preserve"> 不进 Patients 表；Reports 表的 </w:t>
+            </w:r>
+            <w:r>
+              <w:rPr>
+                <w:rFonts w:ascii="Consolas" w:cs="Consolas" w:eastAsia="Microsoft YaHei" w:hAnsi="Consolas"/>
+                <w:sz w:val="19"/>
+                <w:szCs w:val="19"/>
+                <w:shd w:fill="EEEEEE" w:val="clear"/>
+              </w:rPr>
+              <w:t xml:space="preserve">n_children_individual</w:t>
+            </w:r>
+            <w:r>
+              <w:rPr>
+                <w:rFonts w:ascii="Calibri" w:cs="Calibri" w:eastAsia="Microsoft YaHei" w:hAnsi="Calibri"/>
+                <w:sz w:val="19"/>
+                <w:szCs w:val="19"/>
+              </w:rPr>
+              <w:t xml:space="preserve"> 不计入这名儿童；在该报告的 notes 里写明有这名儿童、为什么不符合（"无游走脾诊断，无脾蒂活动或扭转描述"）。这和全文阶段 D1 不矛盾：D1 宽松纳入的是"有脾蒂扭转的描述但没写位置"（Torsion only），这里是连扭转也没有描述</w:t>
+            </w:r>
+          </w:p>
+        </w:tc>
+      </w:tr>
+      <w:tr>
+        <w:trPr>
+          <w:cantSplit/>
+          <w:tblHeader w:val="false"/>
+        </w:trPr>
+        <w:tc>
+          <w:tcPr>
+            <w:tcW w:type="dxa" w:w="3610"/>
+            <w:tcBorders>
+              <w:top w:val="single" w:color="BBBBBB" w:sz="4"/>
+              <w:left w:val="single" w:color="BBBBBB" w:sz="4"/>
+              <w:bottom w:val="single" w:color="BBBBBB" w:sz="4"/>
+              <w:right w:val="single" w:color="BBBBBB" w:sz="4"/>
+            </w:tcBorders>
+            <w:tcMar>
+              <w:top w:type="dxa" w:w="55"/>
+              <w:left w:type="dxa" w:w="95"/>
+              <w:bottom w:type="dxa" w:w="55"/>
+              <w:right w:type="dxa" w:w="95"/>
+            </w:tcMar>
+            <w:vAlign w:val="top"/>
+          </w:tcPr>
+          <w:p>
+            <w:pPr>
+              <w:spacing w:after="0"/>
+            </w:pPr>
+            <w:r>
+              <w:rPr>
+                <w:rFonts w:ascii="Calibri" w:cs="Calibri" w:eastAsia="Microsoft YaHei" w:hAnsi="Calibri"/>
+                <w:sz w:val="19"/>
+                <w:szCs w:val="19"/>
+              </w:rPr>
               <w:t xml:space="preserve">综述里有新患者</w:t>
             </w:r>
           </w:p>
@@ -6512,6 +6846,77 @@
         </w:rPr>
         <w:t xml:space="preserve"> 与另一篇报告重复时，较完整那篇里的 patient_id；否则留空。判断重复要看机构、研究时期、年龄、性别、临床细节（协议第 14 节）。拿不准就不填，在 notes 里写"可能与 WSxxxx_Pn 是同一人"，共识时再定。</w:t>
       </w:r>
+      <w:r>
+        <w:rPr>
+          <w:rFonts w:ascii="Calibri" w:cs="Calibri" w:eastAsia="Microsoft YaHei" w:hAnsi="Calibri"/>
+          <w:b/>
+          <w:bCs/>
+        </w:rPr>
+        <w:t xml:space="preserve">【已裁定 X20】</w:t>
+      </w:r>
+      <w:r>
+        <w:rPr>
+          <w:rFonts w:ascii="Calibri" w:cs="Calibri" w:eastAsia="Microsoft YaHei" w:hAnsi="Calibri"/>
+        </w:rPr>
+        <w:t xml:space="preserve"> 如果两篇报告可能有重叠、但</w:t>
+      </w:r>
+      <w:r>
+        <w:rPr>
+          <w:rFonts w:ascii="Calibri" w:cs="Calibri" w:eastAsia="Microsoft YaHei" w:hAnsi="Calibri"/>
+          <w:b/>
+          <w:bCs/>
+        </w:rPr>
+        <w:t xml:space="preserve">无法一一对应</w:t>
+      </w:r>
+      <w:r>
+        <w:rPr>
+          <w:rFonts w:ascii="Calibri" w:cs="Calibri" w:eastAsia="Microsoft YaHei" w:hAnsi="Calibri"/>
+        </w:rPr>
+        <w:t xml:space="preserve">（如"其中 5 例此前已报告"，没说是哪 5 例），只在</w:t>
+      </w:r>
+      <w:r>
+        <w:rPr>
+          <w:rFonts w:ascii="Calibri" w:cs="Calibri" w:eastAsia="Microsoft YaHei" w:hAnsi="Calibri"/>
+          <w:b/>
+          <w:bCs/>
+        </w:rPr>
+        <w:t xml:space="preserve">报告层</w:t>
+      </w:r>
+      <w:r>
+        <w:rPr>
+          <w:rFonts w:ascii="Calibri" w:cs="Calibri" w:eastAsia="Microsoft YaHei" w:hAnsi="Calibri"/>
+        </w:rPr>
+        <w:t xml:space="preserve">说明：两篇报告的 </w:t>
+      </w:r>
+      <w:r>
+        <w:rPr>
+          <w:rFonts w:ascii="Consolas" w:cs="Consolas" w:eastAsia="Microsoft YaHei" w:hAnsi="Consolas"/>
+          <w:sz w:val="19"/>
+          <w:szCs w:val="19"/>
+          <w:shd w:fill="EEEEEE" w:val="clear"/>
+        </w:rPr>
+        <w:t xml:space="preserve">linked_duplicates</w:t>
+      </w:r>
+      <w:r>
+        <w:rPr>
+          <w:rFonts w:ascii="Calibri" w:cs="Calibri" w:eastAsia="Microsoft YaHei" w:hAnsi="Calibri"/>
+        </w:rPr>
+        <w:t xml:space="preserve"> 互相写对方的 WS 编号，报告层 notes 写重叠的情况；</w:t>
+      </w:r>
+      <w:r>
+        <w:rPr>
+          <w:rFonts w:ascii="Calibri" w:cs="Calibri" w:eastAsia="Microsoft YaHei" w:hAnsi="Calibri"/>
+          <w:b/>
+          <w:bCs/>
+        </w:rPr>
+        <w:t xml:space="preserve">不填任何患者的 same_patient_as</w:t>
+      </w:r>
+      <w:r>
+        <w:rPr>
+          <w:rFonts w:ascii="Calibri" w:cs="Calibri" w:eastAsia="Microsoft YaHei" w:hAnsi="Calibri"/>
+        </w:rPr>
+        <w:t xml:space="preserve">。这样的重叠怎么在分析里处理（例如分别去掉其中一篇做敏感性分析）由 Ji Wang 在核查重复患者时提出，不由提取员猜。</w:t>
+      </w:r>
     </w:p>
     <w:p>
       <w:pPr>
@@ -7686,6 +8091,69 @@
           <w:b/>
           <w:bCs/>
         </w:rPr>
+        <w:t xml:space="preserve">【已裁定 X18】逐例对应。</w:t>
+      </w:r>
+      <w:r>
+        <w:rPr>
+          <w:rFonts w:ascii="Calibri" w:cs="Calibri" w:eastAsia="Microsoft YaHei" w:hAnsi="Calibri"/>
+        </w:rPr>
+        <w:t xml:space="preserve"> </w:t>
+      </w:r>
+      <w:r>
+        <w:rPr>
+          <w:rFonts w:ascii="Consolas" w:cs="Consolas" w:eastAsia="Microsoft YaHei" w:hAnsi="Consolas"/>
+          <w:sz w:val="19"/>
+          <w:szCs w:val="19"/>
+          <w:shd w:fill="EEEEEE" w:val="clear"/>
+        </w:rPr>
+        <w:t xml:space="preserve">ws_basis</w:t>
+      </w:r>
+      <w:r>
+        <w:rPr>
+          <w:rFonts w:ascii="Calibri" w:cs="Calibri" w:eastAsia="Microsoft YaHei" w:hAnsi="Calibri"/>
+        </w:rPr>
+        <w:t xml:space="preserve"> 和 5.5 的影像各项，按"文中能对应到这名儿童的信息"逐例判定。系列报告里一句汇总性的话（"所有患者均行超声检查"）只在它的范围</w:t>
+      </w:r>
+      <w:r>
+        <w:rPr>
+          <w:rFonts w:ascii="Calibri" w:cs="Calibri" w:eastAsia="Microsoft YaHei" w:hAnsi="Calibri"/>
+          <w:b/>
+          <w:bCs/>
+        </w:rPr>
+        <w:t xml:space="preserve">完全</w:t>
+      </w:r>
+      <w:r>
+        <w:rPr>
+          <w:rFonts w:ascii="Calibri" w:cs="Calibri" w:eastAsia="Microsoft YaHei" w:hAnsi="Calibri"/>
+        </w:rPr>
+        <w:t xml:space="preserve">覆盖这名儿童时才算这名儿童的证据；范围对不上的，影像项填 NR，</w:t>
+      </w:r>
+      <w:r>
+        <w:rPr>
+          <w:rFonts w:ascii="Consolas" w:cs="Consolas" w:eastAsia="Microsoft YaHei" w:hAnsi="Consolas"/>
+          <w:sz w:val="19"/>
+          <w:szCs w:val="19"/>
+          <w:shd w:fill="EEEEEE" w:val="clear"/>
+        </w:rPr>
+        <w:t xml:space="preserve">ws_basis</w:t>
+      </w:r>
+      <w:r>
+        <w:rPr>
+          <w:rFonts w:ascii="Calibri" w:cs="Calibri" w:eastAsia="Microsoft YaHei" w:hAnsi="Calibri"/>
+        </w:rPr>
+        <w:t xml:space="preserve"> 不据此选 Imaging。同一系列里不同儿童的依据可以不同，各填各的。</w:t>
+      </w:r>
+    </w:p>
+    <w:p>
+      <w:pPr>
+        <w:spacing w:after="120"/>
+      </w:pPr>
+      <w:r>
+        <w:rPr>
+          <w:rFonts w:ascii="Calibri" w:cs="Calibri" w:eastAsia="Microsoft YaHei" w:hAnsi="Calibri"/>
+          <w:b/>
+          <w:bCs/>
+        </w:rPr>
         <w:t xml:space="preserve">ws_basis 的五个值（全文指南 D1）：</w:t>
       </w:r>
     </w:p>
@@ -7978,7 +8446,7 @@
                 <w:sz w:val="19"/>
                 <w:szCs w:val="19"/>
               </w:rPr>
-              <w:t xml:space="preserve">影像和术中所见</w:t>
+              <w:t xml:space="preserve">对这名儿童，影像和术中所见</w:t>
             </w:r>
             <w:r>
               <w:rPr>
@@ -9225,7 +9693,77 @@
                 <w:sz w:val="19"/>
                 <w:szCs w:val="19"/>
               </w:rPr>
-              <w:t xml:space="preserve">天（按第 6 节）；含糊或没有写填 NR；只有报告里根本没有症状时间的也填 NR。不要写成 "2 days" 这样的文字，只写数字</w:t>
+              <w:t xml:space="preserve">天（按第 6 节）；含糊或没有写填 NR；只有报告里根本没有症状时间的也填 NR。不要写成 "2 days" 这样的文字，只写数字。</w:t>
+            </w:r>
+            <w:r>
+              <w:rPr>
+                <w:rFonts w:ascii="Calibri" w:cs="Calibri" w:eastAsia="Microsoft YaHei" w:hAnsi="Calibri"/>
+                <w:b/>
+                <w:bCs/>
+                <w:sz w:val="19"/>
+                <w:szCs w:val="19"/>
+              </w:rPr>
+              <w:t xml:space="preserve">【已裁定 X17】</w:t>
+            </w:r>
+            <w:r>
+              <w:rPr>
+                <w:rFonts w:ascii="Calibri" w:cs="Calibri" w:eastAsia="Microsoft YaHei" w:hAnsi="Calibri"/>
+                <w:sz w:val="19"/>
+                <w:szCs w:val="19"/>
+              </w:rPr>
+              <w:t xml:space="preserve"> 按原文</w:t>
+            </w:r>
+            <w:r>
+              <w:rPr>
+                <w:rFonts w:ascii="Calibri" w:cs="Calibri" w:eastAsia="Microsoft YaHei" w:hAnsi="Calibri"/>
+                <w:b/>
+                <w:bCs/>
+                <w:sz w:val="19"/>
+                <w:szCs w:val="19"/>
+              </w:rPr>
+              <w:t xml:space="preserve">能确定</w:t>
+            </w:r>
+            <w:r>
+              <w:rPr>
+                <w:rFonts w:ascii="Calibri" w:cs="Calibri" w:eastAsia="Microsoft YaHei" w:hAnsi="Calibri"/>
+                <w:sz w:val="19"/>
+                <w:szCs w:val="19"/>
+              </w:rPr>
+              <w:t xml:space="preserve">的症状起点和手术时间提取（规则 8 等）；起点或手术时间不精确、说不出具体天数的，</w:t>
+            </w:r>
+            <w:r>
+              <w:rPr>
+                <w:rFonts w:ascii="Consolas" w:cs="Consolas" w:eastAsia="Microsoft YaHei" w:hAnsi="Consolas"/>
+                <w:sz w:val="19"/>
+                <w:szCs w:val="19"/>
+                <w:shd w:fill="EEEEEE" w:val="clear"/>
+              </w:rPr>
+              <w:t xml:space="preserve">idx_dur_days</w:t>
+            </w:r>
+            <w:r>
+              <w:rPr>
+                <w:rFonts w:ascii="Calibri" w:cs="Calibri" w:eastAsia="Microsoft YaHei" w:hAnsi="Calibri"/>
+                <w:sz w:val="19"/>
+                <w:szCs w:val="19"/>
+              </w:rPr>
+              <w:t xml:space="preserve"> 填 NR，只在 </w:t>
+            </w:r>
+            <w:r>
+              <w:rPr>
+                <w:rFonts w:ascii="Consolas" w:cs="Consolas" w:eastAsia="Microsoft YaHei" w:hAnsi="Consolas"/>
+                <w:sz w:val="19"/>
+                <w:szCs w:val="19"/>
+                <w:shd w:fill="EEEEEE" w:val="clear"/>
+              </w:rPr>
+              <w:t xml:space="preserve">idx_dur_cat_imprecise</w:t>
+            </w:r>
+            <w:r>
+              <w:rPr>
+                <w:rFonts w:ascii="Calibri" w:cs="Calibri" w:eastAsia="Microsoft YaHei" w:hAnsi="Calibri"/>
+                <w:sz w:val="19"/>
+                <w:szCs w:val="19"/>
+              </w:rPr>
+              <w:t xml:space="preserve"> 里记类别，不要估一个天数</w:t>
             </w:r>
           </w:p>
         </w:tc>
@@ -9518,7 +10056,43 @@
                 <w:sz w:val="19"/>
                 <w:szCs w:val="19"/>
               </w:rPr>
-              <w:t xml:space="preserve">规则 9：用了入院时的持续时间并作为下限，填 Yes</w:t>
+              <w:t xml:space="preserve">规则 9：用了入院时的持续时间并作为下限，填 Yes。</w:t>
+            </w:r>
+            <w:r>
+              <w:rPr>
+                <w:rFonts w:ascii="Calibri" w:cs="Calibri" w:eastAsia="Microsoft YaHei" w:hAnsi="Calibri"/>
+                <w:b/>
+                <w:bCs/>
+                <w:sz w:val="19"/>
+                <w:szCs w:val="19"/>
+              </w:rPr>
+              <w:t xml:space="preserve">【已裁定 X16】</w:t>
+            </w:r>
+            <w:r>
+              <w:rPr>
+                <w:rFonts w:ascii="Calibri" w:cs="Calibri" w:eastAsia="Microsoft YaHei" w:hAnsi="Calibri"/>
+                <w:sz w:val="19"/>
+                <w:szCs w:val="19"/>
+              </w:rPr>
+              <w:t xml:space="preserve"> 报告只给了</w:t>
+            </w:r>
+            <w:r>
+              <w:rPr>
+                <w:rFonts w:ascii="Calibri" w:cs="Calibri" w:eastAsia="Microsoft YaHei" w:hAnsi="Calibri"/>
+                <w:b/>
+                <w:bCs/>
+                <w:sz w:val="19"/>
+                <w:szCs w:val="19"/>
+              </w:rPr>
+              <w:t xml:space="preserve">至就诊或入院前</w:t>
+            </w:r>
+            <w:r>
+              <w:rPr>
+                <w:rFonts w:ascii="Calibri" w:cs="Calibri" w:eastAsia="Microsoft YaHei" w:hAnsi="Calibri"/>
+                <w:sz w:val="19"/>
+                <w:szCs w:val="19"/>
+              </w:rPr>
+              <w:t xml:space="preserve">的症状时长、没有给出就诊或入院后到手术的时间时，一律标下限 Yes（不论是小时、天还是月）；给了手术时间的（包括写明"急诊手术""即刻手术"，规则 9 不加时间、不标下限）填 No</w:t>
             </w:r>
           </w:p>
         </w:tc>
@@ -9948,7 +10522,25 @@
                 <w:sz w:val="19"/>
                 <w:szCs w:val="19"/>
               </w:rPr>
-              <w:t xml:space="preserve">归因于游走脾的症状到手术的总病程（包括此前的发作）。换算同第 6 节。没有写填 NR</w:t>
+              <w:t xml:space="preserve">归因于游走脾的症状到手术的总病程（包括此前的发作）。换算同第 6 节。没有写填 NR。</w:t>
+            </w:r>
+            <w:r>
+              <w:rPr>
+                <w:rFonts w:ascii="Calibri" w:cs="Calibri" w:eastAsia="Microsoft YaHei" w:hAnsi="Calibri"/>
+                <w:b/>
+                <w:bCs/>
+                <w:sz w:val="19"/>
+                <w:szCs w:val="19"/>
+              </w:rPr>
+              <w:t xml:space="preserve">【已裁定 X15】</w:t>
+            </w:r>
+            <w:r>
+              <w:rPr>
+                <w:rFonts w:ascii="Calibri" w:cs="Calibri" w:eastAsia="Microsoft YaHei" w:hAnsi="Calibri"/>
+                <w:sz w:val="19"/>
+                <w:szCs w:val="19"/>
+              </w:rPr>
+              <w:t xml:space="preserve"> 不要把指数发作的时长（或"至就诊前"的时长）当作总病程自动填进来，只有原文明确写了总病程（或第一次症状的时间）才填</w:t>
             </w:r>
           </w:p>
         </w:tc>
@@ -10017,7 +10609,43 @@
                 <w:sz w:val="19"/>
                 <w:szCs w:val="19"/>
               </w:rPr>
-              <w:t xml:space="preserve">此前发作的次数（整数）；只写"反复发作"、没有次数填 NR</w:t>
+              <w:t xml:space="preserve">此前发作的次数（整数）；只写"反复发作"、没有次数填 NR。</w:t>
+            </w:r>
+            <w:r>
+              <w:rPr>
+                <w:rFonts w:ascii="Calibri" w:cs="Calibri" w:eastAsia="Microsoft YaHei" w:hAnsi="Calibri"/>
+                <w:b/>
+                <w:bCs/>
+                <w:sz w:val="19"/>
+                <w:szCs w:val="19"/>
+              </w:rPr>
+              <w:t xml:space="preserve">【已裁定 X15】</w:t>
+            </w:r>
+            <w:r>
+              <w:rPr>
+                <w:rFonts w:ascii="Calibri" w:cs="Calibri" w:eastAsia="Microsoft YaHei" w:hAnsi="Calibri"/>
+                <w:sz w:val="19"/>
+                <w:szCs w:val="19"/>
+              </w:rPr>
+              <w:t xml:space="preserve"> 原文没说有没有既往发作时填 NR，</w:t>
+            </w:r>
+            <w:r>
+              <w:rPr>
+                <w:rFonts w:ascii="Calibri" w:cs="Calibri" w:eastAsia="Microsoft YaHei" w:hAnsi="Calibri"/>
+                <w:b/>
+                <w:bCs/>
+                <w:sz w:val="19"/>
+                <w:szCs w:val="19"/>
+              </w:rPr>
+              <w:t xml:space="preserve">不要自动填 0</w:t>
+            </w:r>
+            <w:r>
+              <w:rPr>
+                <w:rFonts w:ascii="Calibri" w:cs="Calibri" w:eastAsia="Microsoft YaHei" w:hAnsi="Calibri"/>
+                <w:sz w:val="19"/>
+                <w:szCs w:val="19"/>
+              </w:rPr>
+              <w:t xml:space="preserve">；只有原文写明此前发作过几次（或明确写了此前没有发作）才填数字</w:t>
             </w:r>
           </w:p>
         </w:tc>
@@ -10259,7 +10887,7 @@
                 <w:sz w:val="19"/>
                 <w:szCs w:val="19"/>
               </w:rPr>
-              <w:t xml:space="preserve">本次发作之前已经诊断游走脾，当时没有手术（家属拒绝、建议观察、或已排期择期手术）：Yes</w:t>
+              <w:t xml:space="preserve">本次发作之前已经诊断游走脾，当时没有手术（家属拒绝、建议观察、或已排期择期手术）：Yes。原文没提这一点填 NR，只有原文明确写了"此前没有诊断"才填 No（X14）</w:t>
             </w:r>
           </w:p>
         </w:tc>
@@ -10594,6 +11222,20 @@
           <w:rFonts w:ascii="Calibri" w:cs="Calibri" w:eastAsia="Microsoft YaHei" w:hAnsi="Calibri"/>
         </w:rPr>
         <w:t xml:space="preserve">：做了的 Yes；报告明确没做的 No；没提 NR。</w:t>
+      </w:r>
+      <w:r>
+        <w:rPr>
+          <w:rFonts w:ascii="Calibri" w:cs="Calibri" w:eastAsia="Microsoft YaHei" w:hAnsi="Calibri"/>
+          <w:b/>
+          <w:bCs/>
+        </w:rPr>
+        <w:t xml:space="preserve">【已裁定 X18】</w:t>
+      </w:r>
+      <w:r>
+        <w:rPr>
+          <w:rFonts w:ascii="Calibri" w:cs="Calibri" w:eastAsia="Microsoft YaHei" w:hAnsi="Calibri"/>
+        </w:rPr>
+        <w:t xml:space="preserve"> 逐例对应：系列报告里"所有患者均行超声"这类汇总句，只在它的范围完全覆盖这名儿童时才算这名儿童做了；范围对不上的填 NR。</w:t>
       </w:r>
     </w:p>
     <w:p>
@@ -11032,7 +11674,25 @@
                 <w:sz w:val="19"/>
                 <w:szCs w:val="19"/>
               </w:rPr>
-              <w:t xml:space="preserve"> Viable / Partially non-viable / Non-viable / NR；未手术填 Not applicable。见第 7 节</w:t>
+              <w:t xml:space="preserve"> Viable / Partially non-viable / Non-viable / NR；未手术填 Not applicable。见第 7 节。</w:t>
+            </w:r>
+            <w:r>
+              <w:rPr>
+                <w:rFonts w:ascii="Calibri" w:cs="Calibri" w:eastAsia="Microsoft YaHei" w:hAnsi="Calibri"/>
+                <w:b/>
+                <w:bCs/>
+                <w:sz w:val="19"/>
+                <w:szCs w:val="19"/>
+              </w:rPr>
+              <w:t xml:space="preserve">【已裁定 X13】只采纳作者对术中脾状态的直接描述（脾紫黑、坏死、复位后转红等）；不由术式（做了脾切除）或影像（CT 显示梗死）反推。</w:t>
+            </w:r>
+            <w:r>
+              <w:rPr>
+                <w:rFonts w:ascii="Calibri" w:cs="Calibri" w:eastAsia="Microsoft YaHei" w:hAnsi="Calibri"/>
+                <w:sz w:val="19"/>
+                <w:szCs w:val="19"/>
+              </w:rPr>
+              <w:t xml:space="preserve"> 作者没有写术中脾状态的，填 NR</w:t>
             </w:r>
           </w:p>
         </w:tc>
@@ -11101,7 +11761,24 @@
                 <w:sz w:val="19"/>
                 <w:szCs w:val="19"/>
               </w:rPr>
-              <w:t xml:space="preserve">依据：Intraoperative（术中所见）/ Histology（病理）/ Both / NR；未手术 Not applicable</w:t>
+              <w:t xml:space="preserve">依据：Intraoperative（术中所见）/ Histology（病理）/ Both / NR；未手术 Not applicable。</w:t>
+            </w:r>
+            <w:r>
+              <w:rPr>
+                <w:rFonts w:ascii="Consolas" w:cs="Consolas" w:eastAsia="Microsoft YaHei" w:hAnsi="Consolas"/>
+                <w:sz w:val="19"/>
+                <w:szCs w:val="19"/>
+                <w:shd w:fill="EEEEEE" w:val="clear"/>
+              </w:rPr>
+              <w:t xml:space="preserve">viability</w:t>
+            </w:r>
+            <w:r>
+              <w:rPr>
+                <w:rFonts w:ascii="Calibri" w:cs="Calibri" w:eastAsia="Microsoft YaHei" w:hAnsi="Calibri"/>
+                <w:sz w:val="19"/>
+                <w:szCs w:val="19"/>
+              </w:rPr>
+              <w:t xml:space="preserve"> 是 NR 时这一项也填 NR（影像上的梗死写进 notes，不作为依据）</w:t>
             </w:r>
           </w:p>
         </w:tc>
@@ -11957,7 +12634,25 @@
                 <w:sz w:val="19"/>
                 <w:szCs w:val="19"/>
               </w:rPr>
-              <w:t xml:space="preserve">复发或再扭转；是否再次手术；细节自由文本</w:t>
+              <w:t xml:space="preserve">复发或再扭转；是否再次手术；细节自由文本。</w:t>
+            </w:r>
+            <w:r>
+              <w:rPr>
+                <w:rFonts w:ascii="Calibri" w:cs="Calibri" w:eastAsia="Microsoft YaHei" w:hAnsi="Calibri"/>
+                <w:b/>
+                <w:bCs/>
+                <w:sz w:val="19"/>
+                <w:szCs w:val="19"/>
+              </w:rPr>
+              <w:t xml:space="preserve">【已裁定 X14】</w:t>
+            </w:r>
+            <w:r>
+              <w:rPr>
+                <w:rFonts w:ascii="Calibri" w:cs="Calibri" w:eastAsia="Microsoft YaHei" w:hAnsi="Calibri"/>
+                <w:sz w:val="19"/>
+                <w:szCs w:val="19"/>
+              </w:rPr>
+              <w:t xml:space="preserve"> 随访里没有提复发或再手术的，填 NR；只有原文明确写了"无复发""未再手术"才填 No</w:t>
             </w:r>
           </w:p>
         </w:tc>
@@ -16579,6 +17274,113 @@
         <w:t xml:space="preserve"> 是灰色公式，会按下面的规则自动得出。</w:t>
       </w:r>
     </w:p>
+    <w:p>
+      <w:pPr>
+        <w:spacing w:after="120"/>
+      </w:pPr>
+      <w:r>
+        <w:rPr>
+          <w:rFonts w:ascii="Calibri" w:cs="Calibri" w:eastAsia="Microsoft YaHei" w:hAnsi="Calibri"/>
+          <w:b/>
+          <w:bCs/>
+        </w:rPr>
+        <w:t xml:space="preserve">【已裁定 X13，2026-10-25 校准讨论】</w:t>
+      </w:r>
+      <w:r>
+        <w:rPr>
+          <w:rFonts w:ascii="Calibri" w:cs="Calibri" w:eastAsia="Microsoft YaHei" w:hAnsi="Calibri"/>
+        </w:rPr>
+        <w:t xml:space="preserve"> </w:t>
+      </w:r>
+      <w:r>
+        <w:rPr>
+          <w:rFonts w:ascii="Consolas" w:cs="Consolas" w:eastAsia="Microsoft YaHei" w:hAnsi="Consolas"/>
+          <w:sz w:val="19"/>
+          <w:szCs w:val="19"/>
+          <w:shd w:fill="EEEEEE" w:val="clear"/>
+        </w:rPr>
+        <w:t xml:space="preserve">viability</w:t>
+      </w:r>
+      <w:r>
+        <w:rPr>
+          <w:rFonts w:ascii="Calibri" w:cs="Calibri" w:eastAsia="Microsoft YaHei" w:hAnsi="Calibri"/>
+        </w:rPr>
+        <w:t xml:space="preserve"> 只采纳</w:t>
+      </w:r>
+      <w:r>
+        <w:rPr>
+          <w:rFonts w:ascii="Calibri" w:cs="Calibri" w:eastAsia="Microsoft YaHei" w:hAnsi="Calibri"/>
+          <w:b/>
+          <w:bCs/>
+        </w:rPr>
+        <w:t xml:space="preserve">作者对术中脾状态的直接描述</w:t>
+      </w:r>
+      <w:r>
+        <w:rPr>
+          <w:rFonts w:ascii="Calibri" w:cs="Calibri" w:eastAsia="Microsoft YaHei" w:hAnsi="Calibri"/>
+        </w:rPr>
+        <w:t xml:space="preserve">；不由术式（"行全脾切除"）或影像（"CT 示脾梗死"）反推。作者没有写术中脾状态的，</w:t>
+      </w:r>
+      <w:r>
+        <w:rPr>
+          <w:rFonts w:ascii="Consolas" w:cs="Consolas" w:eastAsia="Microsoft YaHei" w:hAnsi="Consolas"/>
+          <w:sz w:val="19"/>
+          <w:szCs w:val="19"/>
+          <w:shd w:fill="EEEEEE" w:val="clear"/>
+        </w:rPr>
+        <w:t xml:space="preserve">viability</w:t>
+      </w:r>
+      <w:r>
+        <w:rPr>
+          <w:rFonts w:ascii="Calibri" w:cs="Calibri" w:eastAsia="Microsoft YaHei" w:hAnsi="Calibri"/>
+        </w:rPr>
+        <w:t xml:space="preserve"> 和 </w:t>
+      </w:r>
+      <w:r>
+        <w:rPr>
+          <w:rFonts w:ascii="Consolas" w:cs="Consolas" w:eastAsia="Microsoft YaHei" w:hAnsi="Consolas"/>
+          <w:sz w:val="19"/>
+          <w:szCs w:val="19"/>
+          <w:shd w:fill="EEEEEE" w:val="clear"/>
+        </w:rPr>
+        <w:t xml:space="preserve">viab_basis</w:t>
+      </w:r>
+      <w:r>
+        <w:rPr>
+          <w:rFonts w:ascii="Calibri" w:cs="Calibri" w:eastAsia="Microsoft YaHei" w:hAnsi="Calibri"/>
+        </w:rPr>
+        <w:t xml:space="preserve"> 都填 NR；术式照实填 </w:t>
+      </w:r>
+      <w:r>
+        <w:rPr>
+          <w:rFonts w:ascii="Consolas" w:cs="Consolas" w:eastAsia="Microsoft YaHei" w:hAnsi="Consolas"/>
+          <w:sz w:val="19"/>
+          <w:szCs w:val="19"/>
+          <w:shd w:fill="EEEEEE" w:val="clear"/>
+        </w:rPr>
+        <w:t xml:space="preserve">procedure</w:t>
+      </w:r>
+      <w:r>
+        <w:rPr>
+          <w:rFonts w:ascii="Calibri" w:cs="Calibri" w:eastAsia="Microsoft YaHei" w:hAnsi="Calibri"/>
+        </w:rPr>
+        <w:t xml:space="preserve">，影像所见写进 notes。后果是：有的儿童会得到"NR - removed, check reason"（做了脾切除、作者没写活力），这类儿童</w:t>
+      </w:r>
+      <w:r>
+        <w:rPr>
+          <w:rFonts w:ascii="Calibri" w:cs="Calibri" w:eastAsia="Microsoft YaHei" w:hAnsi="Calibri"/>
+          <w:b/>
+          <w:bCs/>
+        </w:rPr>
+        <w:t xml:space="preserve">暂不进主要结局的分析</w:t>
+      </w:r>
+      <w:r>
+        <w:rPr>
+          <w:rFonts w:ascii="Calibri" w:cs="Calibri" w:eastAsia="Microsoft YaHei" w:hAnsi="Calibri"/>
+        </w:rPr>
+        <w:t xml:space="preserve">，是否另做一个"脾切除即无活力"的补充分析是分析层面的事，由 Ji Wang 和作者决定，提取员不替他们推。</w:t>
+      </w:r>
+    </w:p>
     <w:tbl>
       <w:tblPr>
         <w:tblW w:type="dxa" w:w="9026"/>
@@ -18228,6 +19030,23 @@
                 <w:sz w:val="19"/>
                 <w:szCs w:val="19"/>
               </w:rPr>
+              <w:t xml:space="preserve"> = NR；</w:t>
+            </w:r>
+            <w:r>
+              <w:rPr>
+                <w:rFonts w:ascii="Consolas" w:cs="Consolas" w:eastAsia="Microsoft YaHei" w:hAnsi="Consolas"/>
+                <w:sz w:val="19"/>
+                <w:szCs w:val="19"/>
+                <w:shd w:fill="EEEEEE" w:val="clear"/>
+              </w:rPr>
+              <w:t xml:space="preserve">viab_basis</w:t>
+            </w:r>
+            <w:r>
+              <w:rPr>
+                <w:rFonts w:ascii="Calibri" w:cs="Calibri" w:eastAsia="Microsoft YaHei" w:hAnsi="Calibri"/>
+                <w:sz w:val="19"/>
+                <w:szCs w:val="19"/>
+              </w:rPr>
               <w:t xml:space="preserve"> = NR；公式得出"NR - removed, check reason"。</w:t>
             </w:r>
             <w:r>
@@ -18246,7 +19065,301 @@
                 <w:sz w:val="19"/>
                 <w:szCs w:val="19"/>
               </w:rPr>
-              <w:t xml:space="preserve">，作者的描述（如"脾脏梗死"）可能写在讨论里；真的没有就留 NR</w:t>
+              <w:t xml:space="preserve">，作者对术中脾状态的描述（如"脾脏梗死"）可能写在讨论里；真的没有就留 NR。</w:t>
+            </w:r>
+            <w:r>
+              <w:rPr>
+                <w:rFonts w:ascii="Calibri" w:cs="Calibri" w:eastAsia="Microsoft YaHei" w:hAnsi="Calibri"/>
+                <w:b/>
+                <w:bCs/>
+                <w:sz w:val="19"/>
+                <w:szCs w:val="19"/>
+              </w:rPr>
+              <w:t xml:space="preserve">【已裁定 X13】</w:t>
+            </w:r>
+            <w:r>
+              <w:rPr>
+                <w:rFonts w:ascii="Calibri" w:cs="Calibri" w:eastAsia="Microsoft YaHei" w:hAnsi="Calibri"/>
+                <w:sz w:val="19"/>
+                <w:szCs w:val="19"/>
+              </w:rPr>
+              <w:t xml:space="preserve"> 不要因为做了脾切除就填 Non-viable</w:t>
+            </w:r>
+          </w:p>
+        </w:tc>
+      </w:tr>
+      <w:tr>
+        <w:trPr>
+          <w:cantSplit/>
+          <w:tblHeader w:val="false"/>
+        </w:trPr>
+        <w:tc>
+          <w:tcPr>
+            <w:tcW w:type="dxa" w:w="3610"/>
+            <w:tcBorders>
+              <w:top w:val="single" w:color="BBBBBB" w:sz="4"/>
+              <w:left w:val="single" w:color="BBBBBB" w:sz="4"/>
+              <w:bottom w:val="single" w:color="BBBBBB" w:sz="4"/>
+              <w:right w:val="single" w:color="BBBBBB" w:sz="4"/>
+            </w:tcBorders>
+            <w:tcMar>
+              <w:top w:type="dxa" w:w="55"/>
+              <w:left w:type="dxa" w:w="95"/>
+              <w:bottom w:type="dxa" w:w="55"/>
+              <w:right w:type="dxa" w:w="95"/>
+            </w:tcMar>
+            <w:vAlign w:val="top"/>
+          </w:tcPr>
+          <w:p>
+            <w:pPr>
+              <w:spacing w:after="0"/>
+            </w:pPr>
+            <w:r>
+              <w:rPr>
+                <w:rFonts w:ascii="Calibri" w:cs="Calibri" w:eastAsia="Microsoft YaHei" w:hAnsi="Calibri"/>
+                <w:sz w:val="19"/>
+                <w:szCs w:val="19"/>
+              </w:rPr>
+              <w:t xml:space="preserve">术前 CT 显示脾梗死，手术行全脾切除，文中没有写术中所见和病理</w:t>
+            </w:r>
+          </w:p>
+        </w:tc>
+        <w:tc>
+          <w:tcPr>
+            <w:tcW w:type="dxa" w:w="5416"/>
+            <w:tcBorders>
+              <w:top w:val="single" w:color="BBBBBB" w:sz="4"/>
+              <w:left w:val="single" w:color="BBBBBB" w:sz="4"/>
+              <w:bottom w:val="single" w:color="BBBBBB" w:sz="4"/>
+              <w:right w:val="single" w:color="BBBBBB" w:sz="4"/>
+            </w:tcBorders>
+            <w:tcMar>
+              <w:top w:type="dxa" w:w="55"/>
+              <w:left w:type="dxa" w:w="95"/>
+              <w:bottom w:type="dxa" w:w="55"/>
+              <w:right w:type="dxa" w:w="95"/>
+            </w:tcMar>
+            <w:vAlign w:val="top"/>
+          </w:tcPr>
+          <w:p>
+            <w:pPr>
+              <w:spacing w:after="0"/>
+            </w:pPr>
+            <w:r>
+              <w:rPr>
+                <w:rFonts w:ascii="Consolas" w:cs="Consolas" w:eastAsia="Microsoft YaHei" w:hAnsi="Consolas"/>
+                <w:sz w:val="19"/>
+                <w:szCs w:val="19"/>
+                <w:shd w:fill="EEEEEE" w:val="clear"/>
+              </w:rPr>
+              <w:t xml:space="preserve">viability</w:t>
+            </w:r>
+            <w:r>
+              <w:rPr>
+                <w:rFonts w:ascii="Calibri" w:cs="Calibri" w:eastAsia="Microsoft YaHei" w:hAnsi="Calibri"/>
+                <w:sz w:val="19"/>
+                <w:szCs w:val="19"/>
+              </w:rPr>
+              <w:t xml:space="preserve"> = NR；</w:t>
+            </w:r>
+            <w:r>
+              <w:rPr>
+                <w:rFonts w:ascii="Consolas" w:cs="Consolas" w:eastAsia="Microsoft YaHei" w:hAnsi="Consolas"/>
+                <w:sz w:val="19"/>
+                <w:szCs w:val="19"/>
+                <w:shd w:fill="EEEEEE" w:val="clear"/>
+              </w:rPr>
+              <w:t xml:space="preserve">viab_basis</w:t>
+            </w:r>
+            <w:r>
+              <w:rPr>
+                <w:rFonts w:ascii="Calibri" w:cs="Calibri" w:eastAsia="Microsoft YaHei" w:hAnsi="Calibri"/>
+                <w:sz w:val="19"/>
+                <w:szCs w:val="19"/>
+              </w:rPr>
+              <w:t xml:space="preserve"> = NR；CT 所见写进 notes。</w:t>
+            </w:r>
+            <w:r>
+              <w:rPr>
+                <w:rFonts w:ascii="Calibri" w:cs="Calibri" w:eastAsia="Microsoft YaHei" w:hAnsi="Calibri"/>
+                <w:b/>
+                <w:bCs/>
+                <w:sz w:val="19"/>
+                <w:szCs w:val="19"/>
+              </w:rPr>
+              <w:t xml:space="preserve">【已裁定 X13】</w:t>
+            </w:r>
+            <w:r>
+              <w:rPr>
+                <w:rFonts w:ascii="Calibri" w:cs="Calibri" w:eastAsia="Microsoft YaHei" w:hAnsi="Calibri"/>
+                <w:sz w:val="19"/>
+                <w:szCs w:val="19"/>
+              </w:rPr>
+              <w:t xml:space="preserve"> 影像上的梗死不作为活力的依据</w:t>
+            </w:r>
+          </w:p>
+        </w:tc>
+      </w:tr>
+      <w:tr>
+        <w:trPr>
+          <w:cantSplit/>
+          <w:tblHeader w:val="false"/>
+        </w:trPr>
+        <w:tc>
+          <w:tcPr>
+            <w:tcW w:type="dxa" w:w="3610"/>
+            <w:tcBorders>
+              <w:top w:val="single" w:color="BBBBBB" w:sz="4"/>
+              <w:left w:val="single" w:color="BBBBBB" w:sz="4"/>
+              <w:bottom w:val="single" w:color="BBBBBB" w:sz="4"/>
+              <w:right w:val="single" w:color="BBBBBB" w:sz="4"/>
+            </w:tcBorders>
+            <w:tcMar>
+              <w:top w:type="dxa" w:w="55"/>
+              <w:left w:type="dxa" w:w="95"/>
+              <w:bottom w:type="dxa" w:w="55"/>
+              <w:right w:type="dxa" w:w="95"/>
+            </w:tcMar>
+            <w:vAlign w:val="top"/>
+          </w:tcPr>
+          <w:p>
+            <w:pPr>
+              <w:spacing w:after="0"/>
+            </w:pPr>
+            <w:r>
+              <w:rPr>
+                <w:rFonts w:ascii="Calibri" w:cs="Calibri" w:eastAsia="Microsoft YaHei" w:hAnsi="Calibri"/>
+                <w:sz w:val="19"/>
+                <w:szCs w:val="19"/>
+              </w:rPr>
+              <w:t xml:space="preserve">术中脾脏已自行复位，作者没有写脾脏活力，脾上没有做任何手术（只为别的目的开腹，如胃造瘘）</w:t>
+            </w:r>
+          </w:p>
+        </w:tc>
+        <w:tc>
+          <w:tcPr>
+            <w:tcW w:type="dxa" w:w="5416"/>
+            <w:tcBorders>
+              <w:top w:val="single" w:color="BBBBBB" w:sz="4"/>
+              <w:left w:val="single" w:color="BBBBBB" w:sz="4"/>
+              <w:bottom w:val="single" w:color="BBBBBB" w:sz="4"/>
+              <w:right w:val="single" w:color="BBBBBB" w:sz="4"/>
+            </w:tcBorders>
+            <w:tcMar>
+              <w:top w:type="dxa" w:w="55"/>
+              <w:left w:type="dxa" w:w="95"/>
+              <w:bottom w:type="dxa" w:w="55"/>
+              <w:right w:type="dxa" w:w="95"/>
+            </w:tcMar>
+            <w:vAlign w:val="top"/>
+          </w:tcPr>
+          <w:p>
+            <w:pPr>
+              <w:spacing w:after="0"/>
+            </w:pPr>
+            <w:r>
+              <w:rPr>
+                <w:rFonts w:ascii="Consolas" w:cs="Consolas" w:eastAsia="Microsoft YaHei" w:hAnsi="Consolas"/>
+                <w:sz w:val="19"/>
+                <w:szCs w:val="19"/>
+                <w:shd w:fill="EEEEEE" w:val="clear"/>
+              </w:rPr>
+              <w:t xml:space="preserve">procedure</w:t>
+            </w:r>
+            <w:r>
+              <w:rPr>
+                <w:rFonts w:ascii="Calibri" w:cs="Calibri" w:eastAsia="Microsoft YaHei" w:hAnsi="Calibri"/>
+                <w:sz w:val="19"/>
+                <w:szCs w:val="19"/>
+              </w:rPr>
+              <w:t xml:space="preserve"> = No operation（指脾没有做手术）；</w:t>
+            </w:r>
+            <w:r>
+              <w:rPr>
+                <w:rFonts w:ascii="Consolas" w:cs="Consolas" w:eastAsia="Microsoft YaHei" w:hAnsi="Consolas"/>
+                <w:sz w:val="19"/>
+                <w:szCs w:val="19"/>
+                <w:shd w:fill="EEEEEE" w:val="clear"/>
+              </w:rPr>
+              <w:t xml:space="preserve">torsion_at_op</w:t>
+            </w:r>
+            <w:r>
+              <w:rPr>
+                <w:rFonts w:ascii="Calibri" w:cs="Calibri" w:eastAsia="Microsoft YaHei" w:hAnsi="Calibri"/>
+                <w:sz w:val="19"/>
+                <w:szCs w:val="19"/>
+              </w:rPr>
+              <w:t xml:space="preserve"> 按原文；</w:t>
+            </w:r>
+            <w:r>
+              <w:rPr>
+                <w:rFonts w:ascii="Consolas" w:cs="Consolas" w:eastAsia="Microsoft YaHei" w:hAnsi="Consolas"/>
+                <w:sz w:val="19"/>
+                <w:szCs w:val="19"/>
+                <w:shd w:fill="EEEEEE" w:val="clear"/>
+              </w:rPr>
+              <w:t xml:space="preserve">viability</w:t>
+            </w:r>
+            <w:r>
+              <w:rPr>
+                <w:rFonts w:ascii="Calibri" w:cs="Calibri" w:eastAsia="Microsoft YaHei" w:hAnsi="Calibri"/>
+                <w:sz w:val="19"/>
+                <w:szCs w:val="19"/>
+              </w:rPr>
+              <w:t xml:space="preserve">、</w:t>
+            </w:r>
+            <w:r>
+              <w:rPr>
+                <w:rFonts w:ascii="Consolas" w:cs="Consolas" w:eastAsia="Microsoft YaHei" w:hAnsi="Consolas"/>
+                <w:sz w:val="19"/>
+                <w:szCs w:val="19"/>
+                <w:shd w:fill="EEEEEE" w:val="clear"/>
+              </w:rPr>
+              <w:t xml:space="preserve">viab_basis</w:t>
+            </w:r>
+            <w:r>
+              <w:rPr>
+                <w:rFonts w:ascii="Calibri" w:cs="Calibri" w:eastAsia="Microsoft YaHei" w:hAnsi="Calibri"/>
+                <w:sz w:val="19"/>
+                <w:szCs w:val="19"/>
+              </w:rPr>
+              <w:t xml:space="preserve"> = NR。</w:t>
+            </w:r>
+            <w:r>
+              <w:rPr>
+                <w:rFonts w:ascii="Calibri" w:cs="Calibri" w:eastAsia="Microsoft YaHei" w:hAnsi="Calibri"/>
+                <w:b/>
+                <w:bCs/>
+                <w:sz w:val="19"/>
+                <w:szCs w:val="19"/>
+              </w:rPr>
+              <w:t xml:space="preserve">【Claude 的读法，待确认】</w:t>
+            </w:r>
+            <w:r>
+              <w:rPr>
+                <w:rFonts w:ascii="Calibri" w:cs="Calibri" w:eastAsia="Microsoft YaHei" w:hAnsi="Calibri"/>
+                <w:sz w:val="19"/>
+                <w:szCs w:val="19"/>
+              </w:rPr>
+              <w:t xml:space="preserve"> 这是对 WS1859_P16 一例裁定结果的一般化；它和上面"未手术的填 Not applicable"不同之处在于这名儿童</w:t>
+            </w:r>
+            <w:r>
+              <w:rPr>
+                <w:rFonts w:ascii="Calibri" w:cs="Calibri" w:eastAsia="Microsoft YaHei" w:hAnsi="Calibri"/>
+                <w:b/>
+                <w:bCs/>
+                <w:sz w:val="19"/>
+                <w:szCs w:val="19"/>
+              </w:rPr>
+              <w:t xml:space="preserve">开过腹</w:t>
+            </w:r>
+            <w:r>
+              <w:rPr>
+                <w:rFonts w:ascii="Calibri" w:cs="Calibri" w:eastAsia="Microsoft YaHei" w:hAnsi="Calibri"/>
+                <w:sz w:val="19"/>
+                <w:szCs w:val="19"/>
+              </w:rPr>
+              <w:t xml:space="preserve">、只是作者没有写脾脏的状态</w:t>
             </w:r>
           </w:p>
         </w:tc>
@@ -21735,7 +22848,7 @@
         <w:rPr>
           <w:rFonts w:ascii="Calibri" w:cs="Calibri" w:eastAsia="Microsoft YaHei" w:hAnsi="Calibri"/>
         </w:rPr>
-        <w:t xml:space="preserve">，把"统一的读法"（第 12 节）写下来，更新这份说明；需要时改提取表。</w:t>
+        <w:t xml:space="preserve">，把"统一的读法"（第 12 节）写下来，更新这份说明；需要时改提取表。（2026 年 10 月 25 日的这一轮：讨论清单第 1–8 点已讨论并由杨俊裁定，读法写在 X13–X20；第 9、10 点没有裁定结果。）</w:t>
       </w:r>
     </w:p>
     <w:p>
@@ -23850,11 +24963,981 @@
           </w:p>
         </w:tc>
       </w:tr>
+      <w:tr>
+        <w:trPr>
+          <w:cantSplit/>
+          <w:tblHeader w:val="false"/>
+        </w:trPr>
+        <w:tc>
+          <w:tcPr>
+            <w:tcW w:type="dxa" w:w="542"/>
+            <w:tcBorders>
+              <w:top w:val="single" w:color="BBBBBB" w:sz="4"/>
+              <w:left w:val="single" w:color="BBBBBB" w:sz="4"/>
+              <w:bottom w:val="single" w:color="BBBBBB" w:sz="4"/>
+              <w:right w:val="single" w:color="BBBBBB" w:sz="4"/>
+            </w:tcBorders>
+            <w:tcMar>
+              <w:top w:type="dxa" w:w="55"/>
+              <w:left w:type="dxa" w:w="95"/>
+              <w:bottom w:type="dxa" w:w="55"/>
+              <w:right w:type="dxa" w:w="95"/>
+            </w:tcMar>
+            <w:vAlign w:val="top"/>
+          </w:tcPr>
+          <w:p>
+            <w:pPr>
+              <w:spacing w:after="0"/>
+            </w:pPr>
+            <w:r>
+              <w:rPr>
+                <w:rFonts w:ascii="Calibri" w:cs="Calibri" w:eastAsia="Microsoft YaHei" w:hAnsi="Calibri"/>
+                <w:sz w:val="19"/>
+                <w:szCs w:val="19"/>
+              </w:rPr>
+              <w:t xml:space="preserve">X13</w:t>
+            </w:r>
+          </w:p>
+        </w:tc>
+        <w:tc>
+          <w:tcPr>
+            <w:tcW w:type="dxa" w:w="5055"/>
+            <w:tcBorders>
+              <w:top w:val="single" w:color="BBBBBB" w:sz="4"/>
+              <w:left w:val="single" w:color="BBBBBB" w:sz="4"/>
+              <w:bottom w:val="single" w:color="BBBBBB" w:sz="4"/>
+              <w:right w:val="single" w:color="BBBBBB" w:sz="4"/>
+            </w:tcBorders>
+            <w:tcMar>
+              <w:top w:type="dxa" w:w="55"/>
+              <w:left w:type="dxa" w:w="95"/>
+              <w:bottom w:type="dxa" w:w="55"/>
+              <w:right w:type="dxa" w:w="95"/>
+            </w:tcMar>
+            <w:vAlign w:val="top"/>
+          </w:tcPr>
+          <w:p>
+            <w:pPr>
+              <w:spacing w:after="0"/>
+            </w:pPr>
+            <w:r>
+              <w:rPr>
+                <w:rFonts w:ascii="Calibri" w:cs="Calibri" w:eastAsia="Microsoft YaHei" w:hAnsi="Calibri"/>
+                <w:sz w:val="19"/>
+                <w:szCs w:val="19"/>
+              </w:rPr>
+              <w:t xml:space="preserve">脾脏活力从哪里来（讨论清单第 1 点）</w:t>
+            </w:r>
+          </w:p>
+        </w:tc>
+        <w:tc>
+          <w:tcPr>
+            <w:tcW w:type="dxa" w:w="3429"/>
+            <w:tcBorders>
+              <w:top w:val="single" w:color="BBBBBB" w:sz="4"/>
+              <w:left w:val="single" w:color="BBBBBB" w:sz="4"/>
+              <w:bottom w:val="single" w:color="BBBBBB" w:sz="4"/>
+              <w:right w:val="single" w:color="BBBBBB" w:sz="4"/>
+            </w:tcBorders>
+            <w:tcMar>
+              <w:top w:type="dxa" w:w="55"/>
+              <w:left w:type="dxa" w:w="95"/>
+              <w:bottom w:type="dxa" w:w="55"/>
+              <w:right w:type="dxa" w:w="95"/>
+            </w:tcMar>
+            <w:vAlign w:val="top"/>
+          </w:tcPr>
+          <w:p>
+            <w:pPr>
+              <w:spacing w:after="0"/>
+            </w:pPr>
+            <w:r>
+              <w:rPr>
+                <w:rFonts w:ascii="Calibri" w:cs="Calibri" w:eastAsia="Microsoft YaHei" w:hAnsi="Calibri"/>
+                <w:sz w:val="19"/>
+                <w:szCs w:val="19"/>
+              </w:rPr>
+              <w:t xml:space="preserve">只采纳作者对术中脾状态的直接描述；不由术式或影像反推；没写填 NR，</w:t>
+            </w:r>
+            <w:r>
+              <w:rPr>
+                <w:rFonts w:ascii="Consolas" w:cs="Consolas" w:eastAsia="Microsoft YaHei" w:hAnsi="Consolas"/>
+                <w:sz w:val="19"/>
+                <w:szCs w:val="19"/>
+                <w:shd w:fill="EEEEEE" w:val="clear"/>
+              </w:rPr>
+              <w:t xml:space="preserve">viab_basis</w:t>
+            </w:r>
+            <w:r>
+              <w:rPr>
+                <w:rFonts w:ascii="Calibri" w:cs="Calibri" w:eastAsia="Microsoft YaHei" w:hAnsi="Calibri"/>
+                <w:sz w:val="19"/>
+                <w:szCs w:val="19"/>
+              </w:rPr>
+              <w:t xml:space="preserve"> 也填 NR。【已裁定，杨俊按原文，2026-10-25】</w:t>
+            </w:r>
+          </w:p>
+        </w:tc>
+      </w:tr>
+      <w:tr>
+        <w:trPr>
+          <w:cantSplit/>
+          <w:tblHeader w:val="false"/>
+        </w:trPr>
+        <w:tc>
+          <w:tcPr>
+            <w:tcW w:type="dxa" w:w="542"/>
+            <w:tcBorders>
+              <w:top w:val="single" w:color="BBBBBB" w:sz="4"/>
+              <w:left w:val="single" w:color="BBBBBB" w:sz="4"/>
+              <w:bottom w:val="single" w:color="BBBBBB" w:sz="4"/>
+              <w:right w:val="single" w:color="BBBBBB" w:sz="4"/>
+            </w:tcBorders>
+            <w:tcMar>
+              <w:top w:type="dxa" w:w="55"/>
+              <w:left w:type="dxa" w:w="95"/>
+              <w:bottom w:type="dxa" w:w="55"/>
+              <w:right w:type="dxa" w:w="95"/>
+            </w:tcMar>
+            <w:vAlign w:val="top"/>
+          </w:tcPr>
+          <w:p>
+            <w:pPr>
+              <w:spacing w:after="0"/>
+            </w:pPr>
+            <w:r>
+              <w:rPr>
+                <w:rFonts w:ascii="Calibri" w:cs="Calibri" w:eastAsia="Microsoft YaHei" w:hAnsi="Calibri"/>
+                <w:sz w:val="19"/>
+                <w:szCs w:val="19"/>
+              </w:rPr>
+              <w:t xml:space="preserve">X14</w:t>
+            </w:r>
+          </w:p>
+        </w:tc>
+        <w:tc>
+          <w:tcPr>
+            <w:tcW w:type="dxa" w:w="5055"/>
+            <w:tcBorders>
+              <w:top w:val="single" w:color="BBBBBB" w:sz="4"/>
+              <w:left w:val="single" w:color="BBBBBB" w:sz="4"/>
+              <w:bottom w:val="single" w:color="BBBBBB" w:sz="4"/>
+              <w:right w:val="single" w:color="BBBBBB" w:sz="4"/>
+            </w:tcBorders>
+            <w:tcMar>
+              <w:top w:type="dxa" w:w="55"/>
+              <w:left w:type="dxa" w:w="95"/>
+              <w:bottom w:type="dxa" w:w="55"/>
+              <w:right w:type="dxa" w:w="95"/>
+            </w:tcMar>
+            <w:vAlign w:val="top"/>
+          </w:tcPr>
+          <w:p>
+            <w:pPr>
+              <w:spacing w:after="0"/>
+            </w:pPr>
+            <w:r>
+              <w:rPr>
+                <w:rFonts w:ascii="Calibri" w:cs="Calibri" w:eastAsia="Microsoft YaHei" w:hAnsi="Calibri"/>
+                <w:sz w:val="19"/>
+                <w:szCs w:val="19"/>
+              </w:rPr>
+              <w:t xml:space="preserve">没提的项目填 No 还是 NR（第 2 点）</w:t>
+            </w:r>
+          </w:p>
+        </w:tc>
+        <w:tc>
+          <w:tcPr>
+            <w:tcW w:type="dxa" w:w="3429"/>
+            <w:tcBorders>
+              <w:top w:val="single" w:color="BBBBBB" w:sz="4"/>
+              <w:left w:val="single" w:color="BBBBBB" w:sz="4"/>
+              <w:bottom w:val="single" w:color="BBBBBB" w:sz="4"/>
+              <w:right w:val="single" w:color="BBBBBB" w:sz="4"/>
+            </w:tcBorders>
+            <w:tcMar>
+              <w:top w:type="dxa" w:w="55"/>
+              <w:left w:type="dxa" w:w="95"/>
+              <w:bottom w:type="dxa" w:w="55"/>
+              <w:right w:type="dxa" w:w="95"/>
+            </w:tcMar>
+            <w:vAlign w:val="top"/>
+          </w:tcPr>
+          <w:p>
+            <w:pPr>
+              <w:spacing w:after="0"/>
+            </w:pPr>
+            <w:r>
+              <w:rPr>
+                <w:rFonts w:ascii="Calibri" w:cs="Calibri" w:eastAsia="Microsoft YaHei" w:hAnsi="Calibri"/>
+                <w:sz w:val="19"/>
+                <w:szCs w:val="19"/>
+              </w:rPr>
+              <w:t xml:space="preserve">没提填 NR；只有原文明确否定才填 No。适用于伴随疾病、</w:t>
+            </w:r>
+            <w:r>
+              <w:rPr>
+                <w:rFonts w:ascii="Consolas" w:cs="Consolas" w:eastAsia="Microsoft YaHei" w:hAnsi="Consolas"/>
+                <w:sz w:val="19"/>
+                <w:szCs w:val="19"/>
+                <w:shd w:fill="EEEEEE" w:val="clear"/>
+              </w:rPr>
+              <w:t xml:space="preserve">known_dx_deferred</w:t>
+            </w:r>
+            <w:r>
+              <w:rPr>
+                <w:rFonts w:ascii="Calibri" w:cs="Calibri" w:eastAsia="Microsoft YaHei" w:hAnsi="Calibri"/>
+                <w:sz w:val="19"/>
+                <w:szCs w:val="19"/>
+              </w:rPr>
+              <w:t xml:space="preserve">、</w:t>
+            </w:r>
+            <w:r>
+              <w:rPr>
+                <w:rFonts w:ascii="Consolas" w:cs="Consolas" w:eastAsia="Microsoft YaHei" w:hAnsi="Consolas"/>
+                <w:sz w:val="19"/>
+                <w:szCs w:val="19"/>
+                <w:shd w:fill="EEEEEE" w:val="clear"/>
+              </w:rPr>
+              <w:t xml:space="preserve">recurrence</w:t>
+            </w:r>
+            <w:r>
+              <w:rPr>
+                <w:rFonts w:ascii="Calibri" w:cs="Calibri" w:eastAsia="Microsoft YaHei" w:hAnsi="Calibri"/>
+                <w:sz w:val="19"/>
+                <w:szCs w:val="19"/>
+              </w:rPr>
+              <w:t xml:space="preserve">、</w:t>
+            </w:r>
+            <w:r>
+              <w:rPr>
+                <w:rFonts w:ascii="Consolas" w:cs="Consolas" w:eastAsia="Microsoft YaHei" w:hAnsi="Consolas"/>
+                <w:sz w:val="19"/>
+                <w:szCs w:val="19"/>
+                <w:shd w:fill="EEEEEE" w:val="clear"/>
+              </w:rPr>
+              <w:t xml:space="preserve">further_surgery</w:t>
+            </w:r>
+            <w:r>
+              <w:rPr>
+                <w:rFonts w:ascii="Calibri" w:cs="Calibri" w:eastAsia="Microsoft YaHei" w:hAnsi="Calibri"/>
+                <w:sz w:val="19"/>
+                <w:szCs w:val="19"/>
+              </w:rPr>
+              <w:t xml:space="preserve"> 等。【已裁定】</w:t>
+            </w:r>
+          </w:p>
+        </w:tc>
+      </w:tr>
+      <w:tr>
+        <w:trPr>
+          <w:cantSplit/>
+          <w:tblHeader w:val="false"/>
+        </w:trPr>
+        <w:tc>
+          <w:tcPr>
+            <w:tcW w:type="dxa" w:w="542"/>
+            <w:tcBorders>
+              <w:top w:val="single" w:color="BBBBBB" w:sz="4"/>
+              <w:left w:val="single" w:color="BBBBBB" w:sz="4"/>
+              <w:bottom w:val="single" w:color="BBBBBB" w:sz="4"/>
+              <w:right w:val="single" w:color="BBBBBB" w:sz="4"/>
+            </w:tcBorders>
+            <w:tcMar>
+              <w:top w:type="dxa" w:w="55"/>
+              <w:left w:type="dxa" w:w="95"/>
+              <w:bottom w:type="dxa" w:w="55"/>
+              <w:right w:type="dxa" w:w="95"/>
+            </w:tcMar>
+            <w:vAlign w:val="top"/>
+          </w:tcPr>
+          <w:p>
+            <w:pPr>
+              <w:spacing w:after="0"/>
+            </w:pPr>
+            <w:r>
+              <w:rPr>
+                <w:rFonts w:ascii="Calibri" w:cs="Calibri" w:eastAsia="Microsoft YaHei" w:hAnsi="Calibri"/>
+                <w:sz w:val="19"/>
+                <w:szCs w:val="19"/>
+              </w:rPr>
+              <w:t xml:space="preserve">X15</w:t>
+            </w:r>
+          </w:p>
+        </w:tc>
+        <w:tc>
+          <w:tcPr>
+            <w:tcW w:type="dxa" w:w="5055"/>
+            <w:tcBorders>
+              <w:top w:val="single" w:color="BBBBBB" w:sz="4"/>
+              <w:left w:val="single" w:color="BBBBBB" w:sz="4"/>
+              <w:bottom w:val="single" w:color="BBBBBB" w:sz="4"/>
+              <w:right w:val="single" w:color="BBBBBB" w:sz="4"/>
+            </w:tcBorders>
+            <w:tcMar>
+              <w:top w:type="dxa" w:w="55"/>
+              <w:left w:type="dxa" w:w="95"/>
+              <w:bottom w:type="dxa" w:w="55"/>
+              <w:right w:type="dxa" w:w="95"/>
+            </w:tcMar>
+            <w:vAlign w:val="top"/>
+          </w:tcPr>
+          <w:p>
+            <w:pPr>
+              <w:spacing w:after="0"/>
+            </w:pPr>
+            <w:r>
+              <w:rPr>
+                <w:rFonts w:ascii="Calibri" w:cs="Calibri" w:eastAsia="Microsoft YaHei" w:hAnsi="Calibri"/>
+                <w:sz w:val="19"/>
+                <w:szCs w:val="19"/>
+              </w:rPr>
+              <w:t xml:space="preserve">总病程和既往发作次数（第 3 点）</w:t>
+            </w:r>
+          </w:p>
+        </w:tc>
+        <w:tc>
+          <w:tcPr>
+            <w:tcW w:type="dxa" w:w="3429"/>
+            <w:tcBorders>
+              <w:top w:val="single" w:color="BBBBBB" w:sz="4"/>
+              <w:left w:val="single" w:color="BBBBBB" w:sz="4"/>
+              <w:bottom w:val="single" w:color="BBBBBB" w:sz="4"/>
+              <w:right w:val="single" w:color="BBBBBB" w:sz="4"/>
+            </w:tcBorders>
+            <w:tcMar>
+              <w:top w:type="dxa" w:w="55"/>
+              <w:left w:type="dxa" w:w="95"/>
+              <w:bottom w:type="dxa" w:w="55"/>
+              <w:right w:type="dxa" w:w="95"/>
+            </w:tcMar>
+            <w:vAlign w:val="top"/>
+          </w:tcPr>
+          <w:p>
+            <w:pPr>
+              <w:spacing w:after="0"/>
+            </w:pPr>
+            <w:r>
+              <w:rPr>
+                <w:rFonts w:ascii="Calibri" w:cs="Calibri" w:eastAsia="Microsoft YaHei" w:hAnsi="Calibri"/>
+                <w:sz w:val="19"/>
+                <w:szCs w:val="19"/>
+              </w:rPr>
+              <w:t xml:space="preserve">不把指数发作时长或未说明的既往发作自动写成总病程或 0；原文没写填 NR。【已裁定】</w:t>
+            </w:r>
+          </w:p>
+        </w:tc>
+      </w:tr>
+      <w:tr>
+        <w:trPr>
+          <w:cantSplit/>
+          <w:tblHeader w:val="false"/>
+        </w:trPr>
+        <w:tc>
+          <w:tcPr>
+            <w:tcW w:type="dxa" w:w="542"/>
+            <w:tcBorders>
+              <w:top w:val="single" w:color="BBBBBB" w:sz="4"/>
+              <w:left w:val="single" w:color="BBBBBB" w:sz="4"/>
+              <w:bottom w:val="single" w:color="BBBBBB" w:sz="4"/>
+              <w:right w:val="single" w:color="BBBBBB" w:sz="4"/>
+            </w:tcBorders>
+            <w:tcMar>
+              <w:top w:type="dxa" w:w="55"/>
+              <w:left w:type="dxa" w:w="95"/>
+              <w:bottom w:type="dxa" w:w="55"/>
+              <w:right w:type="dxa" w:w="95"/>
+            </w:tcMar>
+            <w:vAlign w:val="top"/>
+          </w:tcPr>
+          <w:p>
+            <w:pPr>
+              <w:spacing w:after="0"/>
+            </w:pPr>
+            <w:r>
+              <w:rPr>
+                <w:rFonts w:ascii="Calibri" w:cs="Calibri" w:eastAsia="Microsoft YaHei" w:hAnsi="Calibri"/>
+                <w:sz w:val="19"/>
+                <w:szCs w:val="19"/>
+              </w:rPr>
+              <w:t xml:space="preserve">X16</w:t>
+            </w:r>
+          </w:p>
+        </w:tc>
+        <w:tc>
+          <w:tcPr>
+            <w:tcW w:type="dxa" w:w="5055"/>
+            <w:tcBorders>
+              <w:top w:val="single" w:color="BBBBBB" w:sz="4"/>
+              <w:left w:val="single" w:color="BBBBBB" w:sz="4"/>
+              <w:bottom w:val="single" w:color="BBBBBB" w:sz="4"/>
+              <w:right w:val="single" w:color="BBBBBB" w:sz="4"/>
+            </w:tcBorders>
+            <w:tcMar>
+              <w:top w:type="dxa" w:w="55"/>
+              <w:left w:type="dxa" w:w="95"/>
+              <w:bottom w:type="dxa" w:w="55"/>
+              <w:right w:type="dxa" w:w="95"/>
+            </w:tcMar>
+            <w:vAlign w:val="top"/>
+          </w:tcPr>
+          <w:p>
+            <w:pPr>
+              <w:spacing w:after="0"/>
+            </w:pPr>
+            <w:r>
+              <w:rPr>
+                <w:rFonts w:ascii="Calibri" w:cs="Calibri" w:eastAsia="Microsoft YaHei" w:hAnsi="Calibri"/>
+                <w:sz w:val="19"/>
+                <w:szCs w:val="19"/>
+              </w:rPr>
+              <w:t xml:space="preserve">什么时候标时长是下限（第 4 点）</w:t>
+            </w:r>
+          </w:p>
+        </w:tc>
+        <w:tc>
+          <w:tcPr>
+            <w:tcW w:type="dxa" w:w="3429"/>
+            <w:tcBorders>
+              <w:top w:val="single" w:color="BBBBBB" w:sz="4"/>
+              <w:left w:val="single" w:color="BBBBBB" w:sz="4"/>
+              <w:bottom w:val="single" w:color="BBBBBB" w:sz="4"/>
+              <w:right w:val="single" w:color="BBBBBB" w:sz="4"/>
+            </w:tcBorders>
+            <w:tcMar>
+              <w:top w:type="dxa" w:w="55"/>
+              <w:left w:type="dxa" w:w="95"/>
+              <w:bottom w:type="dxa" w:w="55"/>
+              <w:right w:type="dxa" w:w="95"/>
+            </w:tcMar>
+            <w:vAlign w:val="top"/>
+          </w:tcPr>
+          <w:p>
+            <w:pPr>
+              <w:spacing w:after="0"/>
+            </w:pPr>
+            <w:r>
+              <w:rPr>
+                <w:rFonts w:ascii="Calibri" w:cs="Calibri" w:eastAsia="Microsoft YaHei" w:hAnsi="Calibri"/>
+                <w:sz w:val="19"/>
+                <w:szCs w:val="19"/>
+              </w:rPr>
+              <w:t xml:space="preserve">只有至就诊或入院前的时长、没给手术时间时，标为下限 Yes。【已裁定】</w:t>
+            </w:r>
+          </w:p>
+        </w:tc>
+      </w:tr>
+      <w:tr>
+        <w:trPr>
+          <w:cantSplit/>
+          <w:tblHeader w:val="false"/>
+        </w:trPr>
+        <w:tc>
+          <w:tcPr>
+            <w:tcW w:type="dxa" w:w="542"/>
+            <w:tcBorders>
+              <w:top w:val="single" w:color="BBBBBB" w:sz="4"/>
+              <w:left w:val="single" w:color="BBBBBB" w:sz="4"/>
+              <w:bottom w:val="single" w:color="BBBBBB" w:sz="4"/>
+              <w:right w:val="single" w:color="BBBBBB" w:sz="4"/>
+            </w:tcBorders>
+            <w:tcMar>
+              <w:top w:type="dxa" w:w="55"/>
+              <w:left w:type="dxa" w:w="95"/>
+              <w:bottom w:type="dxa" w:w="55"/>
+              <w:right w:type="dxa" w:w="95"/>
+            </w:tcMar>
+            <w:vAlign w:val="top"/>
+          </w:tcPr>
+          <w:p>
+            <w:pPr>
+              <w:spacing w:after="0"/>
+            </w:pPr>
+            <w:r>
+              <w:rPr>
+                <w:rFonts w:ascii="Calibri" w:cs="Calibri" w:eastAsia="Microsoft YaHei" w:hAnsi="Calibri"/>
+                <w:sz w:val="19"/>
+                <w:szCs w:val="19"/>
+              </w:rPr>
+              <w:t xml:space="preserve">X17</w:t>
+            </w:r>
+          </w:p>
+        </w:tc>
+        <w:tc>
+          <w:tcPr>
+            <w:tcW w:type="dxa" w:w="5055"/>
+            <w:tcBorders>
+              <w:top w:val="single" w:color="BBBBBB" w:sz="4"/>
+              <w:left w:val="single" w:color="BBBBBB" w:sz="4"/>
+              <w:bottom w:val="single" w:color="BBBBBB" w:sz="4"/>
+              <w:right w:val="single" w:color="BBBBBB" w:sz="4"/>
+            </w:tcBorders>
+            <w:tcMar>
+              <w:top w:type="dxa" w:w="55"/>
+              <w:left w:type="dxa" w:w="95"/>
+              <w:bottom w:type="dxa" w:w="55"/>
+              <w:right w:type="dxa" w:w="95"/>
+            </w:tcMar>
+            <w:vAlign w:val="top"/>
+          </w:tcPr>
+          <w:p>
+            <w:pPr>
+              <w:spacing w:after="0"/>
+            </w:pPr>
+            <w:r>
+              <w:rPr>
+                <w:rFonts w:ascii="Calibri" w:cs="Calibri" w:eastAsia="Microsoft YaHei" w:hAnsi="Calibri"/>
+                <w:sz w:val="19"/>
+                <w:szCs w:val="19"/>
+              </w:rPr>
+              <w:t xml:space="preserve">时长怎么提取（第 5 点）</w:t>
+            </w:r>
+          </w:p>
+        </w:tc>
+        <w:tc>
+          <w:tcPr>
+            <w:tcW w:type="dxa" w:w="3429"/>
+            <w:tcBorders>
+              <w:top w:val="single" w:color="BBBBBB" w:sz="4"/>
+              <w:left w:val="single" w:color="BBBBBB" w:sz="4"/>
+              <w:bottom w:val="single" w:color="BBBBBB" w:sz="4"/>
+              <w:right w:val="single" w:color="BBBBBB" w:sz="4"/>
+            </w:tcBorders>
+            <w:tcMar>
+              <w:top w:type="dxa" w:w="55"/>
+              <w:left w:type="dxa" w:w="95"/>
+              <w:bottom w:type="dxa" w:w="55"/>
+              <w:right w:type="dxa" w:w="95"/>
+            </w:tcMar>
+            <w:vAlign w:val="top"/>
+          </w:tcPr>
+          <w:p>
+            <w:pPr>
+              <w:spacing w:after="0"/>
+            </w:pPr>
+            <w:r>
+              <w:rPr>
+                <w:rFonts w:ascii="Calibri" w:cs="Calibri" w:eastAsia="Microsoft YaHei" w:hAnsi="Calibri"/>
+                <w:sz w:val="19"/>
+                <w:szCs w:val="19"/>
+              </w:rPr>
+              <w:t xml:space="preserve">按原文能确定的症状起点和手术时间提取；不精确时 </w:t>
+            </w:r>
+            <w:r>
+              <w:rPr>
+                <w:rFonts w:ascii="Consolas" w:cs="Consolas" w:eastAsia="Microsoft YaHei" w:hAnsi="Consolas"/>
+                <w:sz w:val="19"/>
+                <w:szCs w:val="19"/>
+                <w:shd w:fill="EEEEEE" w:val="clear"/>
+              </w:rPr>
+              <w:t xml:space="preserve">idx_dur_days</w:t>
+            </w:r>
+            <w:r>
+              <w:rPr>
+                <w:rFonts w:ascii="Calibri" w:cs="Calibri" w:eastAsia="Microsoft YaHei" w:hAnsi="Calibri"/>
+                <w:sz w:val="19"/>
+                <w:szCs w:val="19"/>
+              </w:rPr>
+              <w:t xml:space="preserve"> 填 NR，只记类别。【已裁定】</w:t>
+            </w:r>
+          </w:p>
+        </w:tc>
+      </w:tr>
+      <w:tr>
+        <w:trPr>
+          <w:cantSplit/>
+          <w:tblHeader w:val="false"/>
+        </w:trPr>
+        <w:tc>
+          <w:tcPr>
+            <w:tcW w:type="dxa" w:w="542"/>
+            <w:tcBorders>
+              <w:top w:val="single" w:color="BBBBBB" w:sz="4"/>
+              <w:left w:val="single" w:color="BBBBBB" w:sz="4"/>
+              <w:bottom w:val="single" w:color="BBBBBB" w:sz="4"/>
+              <w:right w:val="single" w:color="BBBBBB" w:sz="4"/>
+            </w:tcBorders>
+            <w:tcMar>
+              <w:top w:type="dxa" w:w="55"/>
+              <w:left w:type="dxa" w:w="95"/>
+              <w:bottom w:type="dxa" w:w="55"/>
+              <w:right w:type="dxa" w:w="95"/>
+            </w:tcMar>
+            <w:vAlign w:val="top"/>
+          </w:tcPr>
+          <w:p>
+            <w:pPr>
+              <w:spacing w:after="0"/>
+            </w:pPr>
+            <w:r>
+              <w:rPr>
+                <w:rFonts w:ascii="Calibri" w:cs="Calibri" w:eastAsia="Microsoft YaHei" w:hAnsi="Calibri"/>
+                <w:sz w:val="19"/>
+                <w:szCs w:val="19"/>
+              </w:rPr>
+              <w:t xml:space="preserve">X18</w:t>
+            </w:r>
+          </w:p>
+        </w:tc>
+        <w:tc>
+          <w:tcPr>
+            <w:tcW w:type="dxa" w:w="5055"/>
+            <w:tcBorders>
+              <w:top w:val="single" w:color="BBBBBB" w:sz="4"/>
+              <w:left w:val="single" w:color="BBBBBB" w:sz="4"/>
+              <w:bottom w:val="single" w:color="BBBBBB" w:sz="4"/>
+              <w:right w:val="single" w:color="BBBBBB" w:sz="4"/>
+            </w:tcBorders>
+            <w:tcMar>
+              <w:top w:type="dxa" w:w="55"/>
+              <w:left w:type="dxa" w:w="95"/>
+              <w:bottom w:type="dxa" w:w="55"/>
+              <w:right w:type="dxa" w:w="95"/>
+            </w:tcMar>
+            <w:vAlign w:val="top"/>
+          </w:tcPr>
+          <w:p>
+            <w:pPr>
+              <w:spacing w:after="0"/>
+            </w:pPr>
+            <w:r>
+              <w:rPr>
+                <w:rFonts w:ascii="Calibri" w:cs="Calibri" w:eastAsia="Microsoft YaHei" w:hAnsi="Calibri"/>
+                <w:sz w:val="19"/>
+                <w:szCs w:val="19"/>
+              </w:rPr>
+              <w:t xml:space="preserve">影像和术中证据怎么对应到每名儿童（第 6 点）</w:t>
+            </w:r>
+          </w:p>
+        </w:tc>
+        <w:tc>
+          <w:tcPr>
+            <w:tcW w:type="dxa" w:w="3429"/>
+            <w:tcBorders>
+              <w:top w:val="single" w:color="BBBBBB" w:sz="4"/>
+              <w:left w:val="single" w:color="BBBBBB" w:sz="4"/>
+              <w:bottom w:val="single" w:color="BBBBBB" w:sz="4"/>
+              <w:right w:val="single" w:color="BBBBBB" w:sz="4"/>
+            </w:tcBorders>
+            <w:tcMar>
+              <w:top w:type="dxa" w:w="55"/>
+              <w:left w:type="dxa" w:w="95"/>
+              <w:bottom w:type="dxa" w:w="55"/>
+              <w:right w:type="dxa" w:w="95"/>
+            </w:tcMar>
+            <w:vAlign w:val="top"/>
+          </w:tcPr>
+          <w:p>
+            <w:pPr>
+              <w:spacing w:after="0"/>
+            </w:pPr>
+            <w:r>
+              <w:rPr>
+                <w:rFonts w:ascii="Calibri" w:cs="Calibri" w:eastAsia="Microsoft YaHei" w:hAnsi="Calibri"/>
+                <w:sz w:val="19"/>
+                <w:szCs w:val="19"/>
+              </w:rPr>
+              <w:t xml:space="preserve">逐例判定；汇总句只在范围完全对应时适用；</w:t>
+            </w:r>
+            <w:r>
+              <w:rPr>
+                <w:rFonts w:ascii="Consolas" w:cs="Consolas" w:eastAsia="Microsoft YaHei" w:hAnsi="Consolas"/>
+                <w:sz w:val="19"/>
+                <w:szCs w:val="19"/>
+                <w:shd w:fill="EEEEEE" w:val="clear"/>
+              </w:rPr>
+              <w:t xml:space="preserve">Imaging and operation</w:t>
+            </w:r>
+            <w:r>
+              <w:rPr>
+                <w:rFonts w:ascii="Calibri" w:cs="Calibri" w:eastAsia="Microsoft YaHei" w:hAnsi="Calibri"/>
+                <w:sz w:val="19"/>
+                <w:szCs w:val="19"/>
+              </w:rPr>
+              <w:t xml:space="preserve"> 需要这名儿童两者都有。【已裁定】</w:t>
+            </w:r>
+          </w:p>
+        </w:tc>
+      </w:tr>
+      <w:tr>
+        <w:trPr>
+          <w:cantSplit/>
+          <w:tblHeader w:val="false"/>
+        </w:trPr>
+        <w:tc>
+          <w:tcPr>
+            <w:tcW w:type="dxa" w:w="542"/>
+            <w:tcBorders>
+              <w:top w:val="single" w:color="BBBBBB" w:sz="4"/>
+              <w:left w:val="single" w:color="BBBBBB" w:sz="4"/>
+              <w:bottom w:val="single" w:color="BBBBBB" w:sz="4"/>
+              <w:right w:val="single" w:color="BBBBBB" w:sz="4"/>
+            </w:tcBorders>
+            <w:tcMar>
+              <w:top w:type="dxa" w:w="55"/>
+              <w:left w:type="dxa" w:w="95"/>
+              <w:bottom w:type="dxa" w:w="55"/>
+              <w:right w:type="dxa" w:w="95"/>
+            </w:tcMar>
+            <w:vAlign w:val="top"/>
+          </w:tcPr>
+          <w:p>
+            <w:pPr>
+              <w:spacing w:after="0"/>
+            </w:pPr>
+            <w:r>
+              <w:rPr>
+                <w:rFonts w:ascii="Calibri" w:cs="Calibri" w:eastAsia="Microsoft YaHei" w:hAnsi="Calibri"/>
+                <w:sz w:val="19"/>
+                <w:szCs w:val="19"/>
+              </w:rPr>
+              <w:t xml:space="preserve">X19</w:t>
+            </w:r>
+          </w:p>
+        </w:tc>
+        <w:tc>
+          <w:tcPr>
+            <w:tcW w:type="dxa" w:w="5055"/>
+            <w:tcBorders>
+              <w:top w:val="single" w:color="BBBBBB" w:sz="4"/>
+              <w:left w:val="single" w:color="BBBBBB" w:sz="4"/>
+              <w:bottom w:val="single" w:color="BBBBBB" w:sz="4"/>
+              <w:right w:val="single" w:color="BBBBBB" w:sz="4"/>
+            </w:tcBorders>
+            <w:tcMar>
+              <w:top w:type="dxa" w:w="55"/>
+              <w:left w:type="dxa" w:w="95"/>
+              <w:bottom w:type="dxa" w:w="55"/>
+              <w:right w:type="dxa" w:w="95"/>
+            </w:tcMar>
+            <w:vAlign w:val="top"/>
+          </w:tcPr>
+          <w:p>
+            <w:pPr>
+              <w:spacing w:after="0"/>
+            </w:pPr>
+            <w:r>
+              <w:rPr>
+                <w:rFonts w:ascii="Calibri" w:cs="Calibri" w:eastAsia="Microsoft YaHei" w:hAnsi="Calibri"/>
+                <w:sz w:val="19"/>
+                <w:szCs w:val="19"/>
+              </w:rPr>
+              <w:t xml:space="preserve">不符合条件的儿童（第 7 点）</w:t>
+            </w:r>
+          </w:p>
+        </w:tc>
+        <w:tc>
+          <w:tcPr>
+            <w:tcW w:type="dxa" w:w="3429"/>
+            <w:tcBorders>
+              <w:top w:val="single" w:color="BBBBBB" w:sz="4"/>
+              <w:left w:val="single" w:color="BBBBBB" w:sz="4"/>
+              <w:bottom w:val="single" w:color="BBBBBB" w:sz="4"/>
+              <w:right w:val="single" w:color="BBBBBB" w:sz="4"/>
+            </w:tcBorders>
+            <w:tcMar>
+              <w:top w:type="dxa" w:w="55"/>
+              <w:left w:type="dxa" w:w="95"/>
+              <w:bottom w:type="dxa" w:w="55"/>
+              <w:right w:type="dxa" w:w="95"/>
+            </w:tcMar>
+            <w:vAlign w:val="top"/>
+          </w:tcPr>
+          <w:p>
+            <w:pPr>
+              <w:spacing w:after="0"/>
+            </w:pPr>
+            <w:r>
+              <w:rPr>
+                <w:rFonts w:ascii="Calibri" w:cs="Calibri" w:eastAsia="Microsoft YaHei" w:hAnsi="Calibri"/>
+                <w:sz w:val="19"/>
+                <w:szCs w:val="19"/>
+              </w:rPr>
+              <w:t xml:space="preserve">既无游走脾诊断、也无脾蒂活动或扭转描述的，不进 Patients 表；</w:t>
+            </w:r>
+            <w:r>
+              <w:rPr>
+                <w:rFonts w:ascii="Consolas" w:cs="Consolas" w:eastAsia="Microsoft YaHei" w:hAnsi="Consolas"/>
+                <w:sz w:val="19"/>
+                <w:szCs w:val="19"/>
+                <w:shd w:fill="EEEEEE" w:val="clear"/>
+              </w:rPr>
+              <w:t xml:space="preserve">n_children_individual</w:t>
+            </w:r>
+            <w:r>
+              <w:rPr>
+                <w:rFonts w:ascii="Calibri" w:cs="Calibri" w:eastAsia="Microsoft YaHei" w:hAnsi="Calibri"/>
+                <w:sz w:val="19"/>
+                <w:szCs w:val="19"/>
+              </w:rPr>
+              <w:t xml:space="preserve"> 不计入；报告 notes 写明。【已裁定】</w:t>
+            </w:r>
+          </w:p>
+        </w:tc>
+      </w:tr>
+      <w:tr>
+        <w:trPr>
+          <w:cantSplit/>
+          <w:tblHeader w:val="false"/>
+        </w:trPr>
+        <w:tc>
+          <w:tcPr>
+            <w:tcW w:type="dxa" w:w="542"/>
+            <w:tcBorders>
+              <w:top w:val="single" w:color="BBBBBB" w:sz="4"/>
+              <w:left w:val="single" w:color="BBBBBB" w:sz="4"/>
+              <w:bottom w:val="single" w:color="BBBBBB" w:sz="4"/>
+              <w:right w:val="single" w:color="BBBBBB" w:sz="4"/>
+            </w:tcBorders>
+            <w:tcMar>
+              <w:top w:type="dxa" w:w="55"/>
+              <w:left w:type="dxa" w:w="95"/>
+              <w:bottom w:type="dxa" w:w="55"/>
+              <w:right w:type="dxa" w:w="95"/>
+            </w:tcMar>
+            <w:vAlign w:val="top"/>
+          </w:tcPr>
+          <w:p>
+            <w:pPr>
+              <w:spacing w:after="0"/>
+            </w:pPr>
+            <w:r>
+              <w:rPr>
+                <w:rFonts w:ascii="Calibri" w:cs="Calibri" w:eastAsia="Microsoft YaHei" w:hAnsi="Calibri"/>
+                <w:sz w:val="19"/>
+                <w:szCs w:val="19"/>
+              </w:rPr>
+              <w:t xml:space="preserve">X20</w:t>
+            </w:r>
+          </w:p>
+        </w:tc>
+        <w:tc>
+          <w:tcPr>
+            <w:tcW w:type="dxa" w:w="5055"/>
+            <w:tcBorders>
+              <w:top w:val="single" w:color="BBBBBB" w:sz="4"/>
+              <w:left w:val="single" w:color="BBBBBB" w:sz="4"/>
+              <w:bottom w:val="single" w:color="BBBBBB" w:sz="4"/>
+              <w:right w:val="single" w:color="BBBBBB" w:sz="4"/>
+            </w:tcBorders>
+            <w:tcMar>
+              <w:top w:type="dxa" w:w="55"/>
+              <w:left w:type="dxa" w:w="95"/>
+              <w:bottom w:type="dxa" w:w="55"/>
+              <w:right w:type="dxa" w:w="95"/>
+            </w:tcMar>
+            <w:vAlign w:val="top"/>
+          </w:tcPr>
+          <w:p>
+            <w:pPr>
+              <w:spacing w:after="0"/>
+            </w:pPr>
+            <w:r>
+              <w:rPr>
+                <w:rFonts w:ascii="Calibri" w:cs="Calibri" w:eastAsia="Microsoft YaHei" w:hAnsi="Calibri"/>
+                <w:sz w:val="19"/>
+                <w:szCs w:val="19"/>
+              </w:rPr>
+              <w:t xml:space="preserve">无法一一对应的可能重复报告（第 8 点）</w:t>
+            </w:r>
+          </w:p>
+        </w:tc>
+        <w:tc>
+          <w:tcPr>
+            <w:tcW w:type="dxa" w:w="3429"/>
+            <w:tcBorders>
+              <w:top w:val="single" w:color="BBBBBB" w:sz="4"/>
+              <w:left w:val="single" w:color="BBBBBB" w:sz="4"/>
+              <w:bottom w:val="single" w:color="BBBBBB" w:sz="4"/>
+              <w:right w:val="single" w:color="BBBBBB" w:sz="4"/>
+            </w:tcBorders>
+            <w:tcMar>
+              <w:top w:type="dxa" w:w="55"/>
+              <w:left w:type="dxa" w:w="95"/>
+              <w:bottom w:type="dxa" w:w="55"/>
+              <w:right w:type="dxa" w:w="95"/>
+            </w:tcMar>
+            <w:vAlign w:val="top"/>
+          </w:tcPr>
+          <w:p>
+            <w:pPr>
+              <w:spacing w:after="0"/>
+            </w:pPr>
+            <w:r>
+              <w:rPr>
+                <w:rFonts w:ascii="Calibri" w:cs="Calibri" w:eastAsia="Microsoft YaHei" w:hAnsi="Calibri"/>
+                <w:sz w:val="19"/>
+                <w:szCs w:val="19"/>
+              </w:rPr>
+              <w:t xml:space="preserve">只在报告层说明（</w:t>
+            </w:r>
+            <w:r>
+              <w:rPr>
+                <w:rFonts w:ascii="Consolas" w:cs="Consolas" w:eastAsia="Microsoft YaHei" w:hAnsi="Consolas"/>
+                <w:sz w:val="19"/>
+                <w:szCs w:val="19"/>
+                <w:shd w:fill="EEEEEE" w:val="clear"/>
+              </w:rPr>
+              <w:t xml:space="preserve">linked_duplicates</w:t>
+            </w:r>
+            <w:r>
+              <w:rPr>
+                <w:rFonts w:ascii="Calibri" w:cs="Calibri" w:eastAsia="Microsoft YaHei" w:hAnsi="Calibri"/>
+                <w:sz w:val="19"/>
+                <w:szCs w:val="19"/>
+              </w:rPr>
+              <w:t xml:space="preserve"> + notes），不填 </w:t>
+            </w:r>
+            <w:r>
+              <w:rPr>
+                <w:rFonts w:ascii="Consolas" w:cs="Consolas" w:eastAsia="Microsoft YaHei" w:hAnsi="Consolas"/>
+                <w:sz w:val="19"/>
+                <w:szCs w:val="19"/>
+                <w:shd w:fill="EEEEEE" w:val="clear"/>
+              </w:rPr>
+              <w:t xml:space="preserve">same_patient_as</w:t>
+            </w:r>
+            <w:r>
+              <w:rPr>
+                <w:rFonts w:ascii="Calibri" w:cs="Calibri" w:eastAsia="Microsoft YaHei" w:hAnsi="Calibri"/>
+                <w:sz w:val="19"/>
+                <w:szCs w:val="19"/>
+              </w:rPr>
+              <w:t xml:space="preserve">。【已裁定】</w:t>
+            </w:r>
+          </w:p>
+        </w:tc>
+      </w:tr>
     </w:tbl>
     <w:p>
       <w:pPr>
         <w:spacing w:after="120"/>
       </w:pPr>
+    </w:p>
+    <w:p>
+      <w:pPr>
+        <w:spacing w:after="120"/>
+      </w:pPr>
+      <w:r>
+        <w:rPr>
+          <w:rFonts w:ascii="Calibri" w:cs="Calibri" w:eastAsia="Microsoft YaHei" w:hAnsi="Calibri"/>
+        </w:rPr>
+        <w:t xml:space="preserve">校准讨论清单的第 9 点（只有一位提取员填了的项目）和第 10 点（其余单项差异）</w:t>
+      </w:r>
+      <w:r>
+        <w:rPr>
+          <w:rFonts w:ascii="Calibri" w:cs="Calibri" w:eastAsia="Microsoft YaHei" w:hAnsi="Calibri"/>
+          <w:b/>
+          <w:bCs/>
+        </w:rPr>
+        <w:t xml:space="preserve">不在</w:t>
+      </w:r>
+      <w:r>
+        <w:rPr>
+          <w:rFonts w:ascii="Calibri" w:cs="Calibri" w:eastAsia="Microsoft YaHei" w:hAnsi="Calibri"/>
+        </w:rPr>
+        <w:t xml:space="preserve">杨俊裁定后的明细表里，所以这里没有对应的读法；它们要在建共识文件时逐项处理。</w:t>
+      </w:r>
     </w:p>
     <w:p>
       <w:pPr>
@@ -23956,6 +26039,176 @@
           <w:rFonts w:ascii="Calibri" w:cs="Calibri" w:eastAsia="Microsoft YaHei" w:hAnsi="Calibri"/>
         </w:rPr>
         <w:t xml:space="preserve">一份报告里有多少名儿童要提取，要等全文阶段结束才知道；工作量没有估计。</w:t>
+      </w:r>
+    </w:p>
+    <w:p>
+      <w:pPr>
+        <w:pStyle w:val="ListParagraph"/>
+        <w:numPr>
+          <w:ilvl w:val="0"/>
+          <w:numId w:val="2"/>
+        </w:numPr>
+        <w:spacing w:after="60"/>
+      </w:pPr>
+      <w:r>
+        <w:rPr>
+          <w:rFonts w:ascii="Calibri" w:cs="Calibri" w:eastAsia="Microsoft YaHei" w:hAnsi="Calibri"/>
+        </w:rPr>
+        <w:t xml:space="preserve">X13–X20 是研究团队在 10 篇校准的讨论和杨俊的裁定里对具体报告作出的读法。Claude 没有打开这些报告的原文，没有核对任何一条裁定是否符合原文，只是把它们写成通用规则；写成通用规则的措辞没有经过两位提取员和杨俊确认。</w:t>
+      </w:r>
+    </w:p>
+    <w:p>
+      <w:pPr>
+        <w:pStyle w:val="ListParagraph"/>
+        <w:numPr>
+          <w:ilvl w:val="0"/>
+          <w:numId w:val="2"/>
+        </w:numPr>
+        <w:spacing w:after="60"/>
+      </w:pPr>
+      <w:r>
+        <w:rPr>
+          <w:rFonts w:ascii="Calibri" w:cs="Calibri" w:eastAsia="Microsoft YaHei" w:hAnsi="Calibri"/>
+        </w:rPr>
+        <w:t xml:space="preserve">明细表里有一处和本说明原来的写法不一致，需要他们看一下：一名儿童的脾自行复位、脾上没有做手术（只为别的目的开腹），裁定结果是 </w:t>
+      </w:r>
+      <w:r>
+        <w:rPr>
+          <w:rFonts w:ascii="Consolas" w:cs="Consolas" w:eastAsia="Microsoft YaHei" w:hAnsi="Consolas"/>
+          <w:sz w:val="19"/>
+          <w:szCs w:val="19"/>
+          <w:shd w:fill="EEEEEE" w:val="clear"/>
+        </w:rPr>
+        <w:t xml:space="preserve">procedure</w:t>
+      </w:r>
+      <w:r>
+        <w:rPr>
+          <w:rFonts w:ascii="Calibri" w:cs="Calibri" w:eastAsia="Microsoft YaHei" w:hAnsi="Calibri"/>
+        </w:rPr>
+        <w:t xml:space="preserve"> = No operation、</w:t>
+      </w:r>
+      <w:r>
+        <w:rPr>
+          <w:rFonts w:ascii="Consolas" w:cs="Consolas" w:eastAsia="Microsoft YaHei" w:hAnsi="Consolas"/>
+          <w:sz w:val="19"/>
+          <w:szCs w:val="19"/>
+          <w:shd w:fill="EEEEEE" w:val="clear"/>
+        </w:rPr>
+        <w:t xml:space="preserve">viability</w:t>
+      </w:r>
+      <w:r>
+        <w:rPr>
+          <w:rFonts w:ascii="Calibri" w:cs="Calibri" w:eastAsia="Microsoft YaHei" w:hAnsi="Calibri"/>
+        </w:rPr>
+        <w:t xml:space="preserve"> = NR，而本说明原来对未手术的儿童写的是 </w:t>
+      </w:r>
+      <w:r>
+        <w:rPr>
+          <w:rFonts w:ascii="Consolas" w:cs="Consolas" w:eastAsia="Microsoft YaHei" w:hAnsi="Consolas"/>
+          <w:sz w:val="19"/>
+          <w:szCs w:val="19"/>
+          <w:shd w:fill="EEEEEE" w:val="clear"/>
+        </w:rPr>
+        <w:t xml:space="preserve">viability</w:t>
+      </w:r>
+      <w:r>
+        <w:rPr>
+          <w:rFonts w:ascii="Calibri" w:cs="Calibri" w:eastAsia="Microsoft YaHei" w:hAnsi="Calibri"/>
+        </w:rPr>
+        <w:t xml:space="preserve"> = Not applicable。7.1 里加了一行按裁定结果写，标【Claude 的读法，待确认】。</w:t>
+      </w:r>
+    </w:p>
+    <w:p>
+      <w:pPr>
+        <w:pStyle w:val="ListParagraph"/>
+        <w:numPr>
+          <w:ilvl w:val="0"/>
+          <w:numId w:val="2"/>
+        </w:numPr>
+        <w:spacing w:after="60"/>
+      </w:pPr>
+      <w:r>
+        <w:rPr>
+          <w:rFonts w:ascii="Calibri" w:cs="Calibri" w:eastAsia="Microsoft YaHei" w:hAnsi="Calibri"/>
+        </w:rPr>
+        <w:t xml:space="preserve">X13 的后果还没有量化：按明细表，</w:t>
+      </w:r>
+      <w:r>
+        <w:rPr>
+          <w:rFonts w:ascii="Consolas" w:cs="Consolas" w:eastAsia="Microsoft YaHei" w:hAnsi="Consolas"/>
+          <w:sz w:val="19"/>
+          <w:szCs w:val="19"/>
+          <w:shd w:fill="EEEEEE" w:val="clear"/>
+        </w:rPr>
+        <w:t xml:space="preserve">viability</w:t>
+      </w:r>
+      <w:r>
+        <w:rPr>
+          <w:rFonts w:ascii="Calibri" w:cs="Calibri" w:eastAsia="Microsoft YaHei" w:hAnsi="Calibri"/>
+        </w:rPr>
+        <w:t xml:space="preserve"> 裁定为 NR 的有 20 名儿童（最大的那个系列 14 名，另外两份报告共 6 名；这个数是 Claude 从明细表里数的，没有重算），这些儿童 E2 原先大多填了 Non-viable 或 Viable、E1 填 NR；他们在主要结局里会是 NR 或"NR - removed, check reason"，准确的数要等建共识文件、</w:t>
+      </w:r>
+      <w:r>
+        <w:rPr>
+          <w:rFonts w:ascii="Consolas" w:cs="Consolas" w:eastAsia="Microsoft YaHei" w:hAnsi="Consolas"/>
+          <w:sz w:val="19"/>
+          <w:szCs w:val="19"/>
+          <w:shd w:fill="EEEEEE" w:val="clear"/>
+        </w:rPr>
+        <w:t xml:space="preserve">compare</w:t>
+      </w:r>
+      <w:r>
+        <w:rPr>
+          <w:rFonts w:ascii="Calibri" w:cs="Calibri" w:eastAsia="Microsoft YaHei" w:hAnsi="Calibri"/>
+        </w:rPr>
+        <w:t xml:space="preserve"> 重跑以后才有。主要分析怎么处理它们是分析计划的事（协议没有规定结局缺失怎么办），要问 Ji Wang。</w:t>
+      </w:r>
+    </w:p>
+    <w:p>
+      <w:pPr>
+        <w:pStyle w:val="ListParagraph"/>
+        <w:numPr>
+          <w:ilvl w:val="0"/>
+          <w:numId w:val="2"/>
+        </w:numPr>
+        <w:spacing w:after="60"/>
+      </w:pPr>
+      <w:r>
+        <w:rPr>
+          <w:rFonts w:ascii="Calibri" w:cs="Calibri" w:eastAsia="Microsoft YaHei" w:hAnsi="Calibri"/>
+        </w:rPr>
+        <w:t xml:space="preserve">X20 的后果：杨俊裁定不填 </w:t>
+      </w:r>
+      <w:r>
+        <w:rPr>
+          <w:rFonts w:ascii="Consolas" w:cs="Consolas" w:eastAsia="Microsoft YaHei" w:hAnsi="Consolas"/>
+          <w:sz w:val="19"/>
+          <w:szCs w:val="19"/>
+          <w:shd w:fill="EEEEEE" w:val="clear"/>
+        </w:rPr>
+        <w:t xml:space="preserve">same_patient_as</w:t>
+      </w:r>
+      <w:r>
+        <w:rPr>
+          <w:rFonts w:ascii="Calibri" w:cs="Calibri" w:eastAsia="Microsoft YaHei" w:hAnsi="Calibri"/>
+        </w:rPr>
+        <w:t xml:space="preserve">，所以两篇可能重叠的报告（其中一篇有 7 名儿童，其中 5 名据说此前已在另一篇里报告）的儿童在 Patients 表里都会作为独立行出现；分析时如果不处理，可能重复计算最多 5 名儿童。这需要 Ji Wang 在核查重复患者时决定（例如分别去掉其中一篇做敏感性分析），Claude 没有替他们决定。</w:t>
+      </w:r>
+    </w:p>
+    <w:p>
+      <w:pPr>
+        <w:pStyle w:val="ListParagraph"/>
+        <w:numPr>
+          <w:ilvl w:val="0"/>
+          <w:numId w:val="2"/>
+        </w:numPr>
+        <w:spacing w:after="60"/>
+      </w:pPr>
+      <w:r>
+        <w:rPr>
+          <w:rFonts w:ascii="Calibri" w:cs="Calibri" w:eastAsia="Microsoft YaHei" w:hAnsi="Calibri"/>
+        </w:rPr>
+        <w:t xml:space="preserve">讨论清单第 9、10 点（一位提取员没填的项目、其余单项差异）没有裁定结果；本院 5 例和正式提取还没有开始。</w:t>
       </w:r>
     </w:p>
     <w:sectPr>
@@ -24023,7 +26276,7 @@
         <w:sz w:val="17"/>
         <w:szCs w:val="17"/>
       </w:rPr>
-      <w:t xml:space="preserve">提取操作说明 v2026-10-25c   |   第 </w:t>
+      <w:t xml:space="preserve">提取操作说明 v2026-10-25d   |   第 </w:t>
     </w:r>
     <w:r>
       <w:rPr>

</xml_diff>

<commit_message>
Merged reading for extraction and risk of bias in both guides and workbook READMEs
Co-Authored-By: Claude Sonnet 5.5 <noreply@anthropic.com>
Claude-Session: https://claude.ai/code/session_01FRD7etKqYN8v2bbXeeLMRW
</commit_message>
<xml_diff>
--- a/Extraction guide - how to fill the extraction workbook (draft).docx
+++ b/Extraction guide - how to fill the extraction workbook (draft).docx
@@ -116,7 +116,7 @@
                 <w:sz w:val="19"/>
                 <w:szCs w:val="19"/>
               </w:rPr>
-              <w:t xml:space="preserve">提取操作说明 v2026-10-25d（草稿）。标 </w:t>
+              <w:t xml:space="preserve">提取操作说明 v2026-10-25e（草稿）。标 </w:t>
             </w:r>
             <w:r>
               <w:rPr>
@@ -171,6 +171,77 @@
                 <w:szCs w:val="19"/>
               </w:rPr>
               <w:t xml:space="preserve"> 的是 10 篇校准讨论后由杨俊按原文裁定的读法（见 X13–X20）</w:t>
+            </w:r>
+          </w:p>
+        </w:tc>
+      </w:tr>
+      <w:tr>
+        <w:trPr>
+          <w:cantSplit/>
+          <w:tblHeader w:val="false"/>
+        </w:trPr>
+        <w:tc>
+          <w:tcPr>
+            <w:tcW w:type="dxa" w:w="1534"/>
+            <w:tcBorders>
+              <w:top w:val="single" w:color="BBBBBB" w:sz="4"/>
+              <w:left w:val="single" w:color="BBBBBB" w:sz="4"/>
+              <w:bottom w:val="single" w:color="BBBBBB" w:sz="4"/>
+              <w:right w:val="single" w:color="BBBBBB" w:sz="4"/>
+            </w:tcBorders>
+            <w:shd w:fill="F2F5F9" w:val="clear"/>
+            <w:tcMar>
+              <w:top w:type="dxa" w:w="55"/>
+              <w:left w:type="dxa" w:w="95"/>
+              <w:bottom w:type="dxa" w:w="55"/>
+              <w:right w:type="dxa" w:w="95"/>
+            </w:tcMar>
+            <w:vAlign w:val="top"/>
+          </w:tcPr>
+          <w:p>
+            <w:pPr>
+              <w:spacing w:after="0"/>
+            </w:pPr>
+            <w:r>
+              <w:rPr>
+                <w:rFonts w:ascii="Calibri" w:cs="Calibri" w:eastAsia="Microsoft YaHei" w:hAnsi="Calibri"/>
+                <w:b/>
+                <w:bCs/>
+                <w:sz w:val="19"/>
+                <w:szCs w:val="19"/>
+              </w:rPr>
+              <w:t xml:space="preserve">改动（2026-10-25，和偏倚风险评价合并阅读）</w:t>
+            </w:r>
+          </w:p>
+        </w:tc>
+        <w:tc>
+          <w:tcPr>
+            <w:tcW w:type="dxa" w:w="7492"/>
+            <w:tcBorders>
+              <w:top w:val="single" w:color="BBBBBB" w:sz="4"/>
+              <w:left w:val="single" w:color="BBBBBB" w:sz="4"/>
+              <w:bottom w:val="single" w:color="BBBBBB" w:sz="4"/>
+              <w:right w:val="single" w:color="BBBBBB" w:sz="4"/>
+            </w:tcBorders>
+            <w:tcMar>
+              <w:top w:type="dxa" w:w="55"/>
+              <w:left w:type="dxa" w:w="95"/>
+              <w:bottom w:type="dxa" w:w="55"/>
+              <w:right w:type="dxa" w:w="95"/>
+            </w:tcMar>
+            <w:vAlign w:val="top"/>
+          </w:tcPr>
+          <w:p>
+            <w:pPr>
+              <w:spacing w:after="0"/>
+            </w:pPr>
+            <w:r>
+              <w:rPr>
+                <w:rFonts w:ascii="Calibri" w:cs="Calibri" w:eastAsia="Microsoft YaHei" w:hAnsi="Calibri"/>
+                <w:sz w:val="19"/>
+                <w:szCs w:val="19"/>
+              </w:rPr>
+              <w:t xml:space="preserve">作者 2026 年 10 月 25 日同意：正式提取时，每篇全文只读一遍，同时填提取表和偏倚风险表（第 1 节第 3 步）。两份表仍各自独立、各自两人填，注册的做法不变；规则没有变</w:t>
             </w:r>
           </w:p>
         </w:tc>
@@ -3371,6 +3442,35 @@
         </w:rPr>
         <w:t xml:space="preserve"> 先在 Reports 表填这篇报告的一行，再在 Patients 表给每名符合条件的儿童填一行。</w:t>
       </w:r>
+      <w:r>
+        <w:rPr>
+          <w:rFonts w:ascii="Calibri" w:cs="Calibri" w:eastAsia="Microsoft YaHei" w:hAnsi="Calibri"/>
+          <w:b/>
+          <w:bCs/>
+        </w:rPr>
+        <w:t xml:space="preserve">同一遍阅读里顺手填偏倚风险表</w:t>
+      </w:r>
+      <w:r>
+        <w:rPr>
+          <w:rFonts w:ascii="Calibri" w:cs="Calibri" w:eastAsia="Microsoft YaHei" w:hAnsi="Calibri"/>
+        </w:rPr>
+        <w:t xml:space="preserve">（</w:t>
+      </w:r>
+      <w:r>
+        <w:rPr>
+          <w:rFonts w:ascii="Consolas" w:cs="Consolas" w:eastAsia="Microsoft YaHei" w:hAnsi="Consolas"/>
+          <w:sz w:val="19"/>
+          <w:szCs w:val="19"/>
+          <w:shd w:fill="EEEEEE" w:val="clear"/>
+        </w:rPr>
+        <w:t xml:space="preserve">search/rob/</w:t>
+      </w:r>
+      <w:r>
+        <w:rPr>
+          <w:rFonts w:ascii="Calibri" w:cs="Calibri" w:eastAsia="Microsoft YaHei" w:hAnsi="Calibri"/>
+        </w:rPr>
+        <w:t xml:space="preserve"> 里自己那份，见《偏倚风险评价操作说明》）：提取表和偏倚风险表是两份文件，各自独立、都由你们两人分别填；合并的只是阅读，全文不用读两遍。偏倚风险的 exposure、outcome 两项和提取表的 src_exposure、viab_basis 相关，但偏倚风险是判断报告写得是否可靠，不是把提取值抄过去。</w:t>
+      </w:r>
     </w:p>
     <w:p>
       <w:pPr>
@@ -26276,7 +26376,7 @@
         <w:sz w:val="17"/>
         <w:szCs w:val="17"/>
       </w:rPr>
-      <w:t xml:space="preserve">提取操作说明 v2026-10-25d   |   第 </w:t>
+      <w:t xml:space="preserve">提取操作说明 v2026-10-25e   |   第 </w:t>
     </w:r>
     <w:r>
       <w:rPr>

</xml_diff>

<commit_message>
Update extraction and risk-of-bias guides with rules set after formal comparison
Co-Authored-By: Claude Sonnet 5.5 <noreply@anthropic.com>
Claude-Session: https://claude.ai/code/session_01FRD7etKqYN8v2bbXeeLMRW
</commit_message>
<xml_diff>
--- a/Extraction guide - how to fill the extraction workbook (draft).docx
+++ b/Extraction guide - how to fill the extraction workbook (draft).docx
@@ -116,7 +116,7 @@
                 <w:sz w:val="19"/>
                 <w:szCs w:val="19"/>
               </w:rPr>
-              <w:t xml:space="preserve">提取操作说明 v2026-10-25e（草稿）。标 </w:t>
+              <w:t xml:space="preserve">提取操作说明 v2026-10-26a（草稿）。标 </w:t>
             </w:r>
             <w:r>
               <w:rPr>
@@ -171,6 +171,130 @@
                 <w:szCs w:val="19"/>
               </w:rPr>
               <w:t xml:space="preserve"> 的是 10 篇校准讨论后由杨俊按原文裁定的读法（见 X13–X20）</w:t>
+            </w:r>
+          </w:p>
+        </w:tc>
+      </w:tr>
+      <w:tr>
+        <w:trPr>
+          <w:cantSplit/>
+          <w:tblHeader w:val="false"/>
+        </w:trPr>
+        <w:tc>
+          <w:tcPr>
+            <w:tcW w:type="dxa" w:w="1534"/>
+            <w:tcBorders>
+              <w:top w:val="single" w:color="BBBBBB" w:sz="4"/>
+              <w:left w:val="single" w:color="BBBBBB" w:sz="4"/>
+              <w:bottom w:val="single" w:color="BBBBBB" w:sz="4"/>
+              <w:right w:val="single" w:color="BBBBBB" w:sz="4"/>
+            </w:tcBorders>
+            <w:shd w:fill="F2F5F9" w:val="clear"/>
+            <w:tcMar>
+              <w:top w:type="dxa" w:w="55"/>
+              <w:left w:type="dxa" w:w="95"/>
+              <w:bottom w:type="dxa" w:w="55"/>
+              <w:right w:type="dxa" w:w="95"/>
+            </w:tcMar>
+            <w:vAlign w:val="top"/>
+          </w:tcPr>
+          <w:p>
+            <w:pPr>
+              <w:spacing w:after="0"/>
+            </w:pPr>
+            <w:r>
+              <w:rPr>
+                <w:rFonts w:ascii="Calibri" w:cs="Calibri" w:eastAsia="Microsoft YaHei" w:hAnsi="Calibri"/>
+                <w:b/>
+                <w:bCs/>
+                <w:sz w:val="19"/>
+                <w:szCs w:val="19"/>
+              </w:rPr>
+              <w:t xml:space="preserve">改动（2026-10-26，正式提取比对之后）</w:t>
+            </w:r>
+          </w:p>
+        </w:tc>
+        <w:tc>
+          <w:tcPr>
+            <w:tcW w:type="dxa" w:w="7492"/>
+            <w:tcBorders>
+              <w:top w:val="single" w:color="BBBBBB" w:sz="4"/>
+              <w:left w:val="single" w:color="BBBBBB" w:sz="4"/>
+              <w:bottom w:val="single" w:color="BBBBBB" w:sz="4"/>
+              <w:right w:val="single" w:color="BBBBBB" w:sz="4"/>
+            </w:tcBorders>
+            <w:tcMar>
+              <w:top w:type="dxa" w:w="55"/>
+              <w:left w:type="dxa" w:w="95"/>
+              <w:bottom w:type="dxa" w:w="55"/>
+              <w:right w:type="dxa" w:w="95"/>
+            </w:tcMar>
+            <w:vAlign w:val="top"/>
+          </w:tcPr>
+          <w:p>
+            <w:pPr>
+              <w:spacing w:after="0"/>
+            </w:pPr>
+            <w:r>
+              <w:rPr>
+                <w:rFonts w:ascii="Calibri" w:cs="Calibri" w:eastAsia="Microsoft YaHei" w:hAnsi="Calibri"/>
+                <w:sz w:val="19"/>
+                <w:szCs w:val="19"/>
+              </w:rPr>
+              <w:t xml:space="preserve">正式提取 E1 对 E2 比对（</w:t>
+            </w:r>
+            <w:r>
+              <w:rPr>
+                <w:rFonts w:ascii="Consolas" w:cs="Consolas" w:eastAsia="Microsoft YaHei" w:hAnsi="Consolas"/>
+                <w:sz w:val="19"/>
+                <w:szCs w:val="19"/>
+                <w:shd w:fill="EEEEEE" w:val="clear"/>
+              </w:rPr>
+              <w:t xml:space="preserve">search/extraction/formal/compare_results/</w:t>
+            </w:r>
+            <w:r>
+              <w:rPr>
+                <w:rFonts w:ascii="Calibri" w:cs="Calibri" w:eastAsia="Microsoft YaHei" w:hAnsi="Calibri"/>
+                <w:sz w:val="19"/>
+                <w:szCs w:val="19"/>
+              </w:rPr>
+              <w:t xml:space="preserve">）后，杨俊按 Claude 的建议定了规则，作者 2026 年 10 月 26 日转告「同意，按你的建议更新」（杨俊的原话和书面材料没有给）。写进本说明的读法登记为 </w:t>
+            </w:r>
+            <w:r>
+              <w:rPr>
+                <w:rFonts w:ascii="Calibri" w:cs="Calibri" w:eastAsia="Microsoft YaHei" w:hAnsi="Calibri"/>
+                <w:b/>
+                <w:bCs/>
+                <w:sz w:val="19"/>
+                <w:szCs w:val="19"/>
+              </w:rPr>
+              <w:t xml:space="preserve">X21–X26</w:t>
+            </w:r>
+            <w:r>
+              <w:rPr>
+                <w:rFonts w:ascii="Calibri" w:cs="Calibri" w:eastAsia="Microsoft YaHei" w:hAnsi="Calibri"/>
+                <w:sz w:val="19"/>
+                <w:szCs w:val="19"/>
+              </w:rPr>
+              <w:t xml:space="preserve">：病理算不算活力的依据（X21）、未手术的患儿（X22）、部分坏死对坏死的字面读法（X23）、症状时间没有手术时间时仍要填天数（X24）、间歇或加重的发作按规则 6（X25）、患儿覆盖要各自独立补齐（X26）。</w:t>
+            </w:r>
+            <w:r>
+              <w:rPr>
+                <w:rFonts w:ascii="Calibri" w:cs="Calibri" w:eastAsia="Microsoft YaHei" w:hAnsi="Calibri"/>
+                <w:b/>
+                <w:bCs/>
+                <w:sz w:val="19"/>
+                <w:szCs w:val="19"/>
+              </w:rPr>
+              <w:t xml:space="preserve">X25 和 Claude 10 月 26 日对作者说的建议不一样，原因见 X25，待杨俊确认。</w:t>
+            </w:r>
+            <w:r>
+              <w:rPr>
+                <w:rFonts w:ascii="Calibri" w:cs="Calibri" w:eastAsia="Microsoft YaHei" w:hAnsi="Calibri"/>
+                <w:sz w:val="19"/>
+                <w:szCs w:val="19"/>
+              </w:rPr>
+              <w:t xml:space="preserve"> 改了 5.3、5.6、7、7.1、12、13；没有改协议和工作簿</w:t>
             </w:r>
           </w:p>
         </w:tc>
@@ -9863,7 +9987,79 @@
                 <w:sz w:val="19"/>
                 <w:szCs w:val="19"/>
               </w:rPr>
-              <w:t xml:space="preserve"> 里记类别，不要估一个天数</w:t>
+              <w:t xml:space="preserve"> 里记类别，不要估一个天数。</w:t>
+            </w:r>
+            <w:r>
+              <w:rPr>
+                <w:rFonts w:ascii="Calibri" w:cs="Calibri" w:eastAsia="Microsoft YaHei" w:hAnsi="Calibri"/>
+                <w:b/>
+                <w:bCs/>
+                <w:sz w:val="19"/>
+                <w:szCs w:val="19"/>
+              </w:rPr>
+              <w:t xml:space="preserve">【已裁定 X24，2026-10-26】</w:t>
+            </w:r>
+            <w:r>
+              <w:rPr>
+                <w:rFonts w:ascii="Calibri" w:cs="Calibri" w:eastAsia="Microsoft YaHei" w:hAnsi="Calibri"/>
+                <w:sz w:val="19"/>
+                <w:szCs w:val="19"/>
+              </w:rPr>
+              <w:t xml:space="preserve"> X17 里的 NR 只用于</w:t>
+            </w:r>
+            <w:r>
+              <w:rPr>
+                <w:rFonts w:ascii="Calibri" w:cs="Calibri" w:eastAsia="Microsoft YaHei" w:hAnsi="Calibri"/>
+                <w:b/>
+                <w:bCs/>
+                <w:sz w:val="19"/>
+                <w:szCs w:val="19"/>
+              </w:rPr>
+              <w:t xml:space="preserve">说法含糊</w:t>
+            </w:r>
+            <w:r>
+              <w:rPr>
+                <w:rFonts w:ascii="Calibri" w:cs="Calibri" w:eastAsia="Microsoft YaHei" w:hAnsi="Calibri"/>
+                <w:sz w:val="19"/>
+                <w:szCs w:val="19"/>
+              </w:rPr>
+              <w:t xml:space="preserve">（规则 5）或</w:t>
+            </w:r>
+            <w:r>
+              <w:rPr>
+                <w:rFonts w:ascii="Calibri" w:cs="Calibri" w:eastAsia="Microsoft YaHei" w:hAnsi="Calibri"/>
+                <w:b/>
+                <w:bCs/>
+                <w:sz w:val="19"/>
+                <w:szCs w:val="19"/>
+              </w:rPr>
+              <w:t xml:space="preserve">症状起点无法确定</w:t>
+            </w:r>
+            <w:r>
+              <w:rPr>
+                <w:rFonts w:ascii="Calibri" w:cs="Calibri" w:eastAsia="Microsoft YaHei" w:hAnsi="Calibri"/>
+                <w:sz w:val="19"/>
+                <w:szCs w:val="19"/>
+              </w:rPr>
+              <w:t xml:space="preserve">的情况；原文给了明确的症状时间、只是没写手术时间（例如“腹痛 5 天后入院，手术时间未写”），</w:t>
+            </w:r>
+            <w:r>
+              <w:rPr>
+                <w:rFonts w:ascii="Calibri" w:cs="Calibri" w:eastAsia="Microsoft YaHei" w:hAnsi="Calibri"/>
+                <w:b/>
+                <w:bCs/>
+                <w:sz w:val="19"/>
+                <w:szCs w:val="19"/>
+              </w:rPr>
+              <w:t xml:space="preserve">不能填 NR</w:t>
+            </w:r>
+            <w:r>
+              <w:rPr>
+                <w:rFonts w:ascii="Calibri" w:cs="Calibri" w:eastAsia="Microsoft YaHei" w:hAnsi="Calibri"/>
+                <w:sz w:val="19"/>
+                <w:szCs w:val="19"/>
+              </w:rPr>
+              <w:t xml:space="preserve">，要按 X16 填天数并标下限 Yes。NR 只用于：原文没有症状时间；或症状时间不能归到指数发作</w:t>
             </w:r>
           </w:p>
         </w:tc>
@@ -10018,7 +10214,77 @@
                 <w:sz w:val="19"/>
                 <w:szCs w:val="19"/>
               </w:rPr>
-              <w:t xml:space="preserve">规则 6：间歇性或加重的发作填 Yes，否则 No</w:t>
+              <w:t xml:space="preserve">规则 6：间歇性或加重的发作填 Yes，否则 No。</w:t>
+            </w:r>
+            <w:r>
+              <w:rPr>
+                <w:rFonts w:ascii="Calibri" w:cs="Calibri" w:eastAsia="Microsoft YaHei" w:hAnsi="Calibri"/>
+                <w:b/>
+                <w:bCs/>
+                <w:sz w:val="19"/>
+                <w:szCs w:val="19"/>
+              </w:rPr>
+              <w:t xml:space="preserve">【待杨俊确认 X25】</w:t>
+            </w:r>
+            <w:r>
+              <w:rPr>
+                <w:rFonts w:ascii="Calibri" w:cs="Calibri" w:eastAsia="Microsoft YaHei" w:hAnsi="Calibri"/>
+                <w:sz w:val="19"/>
+                <w:szCs w:val="19"/>
+              </w:rPr>
+              <w:t xml:space="preserve"> 按协议规则 6：</w:t>
+            </w:r>
+            <w:r>
+              <w:rPr>
+                <w:rFonts w:ascii="Consolas" w:cs="Consolas" w:eastAsia="Microsoft YaHei" w:hAnsi="Consolas"/>
+                <w:sz w:val="19"/>
+                <w:szCs w:val="19"/>
+                <w:shd w:fill="EEEEEE" w:val="clear"/>
+              </w:rPr>
+              <w:t xml:space="preserve">idx_dur_days</w:t>
+            </w:r>
+            <w:r>
+              <w:rPr>
+                <w:rFonts w:ascii="Calibri" w:cs="Calibri" w:eastAsia="Microsoft YaHei" w:hAnsi="Calibri"/>
+                <w:sz w:val="19"/>
+                <w:szCs w:val="19"/>
+              </w:rPr>
+              <w:t xml:space="preserve"> 用</w:t>
+            </w:r>
+            <w:r>
+              <w:rPr>
+                <w:rFonts w:ascii="Calibri" w:cs="Calibri" w:eastAsia="Microsoft YaHei" w:hAnsi="Calibri"/>
+                <w:b/>
+                <w:bCs/>
+                <w:sz w:val="19"/>
+                <w:szCs w:val="19"/>
+              </w:rPr>
+              <w:t xml:space="preserve">原文写明的整个时段</w:t>
+            </w:r>
+            <w:r>
+              <w:rPr>
+                <w:rFonts w:ascii="Calibri" w:cs="Calibri" w:eastAsia="Microsoft YaHei" w:hAnsi="Calibri"/>
+                <w:sz w:val="19"/>
+                <w:szCs w:val="19"/>
+              </w:rPr>
+              <w:t xml:space="preserve">，加重的那一段写进 </w:t>
+            </w:r>
+            <w:r>
+              <w:rPr>
+                <w:rFonts w:ascii="Consolas" w:cs="Consolas" w:eastAsia="Microsoft YaHei" w:hAnsi="Consolas"/>
+                <w:sz w:val="19"/>
+                <w:szCs w:val="19"/>
+                <w:shd w:fill="EEEEEE" w:val="clear"/>
+              </w:rPr>
+              <w:t xml:space="preserve">idx_dur_alt_days</w:t>
+            </w:r>
+            <w:r>
+              <w:rPr>
+                <w:rFonts w:ascii="Calibri" w:cs="Calibri" w:eastAsia="Microsoft YaHei" w:hAnsi="Calibri"/>
+                <w:sz w:val="19"/>
+                <w:szCs w:val="19"/>
+              </w:rPr>
+              <w:t xml:space="preserve">；不要把加重那一段当作主要编码</w:t>
             </w:r>
           </w:p>
         </w:tc>
@@ -10192,7 +10458,43 @@
                 <w:sz w:val="19"/>
                 <w:szCs w:val="19"/>
               </w:rPr>
-              <w:t xml:space="preserve">的症状时长、没有给出就诊或入院后到手术的时间时，一律标下限 Yes（不论是小时、天还是月）；给了手术时间的（包括写明"急诊手术""即刻手术"，规则 9 不加时间、不标下限）填 No</w:t>
+              <w:t xml:space="preserve">的症状时长、没有给出就诊或入院后到手术的时间时，一律标下限 Yes（不论是小时、天还是月）；给了手术时间的（包括写明"急诊手术""即刻手术"，规则 9 不加时间、不标下限）填 No。</w:t>
+            </w:r>
+            <w:r>
+              <w:rPr>
+                <w:rFonts w:ascii="Calibri" w:cs="Calibri" w:eastAsia="Microsoft YaHei" w:hAnsi="Calibri"/>
+                <w:b/>
+                <w:bCs/>
+                <w:sz w:val="19"/>
+                <w:szCs w:val="19"/>
+              </w:rPr>
+              <w:t xml:space="preserve">【已裁定 X24】</w:t>
+            </w:r>
+            <w:r>
+              <w:rPr>
+                <w:rFonts w:ascii="Calibri" w:cs="Calibri" w:eastAsia="Microsoft YaHei" w:hAnsi="Calibri"/>
+                <w:sz w:val="19"/>
+                <w:szCs w:val="19"/>
+              </w:rPr>
+              <w:t xml:space="preserve"> 下限偏低的问题由“剔除下限天数”的敏感性分析处理，所以提取时</w:t>
+            </w:r>
+            <w:r>
+              <w:rPr>
+                <w:rFonts w:ascii="Calibri" w:cs="Calibri" w:eastAsia="Microsoft YaHei" w:hAnsi="Calibri"/>
+                <w:b/>
+                <w:bCs/>
+                <w:sz w:val="19"/>
+                <w:szCs w:val="19"/>
+              </w:rPr>
+              <w:t xml:space="preserve">不要靠填 NR 回避</w:t>
+            </w:r>
+            <w:r>
+              <w:rPr>
+                <w:rFonts w:ascii="Calibri" w:cs="Calibri" w:eastAsia="Microsoft YaHei" w:hAnsi="Calibri"/>
+                <w:sz w:val="19"/>
+                <w:szCs w:val="19"/>
+              </w:rPr>
+              <w:t xml:space="preserve">下限</w:t>
             </w:r>
           </w:p>
         </w:tc>
@@ -11792,7 +12094,78 @@
                 <w:sz w:val="19"/>
                 <w:szCs w:val="19"/>
               </w:rPr>
-              <w:t xml:space="preserve"> 作者没有写术中脾状态的，填 NR</w:t>
+              <w:t xml:space="preserve"> 作者没有写术中脾状态的，填 NR。</w:t>
+            </w:r>
+            <w:r>
+              <w:rPr>
+                <w:rFonts w:ascii="Calibri" w:cs="Calibri" w:eastAsia="Microsoft YaHei" w:hAnsi="Calibri"/>
+                <w:b/>
+                <w:bCs/>
+                <w:sz w:val="19"/>
+                <w:szCs w:val="19"/>
+              </w:rPr>
+              <w:t xml:space="preserve">【已裁定 X21，2026-10-26】</w:t>
+            </w:r>
+            <w:r>
+              <w:rPr>
+                <w:rFonts w:ascii="Calibri" w:cs="Calibri" w:eastAsia="Microsoft YaHei" w:hAnsi="Calibri"/>
+                <w:sz w:val="19"/>
+                <w:szCs w:val="19"/>
+              </w:rPr>
+              <w:t xml:space="preserve"> 病理报告对</w:t>
+            </w:r>
+            <w:r>
+              <w:rPr>
+                <w:rFonts w:ascii="Calibri" w:cs="Calibri" w:eastAsia="Microsoft YaHei" w:hAnsi="Calibri"/>
+                <w:b/>
+                <w:bCs/>
+                <w:sz w:val="19"/>
+                <w:szCs w:val="19"/>
+              </w:rPr>
+              <w:t xml:space="preserve">切除标本</w:t>
+            </w:r>
+            <w:r>
+              <w:rPr>
+                <w:rFonts w:ascii="Calibri" w:cs="Calibri" w:eastAsia="Microsoft YaHei" w:hAnsi="Calibri"/>
+                <w:sz w:val="19"/>
+                <w:szCs w:val="19"/>
+              </w:rPr>
+              <w:t xml:space="preserve">的描述（如“出血性梗死”）也算作者的直接描述，</w:t>
+            </w:r>
+            <w:r>
+              <w:rPr>
+                <w:rFonts w:ascii="Consolas" w:cs="Consolas" w:eastAsia="Microsoft YaHei" w:hAnsi="Consolas"/>
+                <w:sz w:val="19"/>
+                <w:szCs w:val="19"/>
+                <w:shd w:fill="EEEEEE" w:val="clear"/>
+              </w:rPr>
+              <w:t xml:space="preserve">viab_basis</w:t>
+            </w:r>
+            <w:r>
+              <w:rPr>
+                <w:rFonts w:ascii="Calibri" w:cs="Calibri" w:eastAsia="Microsoft YaHei" w:hAnsi="Calibri"/>
+                <w:sz w:val="19"/>
+                <w:szCs w:val="19"/>
+              </w:rPr>
+              <w:t xml:space="preserve"> 填 Histology；术中和病理都有填 Both。脾保留的患儿没有切除标本，不能用病理定活力。</w:t>
+            </w:r>
+            <w:r>
+              <w:rPr>
+                <w:rFonts w:ascii="Calibri" w:cs="Calibri" w:eastAsia="Microsoft YaHei" w:hAnsi="Calibri"/>
+                <w:b/>
+                <w:bCs/>
+                <w:sz w:val="19"/>
+                <w:szCs w:val="19"/>
+              </w:rPr>
+              <w:t xml:space="preserve">【已裁定 X23】</w:t>
+            </w:r>
+            <w:r>
+              <w:rPr>
+                <w:rFonts w:ascii="Calibri" w:cs="Calibri" w:eastAsia="Microsoft YaHei" w:hAnsi="Calibri"/>
+                <w:sz w:val="19"/>
+                <w:szCs w:val="19"/>
+              </w:rPr>
+              <w:t xml:space="preserve"> 按原文字面：写“部分、节段性、一极”梗死或坏死 → Partially non-viable；写“脾梗死、坏死”而没有限定 → Non-viable；不因为做了部分脾切除就推断是部分坏死</w:t>
             </w:r>
           </w:p>
         </w:tc>
@@ -11878,7 +12251,42 @@
                 <w:sz w:val="19"/>
                 <w:szCs w:val="19"/>
               </w:rPr>
-              <w:t xml:space="preserve"> 是 NR 时这一项也填 NR（影像上的梗死写进 notes，不作为依据）</w:t>
+              <w:t xml:space="preserve"> 是 NR 时这一项也填 NR（影像上的梗死写进 notes，不作为依据）。</w:t>
+            </w:r>
+            <w:r>
+              <w:rPr>
+                <w:rFonts w:ascii="Calibri" w:cs="Calibri" w:eastAsia="Microsoft YaHei" w:hAnsi="Calibri"/>
+                <w:b/>
+                <w:bCs/>
+                <w:sz w:val="19"/>
+                <w:szCs w:val="19"/>
+              </w:rPr>
+              <w:t xml:space="preserve">【已裁定 X21】</w:t>
+            </w:r>
+            <w:r>
+              <w:rPr>
+                <w:rFonts w:ascii="Calibri" w:cs="Calibri" w:eastAsia="Microsoft YaHei" w:hAnsi="Calibri"/>
+                <w:sz w:val="19"/>
+                <w:szCs w:val="19"/>
+              </w:rPr>
+              <w:t xml:space="preserve"> Histology 和 Both 都是有效依据，见 </w:t>
+            </w:r>
+            <w:r>
+              <w:rPr>
+                <w:rFonts w:ascii="Consolas" w:cs="Consolas" w:eastAsia="Microsoft YaHei" w:hAnsi="Consolas"/>
+                <w:sz w:val="19"/>
+                <w:szCs w:val="19"/>
+                <w:shd w:fill="EEEEEE" w:val="clear"/>
+              </w:rPr>
+              <w:t xml:space="preserve">viability</w:t>
+            </w:r>
+            <w:r>
+              <w:rPr>
+                <w:rFonts w:ascii="Calibri" w:cs="Calibri" w:eastAsia="Microsoft YaHei" w:hAnsi="Calibri"/>
+                <w:sz w:val="19"/>
+                <w:szCs w:val="19"/>
+              </w:rPr>
+              <w:t xml:space="preserve"> 一行</w:t>
             </w:r>
           </w:p>
         </w:tc>
@@ -17481,6 +17889,70 @@
         <w:t xml:space="preserve">，是否另做一个"脾切除即无活力"的补充分析是分析层面的事，由 Ji Wang 和作者决定，提取员不替他们推。</w:t>
       </w:r>
     </w:p>
+    <w:p>
+      <w:pPr>
+        <w:spacing w:after="120"/>
+      </w:pPr>
+      <w:r>
+        <w:rPr>
+          <w:rFonts w:ascii="Calibri" w:cs="Calibri" w:eastAsia="Microsoft YaHei" w:hAnsi="Calibri"/>
+          <w:b/>
+          <w:bCs/>
+        </w:rPr>
+        <w:t xml:space="preserve">【已裁定 X21–X23，2026-10-26】</w:t>
+      </w:r>
+      <w:r>
+        <w:rPr>
+          <w:rFonts w:ascii="Calibri" w:cs="Calibri" w:eastAsia="Microsoft YaHei" w:hAnsi="Calibri"/>
+        </w:rPr>
+        <w:t xml:space="preserve"> ①病理对切除标本的描述算直接描述，</w:t>
+      </w:r>
+      <w:r>
+        <w:rPr>
+          <w:rFonts w:ascii="Consolas" w:cs="Consolas" w:eastAsia="Microsoft YaHei" w:hAnsi="Consolas"/>
+          <w:sz w:val="19"/>
+          <w:szCs w:val="19"/>
+          <w:shd w:fill="EEEEEE" w:val="clear"/>
+        </w:rPr>
+        <w:t xml:space="preserve">viab_basis</w:t>
+      </w:r>
+      <w:r>
+        <w:rPr>
+          <w:rFonts w:ascii="Calibri" w:cs="Calibri" w:eastAsia="Microsoft YaHei" w:hAnsi="Calibri"/>
+        </w:rPr>
+        <w:t xml:space="preserve"> 填 Histology 或 Both；脾保留的患儿不适用。②没做脾脏手术的患儿 </w:t>
+      </w:r>
+      <w:r>
+        <w:rPr>
+          <w:rFonts w:ascii="Consolas" w:cs="Consolas" w:eastAsia="Microsoft YaHei" w:hAnsi="Consolas"/>
+          <w:sz w:val="19"/>
+          <w:szCs w:val="19"/>
+          <w:shd w:fill="EEEEEE" w:val="clear"/>
+        </w:rPr>
+        <w:t xml:space="preserve">viability</w:t>
+      </w:r>
+      <w:r>
+        <w:rPr>
+          <w:rFonts w:ascii="Calibri" w:cs="Calibri" w:eastAsia="Microsoft YaHei" w:hAnsi="Calibri"/>
+        </w:rPr>
+        <w:t xml:space="preserve"> = Not applicable，</w:t>
+      </w:r>
+      <w:r>
+        <w:rPr>
+          <w:rFonts w:ascii="Consolas" w:cs="Consolas" w:eastAsia="Microsoft YaHei" w:hAnsi="Consolas"/>
+          <w:sz w:val="19"/>
+          <w:szCs w:val="19"/>
+          <w:shd w:fill="EEEEEE" w:val="clear"/>
+        </w:rPr>
+        <w:t xml:space="preserve">procedure</w:t>
+      </w:r>
+      <w:r>
+        <w:rPr>
+          <w:rFonts w:ascii="Calibri" w:cs="Calibri" w:eastAsia="Microsoft YaHei" w:hAnsi="Calibri"/>
+        </w:rPr>
+        <w:t xml:space="preserve"> 必须是 No operation，不能留 NR（WS1859_P16 那种开过腹的例外见 7.1）。③Partially non-viable 和 Non-viable 按原文字面区分，不从术式反推；实际影响小，因为部分坏死且做了切除，派生结局本来就是 Non-viable。</w:t>
+      </w:r>
+    </w:p>
     <w:tbl>
       <w:tblPr>
         <w:tblW w:type="dxa" w:w="9026"/>
@@ -19496,6 +19968,238 @@
                 <w:sz w:val="19"/>
                 <w:szCs w:val="19"/>
               </w:rPr>
+              <w:t xml:space="preserve">术中没有写脾的颜色，术后病理报告“脾出血性梗死”，行全脾切除</w:t>
+            </w:r>
+          </w:p>
+        </w:tc>
+        <w:tc>
+          <w:tcPr>
+            <w:tcW w:type="dxa" w:w="5416"/>
+            <w:tcBorders>
+              <w:top w:val="single" w:color="BBBBBB" w:sz="4"/>
+              <w:left w:val="single" w:color="BBBBBB" w:sz="4"/>
+              <w:bottom w:val="single" w:color="BBBBBB" w:sz="4"/>
+              <w:right w:val="single" w:color="BBBBBB" w:sz="4"/>
+            </w:tcBorders>
+            <w:tcMar>
+              <w:top w:type="dxa" w:w="55"/>
+              <w:left w:type="dxa" w:w="95"/>
+              <w:bottom w:type="dxa" w:w="55"/>
+              <w:right w:type="dxa" w:w="95"/>
+            </w:tcMar>
+            <w:vAlign w:val="top"/>
+          </w:tcPr>
+          <w:p>
+            <w:pPr>
+              <w:spacing w:after="0"/>
+            </w:pPr>
+            <w:r>
+              <w:rPr>
+                <w:rFonts w:ascii="Consolas" w:cs="Consolas" w:eastAsia="Microsoft YaHei" w:hAnsi="Consolas"/>
+                <w:sz w:val="19"/>
+                <w:szCs w:val="19"/>
+                <w:shd w:fill="EEEEEE" w:val="clear"/>
+              </w:rPr>
+              <w:t xml:space="preserve">viability</w:t>
+            </w:r>
+            <w:r>
+              <w:rPr>
+                <w:rFonts w:ascii="Calibri" w:cs="Calibri" w:eastAsia="Microsoft YaHei" w:hAnsi="Calibri"/>
+                <w:sz w:val="19"/>
+                <w:szCs w:val="19"/>
+              </w:rPr>
+              <w:t xml:space="preserve"> = Non-viable；</w:t>
+            </w:r>
+            <w:r>
+              <w:rPr>
+                <w:rFonts w:ascii="Consolas" w:cs="Consolas" w:eastAsia="Microsoft YaHei" w:hAnsi="Consolas"/>
+                <w:sz w:val="19"/>
+                <w:szCs w:val="19"/>
+                <w:shd w:fill="EEEEEE" w:val="clear"/>
+              </w:rPr>
+              <w:t xml:space="preserve">viab_basis</w:t>
+            </w:r>
+            <w:r>
+              <w:rPr>
+                <w:rFonts w:ascii="Calibri" w:cs="Calibri" w:eastAsia="Microsoft YaHei" w:hAnsi="Calibri"/>
+                <w:sz w:val="19"/>
+                <w:szCs w:val="19"/>
+              </w:rPr>
+              <w:t xml:space="preserve"> = Histology；</w:t>
+            </w:r>
+            <w:r>
+              <w:rPr>
+                <w:rFonts w:ascii="Consolas" w:cs="Consolas" w:eastAsia="Microsoft YaHei" w:hAnsi="Consolas"/>
+                <w:sz w:val="19"/>
+                <w:szCs w:val="19"/>
+                <w:shd w:fill="EEEEEE" w:val="clear"/>
+              </w:rPr>
+              <w:t xml:space="preserve">procedure</w:t>
+            </w:r>
+            <w:r>
+              <w:rPr>
+                <w:rFonts w:ascii="Calibri" w:cs="Calibri" w:eastAsia="Microsoft YaHei" w:hAnsi="Calibri"/>
+                <w:sz w:val="19"/>
+                <w:szCs w:val="19"/>
+              </w:rPr>
+              <w:t xml:space="preserve"> = Total splenectomy。</w:t>
+            </w:r>
+            <w:r>
+              <w:rPr>
+                <w:rFonts w:ascii="Calibri" w:cs="Calibri" w:eastAsia="Microsoft YaHei" w:hAnsi="Calibri"/>
+                <w:b/>
+                <w:bCs/>
+                <w:sz w:val="19"/>
+                <w:szCs w:val="19"/>
+              </w:rPr>
+              <w:t xml:space="preserve">【已裁定 X21】</w:t>
+            </w:r>
+            <w:r>
+              <w:rPr>
+                <w:rFonts w:ascii="Calibri" w:cs="Calibri" w:eastAsia="Microsoft YaHei" w:hAnsi="Calibri"/>
+                <w:sz w:val="19"/>
+                <w:szCs w:val="19"/>
+              </w:rPr>
+              <w:t xml:space="preserve"> 病理对切除标本的描述算直接描述</w:t>
+            </w:r>
+          </w:p>
+        </w:tc>
+      </w:tr>
+      <w:tr>
+        <w:trPr>
+          <w:cantSplit/>
+          <w:tblHeader w:val="false"/>
+        </w:trPr>
+        <w:tc>
+          <w:tcPr>
+            <w:tcW w:type="dxa" w:w="3610"/>
+            <w:tcBorders>
+              <w:top w:val="single" w:color="BBBBBB" w:sz="4"/>
+              <w:left w:val="single" w:color="BBBBBB" w:sz="4"/>
+              <w:bottom w:val="single" w:color="BBBBBB" w:sz="4"/>
+              <w:right w:val="single" w:color="BBBBBB" w:sz="4"/>
+            </w:tcBorders>
+            <w:tcMar>
+              <w:top w:type="dxa" w:w="55"/>
+              <w:left w:type="dxa" w:w="95"/>
+              <w:bottom w:type="dxa" w:w="55"/>
+              <w:right w:type="dxa" w:w="95"/>
+            </w:tcMar>
+            <w:vAlign w:val="top"/>
+          </w:tcPr>
+          <w:p>
+            <w:pPr>
+              <w:spacing w:after="0"/>
+            </w:pPr>
+            <w:r>
+              <w:rPr>
+                <w:rFonts w:ascii="Calibri" w:cs="Calibri" w:eastAsia="Microsoft YaHei" w:hAnsi="Calibri"/>
+                <w:sz w:val="19"/>
+                <w:szCs w:val="19"/>
+              </w:rPr>
+              <w:t xml:space="preserve">脾上极紫黑、其余正常，切除上极后固定下极</w:t>
+            </w:r>
+          </w:p>
+        </w:tc>
+        <w:tc>
+          <w:tcPr>
+            <w:tcW w:type="dxa" w:w="5416"/>
+            <w:tcBorders>
+              <w:top w:val="single" w:color="BBBBBB" w:sz="4"/>
+              <w:left w:val="single" w:color="BBBBBB" w:sz="4"/>
+              <w:bottom w:val="single" w:color="BBBBBB" w:sz="4"/>
+              <w:right w:val="single" w:color="BBBBBB" w:sz="4"/>
+            </w:tcBorders>
+            <w:tcMar>
+              <w:top w:type="dxa" w:w="55"/>
+              <w:left w:type="dxa" w:w="95"/>
+              <w:bottom w:type="dxa" w:w="55"/>
+              <w:right w:type="dxa" w:w="95"/>
+            </w:tcMar>
+            <w:vAlign w:val="top"/>
+          </w:tcPr>
+          <w:p>
+            <w:pPr>
+              <w:spacing w:after="0"/>
+            </w:pPr>
+            <w:r>
+              <w:rPr>
+                <w:rFonts w:ascii="Calibri" w:cs="Calibri" w:eastAsia="Microsoft YaHei" w:hAnsi="Calibri"/>
+                <w:sz w:val="19"/>
+                <w:szCs w:val="19"/>
+              </w:rPr>
+              <w:t xml:space="preserve">Partially non-viable；</w:t>
+            </w:r>
+            <w:r>
+              <w:rPr>
+                <w:rFonts w:ascii="Consolas" w:cs="Consolas" w:eastAsia="Microsoft YaHei" w:hAnsi="Consolas"/>
+                <w:sz w:val="19"/>
+                <w:szCs w:val="19"/>
+                <w:shd w:fill="EEEEEE" w:val="clear"/>
+              </w:rPr>
+              <w:t xml:space="preserve">viab_basis</w:t>
+            </w:r>
+            <w:r>
+              <w:rPr>
+                <w:rFonts w:ascii="Calibri" w:cs="Calibri" w:eastAsia="Microsoft YaHei" w:hAnsi="Calibri"/>
+                <w:sz w:val="19"/>
+                <w:szCs w:val="19"/>
+              </w:rPr>
+              <w:t xml:space="preserve"> = Intraoperative；Partial splenectomy +/- splenopexy。</w:t>
+            </w:r>
+            <w:r>
+              <w:rPr>
+                <w:rFonts w:ascii="Calibri" w:cs="Calibri" w:eastAsia="Microsoft YaHei" w:hAnsi="Calibri"/>
+                <w:b/>
+                <w:bCs/>
+                <w:sz w:val="19"/>
+                <w:szCs w:val="19"/>
+              </w:rPr>
+              <w:t xml:space="preserve">【已裁定 X23】</w:t>
+            </w:r>
+            <w:r>
+              <w:rPr>
+                <w:rFonts w:ascii="Calibri" w:cs="Calibri" w:eastAsia="Microsoft YaHei" w:hAnsi="Calibri"/>
+                <w:sz w:val="19"/>
+                <w:szCs w:val="19"/>
+              </w:rPr>
+              <w:t xml:space="preserve"> 原文写“上极”，所以是部分；原文只写“脾梗死”就填 Non-viable</w:t>
+            </w:r>
+          </w:p>
+        </w:tc>
+      </w:tr>
+      <w:tr>
+        <w:trPr>
+          <w:cantSplit/>
+          <w:tblHeader w:val="false"/>
+        </w:trPr>
+        <w:tc>
+          <w:tcPr>
+            <w:tcW w:type="dxa" w:w="3610"/>
+            <w:tcBorders>
+              <w:top w:val="single" w:color="BBBBBB" w:sz="4"/>
+              <w:left w:val="single" w:color="BBBBBB" w:sz="4"/>
+              <w:bottom w:val="single" w:color="BBBBBB" w:sz="4"/>
+              <w:right w:val="single" w:color="BBBBBB" w:sz="4"/>
+            </w:tcBorders>
+            <w:tcMar>
+              <w:top w:type="dxa" w:w="55"/>
+              <w:left w:type="dxa" w:w="95"/>
+              <w:bottom w:type="dxa" w:w="55"/>
+              <w:right w:type="dxa" w:w="95"/>
+            </w:tcMar>
+            <w:vAlign w:val="top"/>
+          </w:tcPr>
+          <w:p>
+            <w:pPr>
+              <w:spacing w:after="0"/>
+            </w:pPr>
+            <w:r>
+              <w:rPr>
+                <w:rFonts w:ascii="Calibri" w:cs="Calibri" w:eastAsia="Microsoft YaHei" w:hAnsi="Calibri"/>
+                <w:sz w:val="19"/>
+                <w:szCs w:val="19"/>
+              </w:rPr>
               <w:t xml:space="preserve">术中看起来有活力，术后病理报告为出血性梗死</w:t>
             </w:r>
           </w:p>
@@ -26014,6 +26718,714 @@
         <w:spacing w:after="120"/>
       </w:pPr>
     </w:p>
+    <w:tbl>
+      <w:tblPr>
+        <w:tblW w:type="dxa" w:w="9026"/>
+        <w:tblBorders>
+          <w:top w:val="single" w:color="auto" w:sz="4"/>
+          <w:left w:val="single" w:color="auto" w:sz="4"/>
+          <w:bottom w:val="single" w:color="auto" w:sz="4"/>
+          <w:right w:val="single" w:color="auto" w:sz="4"/>
+          <w:insideH w:val="single" w:color="auto" w:sz="4"/>
+          <w:insideV w:val="single" w:color="auto" w:sz="4"/>
+        </w:tblBorders>
+      </w:tblPr>
+      <w:tblGrid>
+        <w:gridCol w:w="900"/>
+        <w:gridCol w:w="3205"/>
+        <w:gridCol w:w="4921"/>
+      </w:tblGrid>
+      <w:tr>
+        <w:trPr>
+          <w:cantSplit/>
+          <w:tblHeader/>
+        </w:trPr>
+        <w:tc>
+          <w:tcPr>
+            <w:tcW w:type="dxa" w:w="900"/>
+            <w:tcBorders>
+              <w:top w:val="single" w:color="BBBBBB" w:sz="4"/>
+              <w:left w:val="single" w:color="BBBBBB" w:sz="4"/>
+              <w:bottom w:val="single" w:color="BBBBBB" w:sz="4"/>
+              <w:right w:val="single" w:color="BBBBBB" w:sz="4"/>
+            </w:tcBorders>
+            <w:shd w:fill="E8EEF4" w:val="clear"/>
+            <w:tcMar>
+              <w:top w:type="dxa" w:w="55"/>
+              <w:left w:type="dxa" w:w="95"/>
+              <w:bottom w:type="dxa" w:w="55"/>
+              <w:right w:type="dxa" w:w="95"/>
+            </w:tcMar>
+            <w:vAlign w:val="top"/>
+          </w:tcPr>
+          <w:p>
+            <w:pPr>
+              <w:spacing w:after="0"/>
+            </w:pPr>
+            <w:r>
+              <w:rPr>
+                <w:rFonts w:ascii="Calibri" w:cs="Calibri" w:eastAsia="Microsoft YaHei" w:hAnsi="Calibri"/>
+                <w:b/>
+                <w:bCs/>
+                <w:sz w:val="19"/>
+                <w:szCs w:val="19"/>
+              </w:rPr>
+              <w:t xml:space="preserve">X21</w:t>
+            </w:r>
+          </w:p>
+        </w:tc>
+        <w:tc>
+          <w:tcPr>
+            <w:tcW w:type="dxa" w:w="3205"/>
+            <w:tcBorders>
+              <w:top w:val="single" w:color="BBBBBB" w:sz="4"/>
+              <w:left w:val="single" w:color="BBBBBB" w:sz="4"/>
+              <w:bottom w:val="single" w:color="BBBBBB" w:sz="4"/>
+              <w:right w:val="single" w:color="BBBBBB" w:sz="4"/>
+            </w:tcBorders>
+            <w:shd w:fill="E8EEF4" w:val="clear"/>
+            <w:tcMar>
+              <w:top w:type="dxa" w:w="55"/>
+              <w:left w:type="dxa" w:w="95"/>
+              <w:bottom w:type="dxa" w:w="55"/>
+              <w:right w:type="dxa" w:w="95"/>
+            </w:tcMar>
+            <w:vAlign w:val="top"/>
+          </w:tcPr>
+          <w:p>
+            <w:pPr>
+              <w:spacing w:after="0"/>
+            </w:pPr>
+            <w:r>
+              <w:rPr>
+                <w:rFonts w:ascii="Calibri" w:cs="Calibri" w:eastAsia="Microsoft YaHei" w:hAnsi="Calibri"/>
+                <w:b/>
+                <w:bCs/>
+                <w:sz w:val="19"/>
+                <w:szCs w:val="19"/>
+              </w:rPr>
+              <w:t xml:space="preserve">病理算不算活力的依据（正式比对议题 V1）</w:t>
+            </w:r>
+          </w:p>
+        </w:tc>
+        <w:tc>
+          <w:tcPr>
+            <w:tcW w:type="dxa" w:w="4921"/>
+            <w:tcBorders>
+              <w:top w:val="single" w:color="BBBBBB" w:sz="4"/>
+              <w:left w:val="single" w:color="BBBBBB" w:sz="4"/>
+              <w:bottom w:val="single" w:color="BBBBBB" w:sz="4"/>
+              <w:right w:val="single" w:color="BBBBBB" w:sz="4"/>
+            </w:tcBorders>
+            <w:shd w:fill="E8EEF4" w:val="clear"/>
+            <w:tcMar>
+              <w:top w:type="dxa" w:w="55"/>
+              <w:left w:type="dxa" w:w="95"/>
+              <w:bottom w:type="dxa" w:w="55"/>
+              <w:right w:type="dxa" w:w="95"/>
+            </w:tcMar>
+            <w:vAlign w:val="top"/>
+          </w:tcPr>
+          <w:p>
+            <w:pPr>
+              <w:spacing w:after="0"/>
+            </w:pPr>
+            <w:r>
+              <w:rPr>
+                <w:rFonts w:ascii="Calibri" w:cs="Calibri" w:eastAsia="Microsoft YaHei" w:hAnsi="Calibri"/>
+                <w:b/>
+                <w:bCs/>
+                <w:sz w:val="19"/>
+                <w:szCs w:val="19"/>
+              </w:rPr>
+              <w:t xml:space="preserve">切除标本的病理描述算作者的直接描述，</w:t>
+            </w:r>
+            <w:r>
+              <w:rPr>
+                <w:rFonts w:ascii="Consolas" w:cs="Consolas" w:eastAsia="Microsoft YaHei" w:hAnsi="Consolas"/>
+                <w:b/>
+                <w:bCs/>
+                <w:sz w:val="19"/>
+                <w:szCs w:val="19"/>
+                <w:shd w:fill="EEEEEE" w:val="clear"/>
+              </w:rPr>
+              <w:t xml:space="preserve">viab_basis</w:t>
+            </w:r>
+            <w:r>
+              <w:rPr>
+                <w:rFonts w:ascii="Calibri" w:cs="Calibri" w:eastAsia="Microsoft YaHei" w:hAnsi="Calibri"/>
+                <w:b/>
+                <w:bCs/>
+                <w:sz w:val="19"/>
+                <w:szCs w:val="19"/>
+              </w:rPr>
+              <w:t xml:space="preserve"> 填 Histology 或 Both；脾保留的患儿不适用。【已裁定，2026-10-26，杨俊按 Claude 的建议；作者转告】</w:t>
+            </w:r>
+          </w:p>
+        </w:tc>
+      </w:tr>
+      <w:tr>
+        <w:trPr>
+          <w:cantSplit/>
+          <w:tblHeader w:val="false"/>
+        </w:trPr>
+        <w:tc>
+          <w:tcPr>
+            <w:tcW w:type="dxa" w:w="900"/>
+            <w:tcBorders>
+              <w:top w:val="single" w:color="BBBBBB" w:sz="4"/>
+              <w:left w:val="single" w:color="BBBBBB" w:sz="4"/>
+              <w:bottom w:val="single" w:color="BBBBBB" w:sz="4"/>
+              <w:right w:val="single" w:color="BBBBBB" w:sz="4"/>
+            </w:tcBorders>
+            <w:tcMar>
+              <w:top w:type="dxa" w:w="55"/>
+              <w:left w:type="dxa" w:w="95"/>
+              <w:bottom w:type="dxa" w:w="55"/>
+              <w:right w:type="dxa" w:w="95"/>
+            </w:tcMar>
+            <w:vAlign w:val="top"/>
+          </w:tcPr>
+          <w:p>
+            <w:pPr>
+              <w:spacing w:after="0"/>
+            </w:pPr>
+            <w:r>
+              <w:rPr>
+                <w:rFonts w:ascii="Calibri" w:cs="Calibri" w:eastAsia="Microsoft YaHei" w:hAnsi="Calibri"/>
+                <w:sz w:val="19"/>
+                <w:szCs w:val="19"/>
+              </w:rPr>
+              <w:t xml:space="preserve">X22</w:t>
+            </w:r>
+          </w:p>
+        </w:tc>
+        <w:tc>
+          <w:tcPr>
+            <w:tcW w:type="dxa" w:w="3205"/>
+            <w:tcBorders>
+              <w:top w:val="single" w:color="BBBBBB" w:sz="4"/>
+              <w:left w:val="single" w:color="BBBBBB" w:sz="4"/>
+              <w:bottom w:val="single" w:color="BBBBBB" w:sz="4"/>
+              <w:right w:val="single" w:color="BBBBBB" w:sz="4"/>
+            </w:tcBorders>
+            <w:tcMar>
+              <w:top w:type="dxa" w:w="55"/>
+              <w:left w:type="dxa" w:w="95"/>
+              <w:bottom w:type="dxa" w:w="55"/>
+              <w:right w:type="dxa" w:w="95"/>
+            </w:tcMar>
+            <w:vAlign w:val="top"/>
+          </w:tcPr>
+          <w:p>
+            <w:pPr>
+              <w:spacing w:after="0"/>
+            </w:pPr>
+            <w:r>
+              <w:rPr>
+                <w:rFonts w:ascii="Calibri" w:cs="Calibri" w:eastAsia="Microsoft YaHei" w:hAnsi="Calibri"/>
+                <w:sz w:val="19"/>
+                <w:szCs w:val="19"/>
+              </w:rPr>
+              <w:t xml:space="preserve">未手术患儿的活力（议题 V4）</w:t>
+            </w:r>
+          </w:p>
+        </w:tc>
+        <w:tc>
+          <w:tcPr>
+            <w:tcW w:type="dxa" w:w="4921"/>
+            <w:tcBorders>
+              <w:top w:val="single" w:color="BBBBBB" w:sz="4"/>
+              <w:left w:val="single" w:color="BBBBBB" w:sz="4"/>
+              <w:bottom w:val="single" w:color="BBBBBB" w:sz="4"/>
+              <w:right w:val="single" w:color="BBBBBB" w:sz="4"/>
+            </w:tcBorders>
+            <w:tcMar>
+              <w:top w:type="dxa" w:w="55"/>
+              <w:left w:type="dxa" w:w="95"/>
+              <w:bottom w:type="dxa" w:w="55"/>
+              <w:right w:type="dxa" w:w="95"/>
+            </w:tcMar>
+            <w:vAlign w:val="top"/>
+          </w:tcPr>
+          <w:p>
+            <w:pPr>
+              <w:spacing w:after="0"/>
+            </w:pPr>
+            <w:r>
+              <w:rPr>
+                <w:rFonts w:ascii="Consolas" w:cs="Consolas" w:eastAsia="Microsoft YaHei" w:hAnsi="Consolas"/>
+                <w:sz w:val="19"/>
+                <w:szCs w:val="19"/>
+                <w:shd w:fill="EEEEEE" w:val="clear"/>
+              </w:rPr>
+              <w:t xml:space="preserve">viability</w:t>
+            </w:r>
+            <w:r>
+              <w:rPr>
+                <w:rFonts w:ascii="Calibri" w:cs="Calibri" w:eastAsia="Microsoft YaHei" w:hAnsi="Calibri"/>
+                <w:sz w:val="19"/>
+                <w:szCs w:val="19"/>
+              </w:rPr>
+              <w:t xml:space="preserve"> = Not applicable，</w:t>
+            </w:r>
+            <w:r>
+              <w:rPr>
+                <w:rFonts w:ascii="Consolas" w:cs="Consolas" w:eastAsia="Microsoft YaHei" w:hAnsi="Consolas"/>
+                <w:sz w:val="19"/>
+                <w:szCs w:val="19"/>
+                <w:shd w:fill="EEEEEE" w:val="clear"/>
+              </w:rPr>
+              <w:t xml:space="preserve">procedure</w:t>
+            </w:r>
+            <w:r>
+              <w:rPr>
+                <w:rFonts w:ascii="Calibri" w:cs="Calibri" w:eastAsia="Microsoft YaHei" w:hAnsi="Calibri"/>
+                <w:sz w:val="19"/>
+                <w:szCs w:val="19"/>
+              </w:rPr>
+              <w:t xml:space="preserve"> = No operation（不能留 NR）；派生结局归“其他”。WS1859_P16 一类开过腹的例外不变。【已裁定，2026-10-26】</w:t>
+            </w:r>
+          </w:p>
+        </w:tc>
+      </w:tr>
+      <w:tr>
+        <w:trPr>
+          <w:cantSplit/>
+          <w:tblHeader w:val="false"/>
+        </w:trPr>
+        <w:tc>
+          <w:tcPr>
+            <w:tcW w:type="dxa" w:w="900"/>
+            <w:tcBorders>
+              <w:top w:val="single" w:color="BBBBBB" w:sz="4"/>
+              <w:left w:val="single" w:color="BBBBBB" w:sz="4"/>
+              <w:bottom w:val="single" w:color="BBBBBB" w:sz="4"/>
+              <w:right w:val="single" w:color="BBBBBB" w:sz="4"/>
+            </w:tcBorders>
+            <w:tcMar>
+              <w:top w:type="dxa" w:w="55"/>
+              <w:left w:type="dxa" w:w="95"/>
+              <w:bottom w:type="dxa" w:w="55"/>
+              <w:right w:type="dxa" w:w="95"/>
+            </w:tcMar>
+            <w:vAlign w:val="top"/>
+          </w:tcPr>
+          <w:p>
+            <w:pPr>
+              <w:spacing w:after="0"/>
+            </w:pPr>
+            <w:r>
+              <w:rPr>
+                <w:rFonts w:ascii="Calibri" w:cs="Calibri" w:eastAsia="Microsoft YaHei" w:hAnsi="Calibri"/>
+                <w:sz w:val="19"/>
+                <w:szCs w:val="19"/>
+              </w:rPr>
+              <w:t xml:space="preserve">X23</w:t>
+            </w:r>
+          </w:p>
+        </w:tc>
+        <w:tc>
+          <w:tcPr>
+            <w:tcW w:type="dxa" w:w="3205"/>
+            <w:tcBorders>
+              <w:top w:val="single" w:color="BBBBBB" w:sz="4"/>
+              <w:left w:val="single" w:color="BBBBBB" w:sz="4"/>
+              <w:bottom w:val="single" w:color="BBBBBB" w:sz="4"/>
+              <w:right w:val="single" w:color="BBBBBB" w:sz="4"/>
+            </w:tcBorders>
+            <w:tcMar>
+              <w:top w:type="dxa" w:w="55"/>
+              <w:left w:type="dxa" w:w="95"/>
+              <w:bottom w:type="dxa" w:w="55"/>
+              <w:right w:type="dxa" w:w="95"/>
+            </w:tcMar>
+            <w:vAlign w:val="top"/>
+          </w:tcPr>
+          <w:p>
+            <w:pPr>
+              <w:spacing w:after="0"/>
+            </w:pPr>
+            <w:r>
+              <w:rPr>
+                <w:rFonts w:ascii="Calibri" w:cs="Calibri" w:eastAsia="Microsoft YaHei" w:hAnsi="Calibri"/>
+                <w:sz w:val="19"/>
+                <w:szCs w:val="19"/>
+              </w:rPr>
+              <w:t xml:space="preserve">Partially non-viable 和 Non-viable 的界线（议题 V3）</w:t>
+            </w:r>
+          </w:p>
+        </w:tc>
+        <w:tc>
+          <w:tcPr>
+            <w:tcW w:type="dxa" w:w="4921"/>
+            <w:tcBorders>
+              <w:top w:val="single" w:color="BBBBBB" w:sz="4"/>
+              <w:left w:val="single" w:color="BBBBBB" w:sz="4"/>
+              <w:bottom w:val="single" w:color="BBBBBB" w:sz="4"/>
+              <w:right w:val="single" w:color="BBBBBB" w:sz="4"/>
+            </w:tcBorders>
+            <w:tcMar>
+              <w:top w:type="dxa" w:w="55"/>
+              <w:left w:type="dxa" w:w="95"/>
+              <w:bottom w:type="dxa" w:w="55"/>
+              <w:right w:type="dxa" w:w="95"/>
+            </w:tcMar>
+            <w:vAlign w:val="top"/>
+          </w:tcPr>
+          <w:p>
+            <w:pPr>
+              <w:spacing w:after="0"/>
+            </w:pPr>
+            <w:r>
+              <w:rPr>
+                <w:rFonts w:ascii="Calibri" w:cs="Calibri" w:eastAsia="Microsoft YaHei" w:hAnsi="Calibri"/>
+                <w:sz w:val="19"/>
+                <w:szCs w:val="19"/>
+              </w:rPr>
+              <w:t xml:space="preserve">按原文字面：“部分、节段性、一极”→ Partially；未限定的“梗死、坏死”→ Non-viable；不从术式反推。【已裁定，2026-10-26】</w:t>
+            </w:r>
+          </w:p>
+        </w:tc>
+      </w:tr>
+      <w:tr>
+        <w:trPr>
+          <w:cantSplit/>
+          <w:tblHeader w:val="false"/>
+        </w:trPr>
+        <w:tc>
+          <w:tcPr>
+            <w:tcW w:type="dxa" w:w="900"/>
+            <w:tcBorders>
+              <w:top w:val="single" w:color="BBBBBB" w:sz="4"/>
+              <w:left w:val="single" w:color="BBBBBB" w:sz="4"/>
+              <w:bottom w:val="single" w:color="BBBBBB" w:sz="4"/>
+              <w:right w:val="single" w:color="BBBBBB" w:sz="4"/>
+            </w:tcBorders>
+            <w:tcMar>
+              <w:top w:type="dxa" w:w="55"/>
+              <w:left w:type="dxa" w:w="95"/>
+              <w:bottom w:type="dxa" w:w="55"/>
+              <w:right w:type="dxa" w:w="95"/>
+            </w:tcMar>
+            <w:vAlign w:val="top"/>
+          </w:tcPr>
+          <w:p>
+            <w:pPr>
+              <w:spacing w:after="0"/>
+            </w:pPr>
+            <w:r>
+              <w:rPr>
+                <w:rFonts w:ascii="Calibri" w:cs="Calibri" w:eastAsia="Microsoft YaHei" w:hAnsi="Calibri"/>
+                <w:sz w:val="19"/>
+                <w:szCs w:val="19"/>
+              </w:rPr>
+              <w:t xml:space="preserve">X24</w:t>
+            </w:r>
+          </w:p>
+        </w:tc>
+        <w:tc>
+          <w:tcPr>
+            <w:tcW w:type="dxa" w:w="3205"/>
+            <w:tcBorders>
+              <w:top w:val="single" w:color="BBBBBB" w:sz="4"/>
+              <w:left w:val="single" w:color="BBBBBB" w:sz="4"/>
+              <w:bottom w:val="single" w:color="BBBBBB" w:sz="4"/>
+              <w:right w:val="single" w:color="BBBBBB" w:sz="4"/>
+            </w:tcBorders>
+            <w:tcMar>
+              <w:top w:type="dxa" w:w="55"/>
+              <w:left w:type="dxa" w:w="95"/>
+              <w:bottom w:type="dxa" w:w="55"/>
+              <w:right w:type="dxa" w:w="95"/>
+            </w:tcMar>
+            <w:vAlign w:val="top"/>
+          </w:tcPr>
+          <w:p>
+            <w:pPr>
+              <w:spacing w:after="0"/>
+            </w:pPr>
+            <w:r>
+              <w:rPr>
+                <w:rFonts w:ascii="Calibri" w:cs="Calibri" w:eastAsia="Microsoft YaHei" w:hAnsi="Calibri"/>
+                <w:sz w:val="19"/>
+                <w:szCs w:val="19"/>
+              </w:rPr>
+              <w:t xml:space="preserve">只有症状时间、没有手术时间时（议题 D1）</w:t>
+            </w:r>
+          </w:p>
+        </w:tc>
+        <w:tc>
+          <w:tcPr>
+            <w:tcW w:type="dxa" w:w="4921"/>
+            <w:tcBorders>
+              <w:top w:val="single" w:color="BBBBBB" w:sz="4"/>
+              <w:left w:val="single" w:color="BBBBBB" w:sz="4"/>
+              <w:bottom w:val="single" w:color="BBBBBB" w:sz="4"/>
+              <w:right w:val="single" w:color="BBBBBB" w:sz="4"/>
+            </w:tcBorders>
+            <w:tcMar>
+              <w:top w:type="dxa" w:w="55"/>
+              <w:left w:type="dxa" w:w="95"/>
+              <w:bottom w:type="dxa" w:w="55"/>
+              <w:right w:type="dxa" w:w="95"/>
+            </w:tcMar>
+            <w:vAlign w:val="top"/>
+          </w:tcPr>
+          <w:p>
+            <w:pPr>
+              <w:spacing w:after="0"/>
+            </w:pPr>
+            <w:r>
+              <w:rPr>
+                <w:rFonts w:ascii="Calibri" w:cs="Calibri" w:eastAsia="Microsoft YaHei" w:hAnsi="Calibri"/>
+                <w:sz w:val="19"/>
+                <w:szCs w:val="19"/>
+              </w:rPr>
+              <w:t xml:space="preserve">填天数并标下限 Yes；NR 只用于原文没有症状时间或不能归到指数发作；不靠 NR 回避下限。【已裁定，2026-10-26】</w:t>
+            </w:r>
+          </w:p>
+        </w:tc>
+      </w:tr>
+      <w:tr>
+        <w:trPr>
+          <w:cantSplit/>
+          <w:tblHeader w:val="false"/>
+        </w:trPr>
+        <w:tc>
+          <w:tcPr>
+            <w:tcW w:type="dxa" w:w="900"/>
+            <w:tcBorders>
+              <w:top w:val="single" w:color="BBBBBB" w:sz="4"/>
+              <w:left w:val="single" w:color="BBBBBB" w:sz="4"/>
+              <w:bottom w:val="single" w:color="BBBBBB" w:sz="4"/>
+              <w:right w:val="single" w:color="BBBBBB" w:sz="4"/>
+            </w:tcBorders>
+            <w:tcMar>
+              <w:top w:type="dxa" w:w="55"/>
+              <w:left w:type="dxa" w:w="95"/>
+              <w:bottom w:type="dxa" w:w="55"/>
+              <w:right w:type="dxa" w:w="95"/>
+            </w:tcMar>
+            <w:vAlign w:val="top"/>
+          </w:tcPr>
+          <w:p>
+            <w:pPr>
+              <w:spacing w:after="0"/>
+            </w:pPr>
+            <w:r>
+              <w:rPr>
+                <w:rFonts w:ascii="Calibri" w:cs="Calibri" w:eastAsia="Microsoft YaHei" w:hAnsi="Calibri"/>
+                <w:sz w:val="19"/>
+                <w:szCs w:val="19"/>
+              </w:rPr>
+              <w:t xml:space="preserve">X25</w:t>
+            </w:r>
+          </w:p>
+        </w:tc>
+        <w:tc>
+          <w:tcPr>
+            <w:tcW w:type="dxa" w:w="3205"/>
+            <w:tcBorders>
+              <w:top w:val="single" w:color="BBBBBB" w:sz="4"/>
+              <w:left w:val="single" w:color="BBBBBB" w:sz="4"/>
+              <w:bottom w:val="single" w:color="BBBBBB" w:sz="4"/>
+              <w:right w:val="single" w:color="BBBBBB" w:sz="4"/>
+            </w:tcBorders>
+            <w:tcMar>
+              <w:top w:type="dxa" w:w="55"/>
+              <w:left w:type="dxa" w:w="95"/>
+              <w:bottom w:type="dxa" w:w="55"/>
+              <w:right w:type="dxa" w:w="95"/>
+            </w:tcMar>
+            <w:vAlign w:val="top"/>
+          </w:tcPr>
+          <w:p>
+            <w:pPr>
+              <w:spacing w:after="0"/>
+            </w:pPr>
+            <w:r>
+              <w:rPr>
+                <w:rFonts w:ascii="Calibri" w:cs="Calibri" w:eastAsia="Microsoft YaHei" w:hAnsi="Calibri"/>
+                <w:sz w:val="19"/>
+                <w:szCs w:val="19"/>
+              </w:rPr>
+              <w:t xml:space="preserve">间歇或加重的发作取哪一段（议题 D3）</w:t>
+            </w:r>
+          </w:p>
+        </w:tc>
+        <w:tc>
+          <w:tcPr>
+            <w:tcW w:type="dxa" w:w="4921"/>
+            <w:tcBorders>
+              <w:top w:val="single" w:color="BBBBBB" w:sz="4"/>
+              <w:left w:val="single" w:color="BBBBBB" w:sz="4"/>
+              <w:bottom w:val="single" w:color="BBBBBB" w:sz="4"/>
+              <w:right w:val="single" w:color="BBBBBB" w:sz="4"/>
+            </w:tcBorders>
+            <w:tcMar>
+              <w:top w:type="dxa" w:w="55"/>
+              <w:left w:type="dxa" w:w="95"/>
+              <w:bottom w:type="dxa" w:w="55"/>
+              <w:right w:type="dxa" w:w="95"/>
+            </w:tcMar>
+            <w:vAlign w:val="top"/>
+          </w:tcPr>
+          <w:p>
+            <w:pPr>
+              <w:spacing w:after="0"/>
+            </w:pPr>
+            <w:r>
+              <w:rPr>
+                <w:rFonts w:ascii="Calibri" w:cs="Calibri" w:eastAsia="Microsoft YaHei" w:hAnsi="Calibri"/>
+                <w:sz w:val="19"/>
+                <w:szCs w:val="19"/>
+              </w:rPr>
+              <w:t xml:space="preserve">协议规则 6：主要编码用整个时段，加重的一段进 </w:t>
+            </w:r>
+            <w:r>
+              <w:rPr>
+                <w:rFonts w:ascii="Consolas" w:cs="Consolas" w:eastAsia="Microsoft YaHei" w:hAnsi="Consolas"/>
+                <w:sz w:val="19"/>
+                <w:szCs w:val="19"/>
+                <w:shd w:fill="EEEEEE" w:val="clear"/>
+              </w:rPr>
+              <w:t xml:space="preserve">idx_dur_alt_days</w:t>
+            </w:r>
+            <w:r>
+              <w:rPr>
+                <w:rFonts w:ascii="Calibri" w:cs="Calibri" w:eastAsia="Microsoft YaHei" w:hAnsi="Calibri"/>
+                <w:sz w:val="19"/>
+                <w:szCs w:val="19"/>
+              </w:rPr>
+              <w:t xml:space="preserve">。</w:t>
+            </w:r>
+            <w:r>
+              <w:rPr>
+                <w:rFonts w:ascii="Calibri" w:cs="Calibri" w:eastAsia="Microsoft YaHei" w:hAnsi="Calibri"/>
+                <w:b/>
+                <w:bCs/>
+                <w:sz w:val="19"/>
+                <w:szCs w:val="19"/>
+              </w:rPr>
+              <w:t xml:space="preserve">【待杨俊确认】</w:t>
+            </w:r>
+            <w:r>
+              <w:rPr>
+                <w:rFonts w:ascii="Calibri" w:cs="Calibri" w:eastAsia="Microsoft YaHei" w:hAnsi="Calibri"/>
+                <w:sz w:val="19"/>
+                <w:szCs w:val="19"/>
+              </w:rPr>
+              <w:t xml:space="preserve"> Claude 10 月 26 日对作者的建议是“取急性加重那一段”，和协议规则 6 相反；写进本说明的是协议的读法，没有照建议写，见第 13 节</w:t>
+            </w:r>
+          </w:p>
+        </w:tc>
+      </w:tr>
+      <w:tr>
+        <w:trPr>
+          <w:cantSplit/>
+          <w:tblHeader w:val="false"/>
+        </w:trPr>
+        <w:tc>
+          <w:tcPr>
+            <w:tcW w:type="dxa" w:w="900"/>
+            <w:tcBorders>
+              <w:top w:val="single" w:color="BBBBBB" w:sz="4"/>
+              <w:left w:val="single" w:color="BBBBBB" w:sz="4"/>
+              <w:bottom w:val="single" w:color="BBBBBB" w:sz="4"/>
+              <w:right w:val="single" w:color="BBBBBB" w:sz="4"/>
+            </w:tcBorders>
+            <w:tcMar>
+              <w:top w:type="dxa" w:w="55"/>
+              <w:left w:type="dxa" w:w="95"/>
+              <w:bottom w:type="dxa" w:w="55"/>
+              <w:right w:type="dxa" w:w="95"/>
+            </w:tcMar>
+            <w:vAlign w:val="top"/>
+          </w:tcPr>
+          <w:p>
+            <w:pPr>
+              <w:spacing w:after="0"/>
+            </w:pPr>
+            <w:r>
+              <w:rPr>
+                <w:rFonts w:ascii="Calibri" w:cs="Calibri" w:eastAsia="Microsoft YaHei" w:hAnsi="Calibri"/>
+                <w:sz w:val="19"/>
+                <w:szCs w:val="19"/>
+              </w:rPr>
+              <w:t xml:space="preserve">X26</w:t>
+            </w:r>
+          </w:p>
+        </w:tc>
+        <w:tc>
+          <w:tcPr>
+            <w:tcW w:type="dxa" w:w="3205"/>
+            <w:tcBorders>
+              <w:top w:val="single" w:color="BBBBBB" w:sz="4"/>
+              <w:left w:val="single" w:color="BBBBBB" w:sz="4"/>
+              <w:bottom w:val="single" w:color="BBBBBB" w:sz="4"/>
+              <w:right w:val="single" w:color="BBBBBB" w:sz="4"/>
+            </w:tcBorders>
+            <w:tcMar>
+              <w:top w:type="dxa" w:w="55"/>
+              <w:left w:type="dxa" w:w="95"/>
+              <w:bottom w:type="dxa" w:w="55"/>
+              <w:right w:type="dxa" w:w="95"/>
+            </w:tcMar>
+            <w:vAlign w:val="top"/>
+          </w:tcPr>
+          <w:p>
+            <w:pPr>
+              <w:spacing w:after="0"/>
+            </w:pPr>
+            <w:r>
+              <w:rPr>
+                <w:rFonts w:ascii="Calibri" w:cs="Calibri" w:eastAsia="Microsoft YaHei" w:hAnsi="Calibri"/>
+                <w:sz w:val="19"/>
+                <w:szCs w:val="19"/>
+              </w:rPr>
+              <w:t xml:space="preserve">患儿覆盖不一致（议题 8）</w:t>
+            </w:r>
+          </w:p>
+        </w:tc>
+        <w:tc>
+          <w:tcPr>
+            <w:tcW w:type="dxa" w:w="4921"/>
+            <w:tcBorders>
+              <w:top w:val="single" w:color="BBBBBB" w:sz="4"/>
+              <w:left w:val="single" w:color="BBBBBB" w:sz="4"/>
+              <w:bottom w:val="single" w:color="BBBBBB" w:sz="4"/>
+              <w:right w:val="single" w:color="BBBBBB" w:sz="4"/>
+            </w:tcBorders>
+            <w:tcMar>
+              <w:top w:type="dxa" w:w="55"/>
+              <w:left w:type="dxa" w:w="95"/>
+              <w:bottom w:type="dxa" w:w="55"/>
+              <w:right w:type="dxa" w:w="95"/>
+            </w:tcMar>
+            <w:vAlign w:val="top"/>
+          </w:tcPr>
+          <w:p>
+            <w:pPr>
+              <w:spacing w:after="0"/>
+            </w:pPr>
+            <w:r>
+              <w:rPr>
+                <w:rFonts w:ascii="Calibri" w:cs="Calibri" w:eastAsia="Microsoft YaHei" w:hAnsi="Calibri"/>
+                <w:sz w:val="19"/>
+                <w:szCs w:val="19"/>
+              </w:rPr>
+              <w:t xml:space="preserve">E2 独立补做 WS1859（按 X19 共 18 例）和杨俊裁入的五篇报告，不看 E1 的取值；E1 的 WS1859 删 P17；WS0049、WS2025、WS1367 逐例对原文补齐缺的行。【已裁定，2026-10-26】</w:t>
+            </w:r>
+          </w:p>
+        </w:tc>
+      </w:tr>
+    </w:tbl>
+    <w:p>
+      <w:pPr>
+        <w:spacing w:after="120"/>
+      </w:pPr>
+    </w:p>
     <w:p>
       <w:pPr>
         <w:spacing w:after="120"/>
@@ -26309,6 +27721,76 @@
           <w:rFonts w:ascii="Calibri" w:cs="Calibri" w:eastAsia="Microsoft YaHei" w:hAnsi="Calibri"/>
         </w:rPr>
         <w:t xml:space="preserve">讨论清单第 9、10 点（一位提取员没填的项目、其余单项差异）没有裁定结果；本院 5 例和正式提取还没有开始。</w:t>
+      </w:r>
+    </w:p>
+    <w:p>
+      <w:pPr>
+        <w:pStyle w:val="ListParagraph"/>
+        <w:numPr>
+          <w:ilvl w:val="0"/>
+          <w:numId w:val="2"/>
+        </w:numPr>
+        <w:spacing w:after="60"/>
+      </w:pPr>
+      <w:r>
+        <w:rPr>
+          <w:rFonts w:ascii="Calibri" w:cs="Calibri" w:eastAsia="Microsoft YaHei" w:hAnsi="Calibri"/>
+        </w:rPr>
+        <w:t xml:space="preserve">X21–X24 和 X26 是作者 2026 年 10 月 26 日转告「杨俊同意 Claude 的建议」后写进来的，杨俊的原话和书面材料没有给；X25 因为和协议冲突没有照建议写（下一条）。Claude 没有打开这些报告的原文。</w:t>
+      </w:r>
+    </w:p>
+    <w:p>
+      <w:pPr>
+        <w:pStyle w:val="ListParagraph"/>
+        <w:numPr>
+          <w:ilvl w:val="0"/>
+          <w:numId w:val="2"/>
+        </w:numPr>
+        <w:spacing w:after="60"/>
+      </w:pPr>
+      <w:r>
+        <w:rPr>
+          <w:rFonts w:ascii="Calibri" w:cs="Calibri" w:eastAsia="Microsoft YaHei" w:hAnsi="Calibri"/>
+          <w:b/>
+          <w:bCs/>
+        </w:rPr>
+        <w:t xml:space="preserve">X25 的说明：</w:t>
+      </w:r>
+      <w:r>
+        <w:rPr>
+          <w:rFonts w:ascii="Calibri" w:cs="Calibri" w:eastAsia="Microsoft YaHei" w:hAnsi="Calibri"/>
+        </w:rPr>
+        <w:t xml:space="preserve"> Claude 10 月 26 日对作者建议“慢性间歇腹痛加急性加重，取急性加重那一段作为指数发作”。核对协议附录 C 规则 6 以后发现，协议写的是：主要编码用</w:t>
+      </w:r>
+      <w:r>
+        <w:rPr>
+          <w:rFonts w:ascii="Calibri" w:cs="Calibri" w:eastAsia="Microsoft YaHei" w:hAnsi="Calibri"/>
+          <w:b/>
+          <w:bCs/>
+        </w:rPr>
+        <w:t xml:space="preserve">整个时段</w:t>
+      </w:r>
+      <w:r>
+        <w:rPr>
+          <w:rFonts w:ascii="Calibri" w:cs="Calibri" w:eastAsia="Microsoft YaHei" w:hAnsi="Calibri"/>
+        </w:rPr>
+        <w:t xml:space="preserve">，备选编码用加重的那一段（见第 6 节规则 6）。这个建议和已注册的协议相反，所以本说明按协议写，没有执行 Claude 的建议。如果团队想把“加重那一段”改成主要编码，就是改协议的提取规则（需要升协议版本、告诉 Ji Wang，是否要在 PROSPERO 里体现也要另行判断），不能只改本说明。正式比对里 WS0714_P1（E1 1 天、E2 182.4 天）等例，E2 的读法是协议的读法，E1 是 Claude 建议的读法。</w:t>
+      </w:r>
+    </w:p>
+    <w:p>
+      <w:pPr>
+        <w:pStyle w:val="ListParagraph"/>
+        <w:numPr>
+          <w:ilvl w:val="0"/>
+          <w:numId w:val="2"/>
+        </w:numPr>
+        <w:spacing w:after="60"/>
+      </w:pPr>
+      <w:r>
+        <w:rPr>
+          <w:rFonts w:ascii="Calibri" w:cs="Calibri" w:eastAsia="Microsoft YaHei" w:hAnsi="Calibri"/>
+        </w:rPr>
+        <w:t xml:space="preserve">偏倚风险的条目读法（正式比对议题 9）写在《偏倚风险评价操作说明》里，不在本说明。</w:t>
       </w:r>
     </w:p>
     <w:sectPr>
@@ -26376,7 +27858,7 @@
         <w:sz w:val="17"/>
         <w:szCs w:val="17"/>
       </w:rPr>
-      <w:t xml:space="preserve">提取操作说明 v2026-10-25e   |   第 </w:t>
+      <w:t xml:space="preserve">提取操作说明 v2026-10-26a   |   第 </w:t>
     </w:r>
     <w:r>
       <w:rPr>

</xml_diff>

<commit_message>
Record X25 confirmation: rule 6 as in protocol
Co-Authored-By: Claude Sonnet 5.5 <noreply@anthropic.com>
Claude-Session: https://claude.ai/code/session_01FRD7etKqYN8v2bbXeeLMRW
</commit_message>
<xml_diff>
--- a/Extraction guide - how to fill the extraction workbook (draft).docx
+++ b/Extraction guide - how to fill the extraction workbook (draft).docx
@@ -116,7 +116,7 @@
                 <w:sz w:val="19"/>
                 <w:szCs w:val="19"/>
               </w:rPr>
-              <w:t xml:space="preserve">提取操作说明 v2026-10-26a（草稿）。标 </w:t>
+              <w:t xml:space="preserve">提取操作说明 v2026-10-26b（草稿）。标 </w:t>
             </w:r>
             <w:r>
               <w:rPr>
@@ -286,7 +286,7 @@
                 <w:sz w:val="19"/>
                 <w:szCs w:val="19"/>
               </w:rPr>
-              <w:t xml:space="preserve">X25 和 Claude 10 月 26 日对作者说的建议不一样，原因见 X25，待杨俊确认。</w:t>
+              <w:t xml:space="preserve">X25 和 Claude 10 月 26 日对作者说的建议不一样（Claude 的建议和协议规则 6 相反，本说明按协议写）；杨俊已确认按协议规则 6（作者 2026 年 10 月 26 日转告，书面材料没有给）。</w:t>
             </w:r>
             <w:r>
               <w:rPr>
@@ -10224,7 +10224,7 @@
                 <w:sz w:val="19"/>
                 <w:szCs w:val="19"/>
               </w:rPr>
-              <w:t xml:space="preserve">【待杨俊确认 X25】</w:t>
+              <w:t xml:space="preserve">【已裁定 X25，2026-10-26，杨俊确认按协议规则 6】</w:t>
             </w:r>
             <w:r>
               <w:rPr>
@@ -27298,25 +27298,7 @@
                 <w:sz w:val="19"/>
                 <w:szCs w:val="19"/>
               </w:rPr>
-              <w:t xml:space="preserve">。</w:t>
-            </w:r>
-            <w:r>
-              <w:rPr>
-                <w:rFonts w:ascii="Calibri" w:cs="Calibri" w:eastAsia="Microsoft YaHei" w:hAnsi="Calibri"/>
-                <w:b/>
-                <w:bCs/>
-                <w:sz w:val="19"/>
-                <w:szCs w:val="19"/>
-              </w:rPr>
-              <w:t xml:space="preserve">【待杨俊确认】</w:t>
-            </w:r>
-            <w:r>
-              <w:rPr>
-                <w:rFonts w:ascii="Calibri" w:cs="Calibri" w:eastAsia="Microsoft YaHei" w:hAnsi="Calibri"/>
-                <w:sz w:val="19"/>
-                <w:szCs w:val="19"/>
-              </w:rPr>
-              <w:t xml:space="preserve"> Claude 10 月 26 日对作者的建议是“取急性加重那一段”，和协议规则 6 相反；写进本说明的是协议的读法，没有照建议写，见第 13 节</w:t>
+              <w:t xml:space="preserve">。【已裁定，2026-10-26，杨俊确认按协议规则 6；作者转告】 Claude 10 月 26 日曾建议“取急性加重那一段”，和协议规则 6 相反，没有采用，见第 13 节</w:t>
             </w:r>
           </w:p>
         </w:tc>
@@ -27754,7 +27736,7 @@
           <w:b/>
           <w:bCs/>
         </w:rPr>
-        <w:t xml:space="preserve">X25 的说明：</w:t>
+        <w:t xml:space="preserve">X25 的说明（杨俊已确认按协议规则 6，2026-10-26，作者转告）：</w:t>
       </w:r>
       <w:r>
         <w:rPr>
@@ -27774,7 +27756,7 @@
         <w:rPr>
           <w:rFonts w:ascii="Calibri" w:cs="Calibri" w:eastAsia="Microsoft YaHei" w:hAnsi="Calibri"/>
         </w:rPr>
-        <w:t xml:space="preserve">，备选编码用加重的那一段（见第 6 节规则 6）。这个建议和已注册的协议相反，所以本说明按协议写，没有执行 Claude 的建议。如果团队想把“加重那一段”改成主要编码，就是改协议的提取规则（需要升协议版本、告诉 Ji Wang，是否要在 PROSPERO 里体现也要另行判断），不能只改本说明。正式比对里 WS0714_P1（E1 1 天、E2 182.4 天）等例，E2 的读法是协议的读法，E1 是 Claude 建议的读法。</w:t>
+        <w:t xml:space="preserve">，备选编码用加重的那一段（见第 6 节规则 6）。这个建议和已注册的协议相反，所以本说明按协议写，没有执行 Claude 的建议；杨俊确认了这一点，协议不用改。以后如果想把“加重那一段”改成主要编码，就是改协议的提取规则（需要升协议版本、告诉 Ji Wang），不能只改本说明。正式比对里 WS0714_P1（E1 1 天、E2 182.4 天）等例，E2 的读法是协议的读法，E1 是 Claude 建议的读法。</w:t>
       </w:r>
     </w:p>
     <w:p>
@@ -27858,7 +27840,7 @@
         <w:sz w:val="17"/>
         <w:szCs w:val="17"/>
       </w:rPr>
-      <w:t xml:space="preserve">提取操作说明 v2026-10-26a   |   第 </w:t>
+      <w:t xml:space="preserve">提取操作说明 v2026-10-26b   |   第 </w:t>
     </w:r>
     <w:r>
       <w:rPr>

</xml_diff>

<commit_message>
Record adjudicated round-2 detail, per-extractor change lists, guide X27
Co-Authored-By: Claude Sonnet 5.5 <noreply@anthropic.com>
Claude-Session: https://claude.ai/code/session_01FRD7etKqYN8v2bbXeeLMRW
</commit_message>
<xml_diff>
--- a/Extraction guide - how to fill the extraction workbook (draft).docx
+++ b/Extraction guide - how to fill the extraction workbook (draft).docx
@@ -116,7 +116,7 @@
                 <w:sz w:val="19"/>
                 <w:szCs w:val="19"/>
               </w:rPr>
-              <w:t xml:space="preserve">提取操作说明 v2026-10-26b（草稿）。标 </w:t>
+              <w:t xml:space="preserve">提取操作说明 v2026-10-26c（草稿）。标 </w:t>
             </w:r>
             <w:r>
               <w:rPr>
@@ -171,6 +171,129 @@
                 <w:szCs w:val="19"/>
               </w:rPr>
               <w:t xml:space="preserve"> 的是 10 篇校准讨论后由杨俊按原文裁定的读法（见 X13–X20）</w:t>
+            </w:r>
+          </w:p>
+        </w:tc>
+      </w:tr>
+      <w:tr>
+        <w:trPr>
+          <w:cantSplit/>
+          <w:tblHeader w:val="false"/>
+        </w:trPr>
+        <w:tc>
+          <w:tcPr>
+            <w:tcW w:type="dxa" w:w="1534"/>
+            <w:tcBorders>
+              <w:top w:val="single" w:color="BBBBBB" w:sz="4"/>
+              <w:left w:val="single" w:color="BBBBBB" w:sz="4"/>
+              <w:bottom w:val="single" w:color="BBBBBB" w:sz="4"/>
+              <w:right w:val="single" w:color="BBBBBB" w:sz="4"/>
+            </w:tcBorders>
+            <w:shd w:fill="F2F5F9" w:val="clear"/>
+            <w:tcMar>
+              <w:top w:type="dxa" w:w="55"/>
+              <w:left w:type="dxa" w:w="95"/>
+              <w:bottom w:type="dxa" w:w="55"/>
+              <w:right w:type="dxa" w:w="95"/>
+            </w:tcMar>
+            <w:vAlign w:val="top"/>
+          </w:tcPr>
+          <w:p>
+            <w:pPr>
+              <w:spacing w:after="0"/>
+            </w:pPr>
+            <w:r>
+              <w:rPr>
+                <w:rFonts w:ascii="Calibri" w:cs="Calibri" w:eastAsia="Microsoft YaHei" w:hAnsi="Calibri"/>
+                <w:b/>
+                <w:bCs/>
+                <w:sz w:val="19"/>
+                <w:szCs w:val="19"/>
+              </w:rPr>
+              <w:t xml:space="preserve">改动（2026-10-26，第二轮比对之后）</w:t>
+            </w:r>
+          </w:p>
+        </w:tc>
+        <w:tc>
+          <w:tcPr>
+            <w:tcW w:type="dxa" w:w="7492"/>
+            <w:tcBorders>
+              <w:top w:val="single" w:color="BBBBBB" w:sz="4"/>
+              <w:left w:val="single" w:color="BBBBBB" w:sz="4"/>
+              <w:bottom w:val="single" w:color="BBBBBB" w:sz="4"/>
+              <w:right w:val="single" w:color="BBBBBB" w:sz="4"/>
+            </w:tcBorders>
+            <w:tcMar>
+              <w:top w:type="dxa" w:w="55"/>
+              <w:left w:type="dxa" w:w="95"/>
+              <w:bottom w:type="dxa" w:w="55"/>
+              <w:right w:type="dxa" w:w="95"/>
+            </w:tcMar>
+            <w:vAlign w:val="top"/>
+          </w:tcPr>
+          <w:p>
+            <w:pPr>
+              <w:spacing w:after="0"/>
+            </w:pPr>
+            <w:r>
+              <w:rPr>
+                <w:rFonts w:ascii="Calibri" w:cs="Calibri" w:eastAsia="Microsoft YaHei" w:hAnsi="Calibri"/>
+                <w:sz w:val="19"/>
+                <w:szCs w:val="19"/>
+              </w:rPr>
+              <w:t xml:space="preserve">第二轮 154 例分歧（</w:t>
+            </w:r>
+            <w:r>
+              <w:rPr>
+                <w:rFonts w:ascii="Consolas" w:cs="Consolas" w:eastAsia="Microsoft YaHei" w:hAnsi="Consolas"/>
+                <w:sz w:val="19"/>
+                <w:szCs w:val="19"/>
+                <w:shd w:fill="EEEEEE" w:val="clear"/>
+              </w:rPr>
+              <w:t xml:space="preserve">search/extraction/formal/compare_results_2/</w:t>
+            </w:r>
+            <w:r>
+              <w:rPr>
+                <w:rFonts w:ascii="Calibri" w:cs="Calibri" w:eastAsia="Microsoft YaHei" w:hAnsi="Calibri"/>
+                <w:sz w:val="19"/>
+                <w:szCs w:val="19"/>
+              </w:rPr>
+              <w:t xml:space="preserve">）经杨俊逐例裁定，作者 2026 年 10 月 26 日转来填好的明细表（本人裁定，作者确认）。裁定引用的规则全部是已有的 X13、X16、X17、X21–X25，没有新的判断规则；新增 </w:t>
+            </w:r>
+            <w:r>
+              <w:rPr>
+                <w:rFonts w:ascii="Calibri" w:cs="Calibri" w:eastAsia="Microsoft YaHei" w:hAnsi="Calibri"/>
+                <w:b/>
+                <w:bCs/>
+                <w:sz w:val="19"/>
+                <w:szCs w:val="19"/>
+              </w:rPr>
+              <w:t xml:space="preserve">X27</w:t>
+            </w:r>
+            <w:r>
+              <w:rPr>
+                <w:rFonts w:ascii="Calibri" w:cs="Calibri" w:eastAsia="Microsoft YaHei" w:hAnsi="Calibri"/>
+                <w:sz w:val="19"/>
+                <w:szCs w:val="19"/>
+              </w:rPr>
+              <w:t xml:space="preserve">：两个覆盖结论（WS0696 的编号；WS0049 的个体附录取不到）。杨俊在裁定记录里重述的“未限定范围的梗死/坏死按 Non-viable、明确写部分才按 Partially”已经是 X23 的内容，没有改动。两位提取员讨论那一栏（</w:t>
+            </w:r>
+            <w:r>
+              <w:rPr>
+                <w:rFonts w:ascii="Consolas" w:cs="Consolas" w:eastAsia="Microsoft YaHei" w:hAnsi="Consolas"/>
+                <w:sz w:val="19"/>
+                <w:szCs w:val="19"/>
+                <w:shd w:fill="EEEEEE" w:val="clear"/>
+              </w:rPr>
+              <w:t xml:space="preserve">discussion_conclusion</w:t>
+            </w:r>
+            <w:r>
+              <w:rPr>
+                <w:rFonts w:ascii="Calibri" w:cs="Calibri" w:eastAsia="Microsoft YaHei" w:hAnsi="Calibri"/>
+                <w:sz w:val="19"/>
+                <w:szCs w:val="19"/>
+              </w:rPr>
+              <w:t xml:space="preserve">）在这份表里全是空的，即 154 行都由杨俊直接裁定。没有改协议和工作簿</w:t>
             </w:r>
           </w:p>
         </w:tc>
@@ -26732,8 +26855,8 @@
       </w:tblPr>
       <w:tblGrid>
         <w:gridCol w:w="900"/>
-        <w:gridCol w:w="3205"/>
-        <w:gridCol w:w="4921"/>
+        <w:gridCol w:w="3112"/>
+        <w:gridCol w:w="5014"/>
       </w:tblGrid>
       <w:tr>
         <w:trPr>
@@ -26776,7 +26899,7 @@
         </w:tc>
         <w:tc>
           <w:tcPr>
-            <w:tcW w:type="dxa" w:w="3205"/>
+            <w:tcW w:type="dxa" w:w="3112"/>
             <w:tcBorders>
               <w:top w:val="single" w:color="BBBBBB" w:sz="4"/>
               <w:left w:val="single" w:color="BBBBBB" w:sz="4"/>
@@ -26810,7 +26933,7 @@
         </w:tc>
         <w:tc>
           <w:tcPr>
-            <w:tcW w:type="dxa" w:w="4921"/>
+            <w:tcW w:type="dxa" w:w="5014"/>
             <w:tcBorders>
               <w:top w:val="single" w:color="BBBBBB" w:sz="4"/>
               <w:left w:val="single" w:color="BBBBBB" w:sz="4"/>
@@ -26902,7 +27025,7 @@
         </w:tc>
         <w:tc>
           <w:tcPr>
-            <w:tcW w:type="dxa" w:w="3205"/>
+            <w:tcW w:type="dxa" w:w="3112"/>
             <w:tcBorders>
               <w:top w:val="single" w:color="BBBBBB" w:sz="4"/>
               <w:left w:val="single" w:color="BBBBBB" w:sz="4"/>
@@ -26933,7 +27056,7 @@
         </w:tc>
         <w:tc>
           <w:tcPr>
-            <w:tcW w:type="dxa" w:w="4921"/>
+            <w:tcW w:type="dxa" w:w="5014"/>
             <w:tcBorders>
               <w:top w:val="single" w:color="BBBBBB" w:sz="4"/>
               <w:left w:val="single" w:color="BBBBBB" w:sz="4"/>
@@ -27027,7 +27150,7 @@
         </w:tc>
         <w:tc>
           <w:tcPr>
-            <w:tcW w:type="dxa" w:w="3205"/>
+            <w:tcW w:type="dxa" w:w="3112"/>
             <w:tcBorders>
               <w:top w:val="single" w:color="BBBBBB" w:sz="4"/>
               <w:left w:val="single" w:color="BBBBBB" w:sz="4"/>
@@ -27058,7 +27181,7 @@
         </w:tc>
         <w:tc>
           <w:tcPr>
-            <w:tcW w:type="dxa" w:w="4921"/>
+            <w:tcW w:type="dxa" w:w="5014"/>
             <w:tcBorders>
               <w:top w:val="single" w:color="BBBBBB" w:sz="4"/>
               <w:left w:val="single" w:color="BBBBBB" w:sz="4"/>
@@ -27126,7 +27249,7 @@
         </w:tc>
         <w:tc>
           <w:tcPr>
-            <w:tcW w:type="dxa" w:w="3205"/>
+            <w:tcW w:type="dxa" w:w="3112"/>
             <w:tcBorders>
               <w:top w:val="single" w:color="BBBBBB" w:sz="4"/>
               <w:left w:val="single" w:color="BBBBBB" w:sz="4"/>
@@ -27157,7 +27280,7 @@
         </w:tc>
         <w:tc>
           <w:tcPr>
-            <w:tcW w:type="dxa" w:w="4921"/>
+            <w:tcW w:type="dxa" w:w="5014"/>
             <w:tcBorders>
               <w:top w:val="single" w:color="BBBBBB" w:sz="4"/>
               <w:left w:val="single" w:color="BBBBBB" w:sz="4"/>
@@ -27225,7 +27348,7 @@
         </w:tc>
         <w:tc>
           <w:tcPr>
-            <w:tcW w:type="dxa" w:w="3205"/>
+            <w:tcW w:type="dxa" w:w="3112"/>
             <w:tcBorders>
               <w:top w:val="single" w:color="BBBBBB" w:sz="4"/>
               <w:left w:val="single" w:color="BBBBBB" w:sz="4"/>
@@ -27256,7 +27379,7 @@
         </w:tc>
         <w:tc>
           <w:tcPr>
-            <w:tcW w:type="dxa" w:w="4921"/>
+            <w:tcW w:type="dxa" w:w="5014"/>
             <w:tcBorders>
               <w:top w:val="single" w:color="BBBBBB" w:sz="4"/>
               <w:left w:val="single" w:color="BBBBBB" w:sz="4"/>
@@ -27341,7 +27464,7 @@
         </w:tc>
         <w:tc>
           <w:tcPr>
-            <w:tcW w:type="dxa" w:w="3205"/>
+            <w:tcW w:type="dxa" w:w="3112"/>
             <w:tcBorders>
               <w:top w:val="single" w:color="BBBBBB" w:sz="4"/>
               <w:left w:val="single" w:color="BBBBBB" w:sz="4"/>
@@ -27372,7 +27495,7 @@
         </w:tc>
         <w:tc>
           <w:tcPr>
-            <w:tcW w:type="dxa" w:w="4921"/>
+            <w:tcW w:type="dxa" w:w="5014"/>
             <w:tcBorders>
               <w:top w:val="single" w:color="BBBBBB" w:sz="4"/>
               <w:left w:val="single" w:color="BBBBBB" w:sz="4"/>
@@ -27398,6 +27521,151 @@
                 <w:szCs w:val="19"/>
               </w:rPr>
               <w:t xml:space="preserve">E2 独立补做 WS1859（按 X19 共 18 例）和杨俊裁入的五篇报告，不看 E1 的取值；E1 的 WS1859 删 P17；WS0049、WS2025、WS1367 逐例对原文补齐缺的行。【已裁定，2026-10-26】</w:t>
+            </w:r>
+          </w:p>
+        </w:tc>
+      </w:tr>
+      <w:tr>
+        <w:trPr>
+          <w:cantSplit/>
+          <w:tblHeader w:val="false"/>
+        </w:trPr>
+        <w:tc>
+          <w:tcPr>
+            <w:tcW w:type="dxa" w:w="900"/>
+            <w:tcBorders>
+              <w:top w:val="single" w:color="BBBBBB" w:sz="4"/>
+              <w:left w:val="single" w:color="BBBBBB" w:sz="4"/>
+              <w:bottom w:val="single" w:color="BBBBBB" w:sz="4"/>
+              <w:right w:val="single" w:color="BBBBBB" w:sz="4"/>
+            </w:tcBorders>
+            <w:tcMar>
+              <w:top w:type="dxa" w:w="55"/>
+              <w:left w:type="dxa" w:w="95"/>
+              <w:bottom w:type="dxa" w:w="55"/>
+              <w:right w:type="dxa" w:w="95"/>
+            </w:tcMar>
+            <w:vAlign w:val="top"/>
+          </w:tcPr>
+          <w:p>
+            <w:pPr>
+              <w:spacing w:after="0"/>
+            </w:pPr>
+            <w:r>
+              <w:rPr>
+                <w:rFonts w:ascii="Calibri" w:cs="Calibri" w:eastAsia="Microsoft YaHei" w:hAnsi="Calibri"/>
+                <w:sz w:val="19"/>
+                <w:szCs w:val="19"/>
+              </w:rPr>
+              <w:t xml:space="preserve">X27</w:t>
+            </w:r>
+          </w:p>
+        </w:tc>
+        <w:tc>
+          <w:tcPr>
+            <w:tcW w:type="dxa" w:w="3112"/>
+            <w:tcBorders>
+              <w:top w:val="single" w:color="BBBBBB" w:sz="4"/>
+              <w:left w:val="single" w:color="BBBBBB" w:sz="4"/>
+              <w:bottom w:val="single" w:color="BBBBBB" w:sz="4"/>
+              <w:right w:val="single" w:color="BBBBBB" w:sz="4"/>
+            </w:tcBorders>
+            <w:tcMar>
+              <w:top w:type="dxa" w:w="55"/>
+              <w:left w:type="dxa" w:w="95"/>
+              <w:bottom w:type="dxa" w:w="55"/>
+              <w:right w:type="dxa" w:w="95"/>
+            </w:tcMar>
+            <w:vAlign w:val="top"/>
+          </w:tcPr>
+          <w:p>
+            <w:pPr>
+              <w:spacing w:after="0"/>
+            </w:pPr>
+            <w:r>
+              <w:rPr>
+                <w:rFonts w:ascii="Calibri" w:cs="Calibri" w:eastAsia="Microsoft YaHei" w:hAnsi="Calibri"/>
+                <w:sz w:val="19"/>
+                <w:szCs w:val="19"/>
+              </w:rPr>
+              <w:t xml:space="preserve">第二轮覆盖差异</w:t>
+            </w:r>
+          </w:p>
+        </w:tc>
+        <w:tc>
+          <w:tcPr>
+            <w:tcW w:type="dxa" w:w="5014"/>
+            <w:tcBorders>
+              <w:top w:val="single" w:color="BBBBBB" w:sz="4"/>
+              <w:left w:val="single" w:color="BBBBBB" w:sz="4"/>
+              <w:bottom w:val="single" w:color="BBBBBB" w:sz="4"/>
+              <w:right w:val="single" w:color="BBBBBB" w:sz="4"/>
+            </w:tcBorders>
+            <w:tcMar>
+              <w:top w:type="dxa" w:w="55"/>
+              <w:left w:type="dxa" w:w="95"/>
+              <w:bottom w:type="dxa" w:w="55"/>
+              <w:right w:type="dxa" w:w="95"/>
+            </w:tcMar>
+            <w:vAlign w:val="top"/>
+          </w:tcPr>
+          <w:p>
+            <w:pPr>
+              <w:spacing w:after="0"/>
+            </w:pPr>
+            <w:r>
+              <w:rPr>
+                <w:rFonts w:ascii="Calibri" w:cs="Calibri" w:eastAsia="Microsoft YaHei" w:hAnsi="Calibri"/>
+                <w:b/>
+                <w:bCs/>
+                <w:sz w:val="19"/>
+                <w:szCs w:val="19"/>
+              </w:rPr>
+              <w:t xml:space="preserve">WS0696：</w:t>
+            </w:r>
+            <w:r>
+              <w:rPr>
+                <w:rFonts w:ascii="Calibri" w:cs="Calibri" w:eastAsia="Microsoft YaHei" w:hAnsi="Calibri"/>
+                <w:sz w:val="19"/>
+                <w:szCs w:val="19"/>
+              </w:rPr>
+              <w:t xml:space="preserve">原文“case 16”（10 岁女童，行 splenopexy）是该报告唯一的游走脾患儿，E1 的 WS0696_P1 和 E2 的 WS0696_P16 是同一个孩子；按患儿编号规则（作者的病例号）统一用 </w:t>
+            </w:r>
+            <w:r>
+              <w:rPr>
+                <w:rFonts w:ascii="Calibri" w:cs="Calibri" w:eastAsia="Microsoft YaHei" w:hAnsi="Calibri"/>
+                <w:b/>
+                <w:bCs/>
+                <w:sz w:val="19"/>
+                <w:szCs w:val="19"/>
+              </w:rPr>
+              <w:t xml:space="preserve">P16</w:t>
+            </w:r>
+            <w:r>
+              <w:rPr>
+                <w:rFonts w:ascii="Calibri" w:cs="Calibri" w:eastAsia="Microsoft YaHei" w:hAnsi="Calibri"/>
+                <w:sz w:val="19"/>
+                <w:szCs w:val="19"/>
+              </w:rPr>
+              <w:t xml:space="preserve">，E1 改编号。</w:t>
+            </w:r>
+            <w:r>
+              <w:rPr>
+                <w:rFonts w:ascii="Calibri" w:cs="Calibri" w:eastAsia="Microsoft YaHei" w:hAnsi="Calibri"/>
+                <w:b/>
+                <w:bCs/>
+                <w:sz w:val="19"/>
+                <w:szCs w:val="19"/>
+              </w:rPr>
+              <w:t xml:space="preserve">WS0049：</w:t>
+            </w:r>
+            <w:r>
+              <w:rPr>
+                <w:rFonts w:ascii="Calibri" w:cs="Calibri" w:eastAsia="Microsoft YaHei" w:hAnsi="Calibri"/>
+                <w:sz w:val="19"/>
+                <w:szCs w:val="19"/>
+              </w:rPr>
+              <w:t xml:space="preserve">本地 PDF 只给 6 例合计的术中和病理结论，个体数据在网上 Appendix 1，本地文献库没有找到；P5、P6 不能由本地 PDF 单独核实，保留合计结论，并在备注写“online Appendix 1 required/not locally available”，取得附录后再逐例补。【已裁定，2026-10-26，杨俊（作者确认）】</w:t>
             </w:r>
           </w:p>
         </w:tc>
@@ -27840,7 +28108,7 @@
         <w:sz w:val="17"/>
         <w:szCs w:val="17"/>
       </w:rPr>
-      <w:t xml:space="preserve">提取操作说明 v2026-10-26b   |   第 </w:t>
+      <w:t xml:space="preserve">提取操作说明 v2026-10-26c   |   第 </w:t>
     </w:r>
     <w:r>
       <w:rPr>

</xml_diff>